<commit_message>
Manuales y organigrama actualizados
</commit_message>
<xml_diff>
--- a/sunGames_sa_de_cv/Manuales/Manual_de_Descripcion_de_Puestos_SunGames_SA_de_CV_APA7.docx
+++ b/sunGames_sa_de_cv/Manuales/Manual_de_Descripcion_de_Puestos_SunGames_SA_de_CV_APA7.docx
@@ -1718,7 +1718,7 @@
             <w:noProof/>
             <w:lang w:val="es-SV"/>
           </w:rPr>
-          <w:t>Productor / Líder de Desarrollo de Videojuegos (P-004)</w:t>
+          <w:t>Líder de Desarrollo de Videojuegos (P-004)</w:t>
         </w:r>
         <w:r>
           <w:rPr>
@@ -1787,7 +1787,7 @@
             <w:noProof/>
             <w:lang w:val="es-SV"/>
           </w:rPr>
-          <w:t>Programador de Videojuegos (P-005)</w:t>
+          <w:t>Desarrollador de Videojuegos y Control de Calidad (P-005)</w:t>
         </w:r>
         <w:r>
           <w:rPr>
@@ -1856,7 +1856,7 @@
             <w:noProof/>
             <w:lang w:val="es-SV"/>
           </w:rPr>
-          <w:t>Analista de Control de Calidad (QA / Tester) (P-006)</w:t>
+          <w:t>Ejecutivo Comercial y Marketing (P-006)</w:t>
         </w:r>
         <w:r>
           <w:rPr>
@@ -1925,7 +1925,7 @@
             <w:noProof/>
             <w:lang w:val="es-SV"/>
           </w:rPr>
-          <w:t>Ejecutivo Comercial y Marketing Digital (P-007)</w:t>
+          <w:t>Encargado de Talento Humano y Planillas (P-007)</w:t>
         </w:r>
         <w:r>
           <w:rPr>
@@ -1994,7 +1994,7 @@
             <w:noProof/>
             <w:lang w:val="es-SV"/>
           </w:rPr>
-          <w:t>Encargado de Talento Humano y Planillas (P-008)</w:t>
+          <w:t>Encargado de Operaciones, Logística y Servicio al Cliente (P-008)</w:t>
         </w:r>
         <w:r>
           <w:rPr>
@@ -2036,213 +2036,6 @@
             <w:webHidden/>
           </w:rPr>
           <w:t>18</w:t>
-        </w:r>
-        <w:r>
-          <w:rPr>
-            <w:noProof/>
-            <w:webHidden/>
-          </w:rPr>
-          <w:fldChar w:fldCharType="end"/>
-        </w:r>
-      </w:hyperlink>
-    </w:p>
-    <w:p>
-      <w:pPr>
-        <w:pStyle w:val="TDC2"/>
-        <w:tabs>
-          <w:tab w:val="right" w:leader="dot" w:pos="9350"/>
-        </w:tabs>
-        <w:rPr>
-          <w:noProof/>
-        </w:rPr>
-      </w:pPr>
-      <w:hyperlink w:anchor="_Toc241086782" w:history="1">
-        <w:r>
-          <w:rPr>
-            <w:rStyle w:val="Hipervnculo"/>
-            <w:noProof/>
-            <w:lang w:val="es-SV"/>
-          </w:rPr>
-          <w:t>Encargado de Operaciones y Logística (P-009)</w:t>
-        </w:r>
-        <w:r>
-          <w:rPr>
-            <w:noProof/>
-            <w:webHidden/>
-          </w:rPr>
-          <w:tab/>
-        </w:r>
-        <w:r>
-          <w:rPr>
-            <w:noProof/>
-            <w:webHidden/>
-          </w:rPr>
-          <w:fldChar w:fldCharType="begin"/>
-        </w:r>
-        <w:r>
-          <w:rPr>
-            <w:noProof/>
-            <w:webHidden/>
-          </w:rPr>
-          <w:instrText xml:space="preserve"> PAGEREF _Toc241086782 \h </w:instrText>
-        </w:r>
-        <w:r>
-          <w:rPr>
-            <w:noProof/>
-            <w:webHidden/>
-          </w:rPr>
-        </w:r>
-        <w:r>
-          <w:rPr>
-            <w:noProof/>
-            <w:webHidden/>
-          </w:rPr>
-          <w:fldChar w:fldCharType="separate"/>
-        </w:r>
-        <w:r>
-          <w:rPr>
-            <w:noProof/>
-            <w:webHidden/>
-          </w:rPr>
-          <w:t>19</w:t>
-        </w:r>
-        <w:r>
-          <w:rPr>
-            <w:noProof/>
-            <w:webHidden/>
-          </w:rPr>
-          <w:fldChar w:fldCharType="end"/>
-        </w:r>
-      </w:hyperlink>
-    </w:p>
-    <w:p>
-      <w:pPr>
-        <w:pStyle w:val="TDC2"/>
-        <w:tabs>
-          <w:tab w:val="right" w:leader="dot" w:pos="9350"/>
-        </w:tabs>
-        <w:rPr>
-          <w:noProof/>
-        </w:rPr>
-      </w:pPr>
-      <w:hyperlink w:anchor="_Toc241086783" w:history="1">
-        <w:r>
-          <w:rPr>
-            <w:rStyle w:val="Hipervnculo"/>
-            <w:noProof/>
-            <w:lang w:val="es-SV"/>
-          </w:rPr>
-          <w:t>Soporte Técnico y Servicio al Cliente (P-010)</w:t>
-        </w:r>
-        <w:r>
-          <w:rPr>
-            <w:noProof/>
-            <w:webHidden/>
-          </w:rPr>
-          <w:tab/>
-        </w:r>
-        <w:r>
-          <w:rPr>
-            <w:noProof/>
-            <w:webHidden/>
-          </w:rPr>
-          <w:fldChar w:fldCharType="begin"/>
-        </w:r>
-        <w:r>
-          <w:rPr>
-            <w:noProof/>
-            <w:webHidden/>
-          </w:rPr>
-          <w:instrText xml:space="preserve"> PAGEREF _Toc241086783 \h </w:instrText>
-        </w:r>
-        <w:r>
-          <w:rPr>
-            <w:noProof/>
-            <w:webHidden/>
-          </w:rPr>
-        </w:r>
-        <w:r>
-          <w:rPr>
-            <w:noProof/>
-            <w:webHidden/>
-          </w:rPr>
-          <w:fldChar w:fldCharType="separate"/>
-        </w:r>
-        <w:r>
-          <w:rPr>
-            <w:noProof/>
-            <w:webHidden/>
-          </w:rPr>
-          <w:t>20</w:t>
-        </w:r>
-        <w:r>
-          <w:rPr>
-            <w:noProof/>
-            <w:webHidden/>
-          </w:rPr>
-          <w:fldChar w:fldCharType="end"/>
-        </w:r>
-      </w:hyperlink>
-    </w:p>
-    <w:p>
-      <w:pPr>
-        <w:pStyle w:val="TDC2"/>
-        <w:tabs>
-          <w:tab w:val="right" w:leader="dot" w:pos="9350"/>
-        </w:tabs>
-        <w:rPr>
-          <w:noProof/>
-        </w:rPr>
-      </w:pPr>
-      <w:hyperlink w:anchor="_Toc241086784" w:history="1">
-        <w:r>
-          <w:rPr>
-            <w:rStyle w:val="Hipervnculo"/>
-            <w:noProof/>
-            <w:lang w:val="es-SV"/>
-          </w:rPr>
-          <w:t>Asistente Administrativo / Recepción (P-011)</w:t>
-        </w:r>
-        <w:r>
-          <w:rPr>
-            <w:noProof/>
-            <w:webHidden/>
-          </w:rPr>
-          <w:tab/>
-        </w:r>
-        <w:r>
-          <w:rPr>
-            <w:noProof/>
-            <w:webHidden/>
-          </w:rPr>
-          <w:fldChar w:fldCharType="begin"/>
-        </w:r>
-        <w:r>
-          <w:rPr>
-            <w:noProof/>
-            <w:webHidden/>
-          </w:rPr>
-          <w:instrText xml:space="preserve"> PAGEREF _Toc241086784 \h </w:instrText>
-        </w:r>
-        <w:r>
-          <w:rPr>
-            <w:noProof/>
-            <w:webHidden/>
-          </w:rPr>
-        </w:r>
-        <w:r>
-          <w:rPr>
-            <w:noProof/>
-            <w:webHidden/>
-          </w:rPr>
-          <w:fldChar w:fldCharType="separate"/>
-        </w:r>
-        <w:r>
-          <w:rPr>
-            <w:noProof/>
-            <w:webHidden/>
-          </w:rPr>
-          <w:t>21</w:t>
         </w:r>
         <w:r>
           <w:rPr>
@@ -2946,7 +2739,7 @@
         <w:rPr>
           <w:lang w:val="es-SV"/>
         </w:rPr>
-        <w:t>El manual aplica a todos los puestos que integran la estructura de la sociedad. Las descripciones son de carácter enunciativo y no limitativo; el superior jerárquico podrá asignar funciones afines siempre que no contravengan la segregación de funciones y el marco normativo.</w:t>
+        <w:t>El manual aplica a los ocho puestos (P-001 a P-008) que integran la estructura de la sociedad. Las descripciones son de carácter enunciativo y no limitativo; el superior jerárquico podrá asignar funciones afines siempre que no contravengan la segregación de funciones y el marco normativo.</w:t>
       </w:r>
     </w:p>
     <w:p>
@@ -4993,7 +4786,7 @@
                 <w:sz w:val="20"/>
                 <w:lang w:val="es-SV"/>
               </w:rPr>
-              <w:t>Productor, programador, QA, ejecutivo comercial, talento humano, logística y soporte</w:t>
+              <w:t>Auxiliar Contable y Tesorero, Líder de Desarrollo, desarrollador y control de calidad, ejecutivo comercial, talento humano y planillas, y operaciones y servicio al cliente</w:t>
             </w:r>
           </w:p>
         </w:tc>
@@ -5014,63 +4807,6 @@
                 <w:lang w:val="es-SV"/>
               </w:rPr>
               <w:t>Ejecutan las funciones especializadas del giro.</w:t>
-            </w:r>
-          </w:p>
-        </w:tc>
-      </w:tr>
-      <w:tr>
-        <w:trPr>
-          <w:jc w:val="center"/>
-        </w:trPr>
-        <w:tc>
-          <w:tcPr>
-            <w:tcW w:w="2448" w:type="dxa"/>
-          </w:tcPr>
-          <w:p>
-            <w:pPr>
-              <w:spacing w:line="240" w:lineRule="auto"/>
-            </w:pPr>
-            <w:r>
-              <w:rPr>
-                <w:sz w:val="20"/>
-              </w:rPr>
-              <w:t>Administrativo de apoyo</w:t>
-            </w:r>
-          </w:p>
-        </w:tc>
-        <w:tc>
-          <w:tcPr>
-            <w:tcW w:w="3744" w:type="dxa"/>
-          </w:tcPr>
-          <w:p>
-            <w:pPr>
-              <w:spacing w:line="240" w:lineRule="auto"/>
-            </w:pPr>
-            <w:r>
-              <w:rPr>
-                <w:sz w:val="20"/>
-              </w:rPr>
-              <w:t>Asistente Administrativo / Recepción</w:t>
-            </w:r>
-          </w:p>
-        </w:tc>
-        <w:tc>
-          <w:tcPr>
-            <w:tcW w:w="3168" w:type="dxa"/>
-          </w:tcPr>
-          <w:p>
-            <w:pPr>
-              <w:spacing w:line="240" w:lineRule="auto"/>
-              <w:rPr>
-                <w:lang w:val="es-SV"/>
-              </w:rPr>
-            </w:pPr>
-            <w:r>
-              <w:rPr>
-                <w:sz w:val="20"/>
-                <w:lang w:val="es-SV"/>
-              </w:rPr>
-              <w:t>Apoyo transversal a todas las unidades.</w:t>
             </w:r>
           </w:p>
         </w:tc>
@@ -5131,22 +4867,10 @@
         <w:rPr>
           <w:lang w:val="es-SV"/>
         </w:rPr>
-        <w:t xml:space="preserve">A </w:t>
+        <w:t>A continuación se presentan las descripciones de los ocho puestos de la estructura de la sociedad (P-001 a P-008), ordenadas según su código de puesto. Cada descripción comprende la identificación del puesto, los requisitos, las funciones esenciales y las relaciones del puesto.</w:t>
       </w:r>
       <w:proofErr w:type="gramStart"/>
-      <w:r>
-        <w:rPr>
-          <w:lang w:val="es-SV"/>
-        </w:rPr>
-        <w:t>continuación</w:t>
-      </w:r>
       <w:proofErr w:type="gramEnd"/>
-      <w:r>
-        <w:rPr>
-          <w:lang w:val="es-SV"/>
-        </w:rPr>
-        <w:t xml:space="preserve"> se presentan las descripciones de los puestos principales de la estructura de la sociedad, ordenadas según su código de puesto. Cada descripción comprende la identificación del puesto, los requisitos, las funciones esenciales y las relaciones del puesto.</w:t>
-      </w:r>
     </w:p>
     <w:p>
       <w:pPr>
@@ -6244,7 +5968,7 @@
                 <w:sz w:val="22"/>
                 <w:lang w:val="es-SV"/>
               </w:rPr>
-              <w:t>Auxiliar Contable, Tesorero y equipo contable</w:t>
+              <w:t>Auxiliar Contable y Tesorero</w:t>
             </w:r>
           </w:p>
         </w:tc>
@@ -7604,7 +7328,7 @@
         <w:rPr>
           <w:lang w:val="es-SV"/>
         </w:rPr>
-        <w:t>Productor / Líder de Desarrollo de Videojuegos (P-004)</w:t>
+        <w:t>Líder de Desarrollo de Videojuegos (P-004)</w:t>
       </w:r>
       <w:bookmarkEnd w:id="14"/>
     </w:p>
@@ -7737,7 +7461,7 @@
                 <w:sz w:val="22"/>
                 <w:lang w:val="es-SV"/>
               </w:rPr>
-              <w:t>Productor / Líder de Desarrollo de Videojuegos</w:t>
+              <w:t>Líder de Desarrollo de Videojuegos</w:t>
             </w:r>
           </w:p>
         </w:tc>
@@ -7877,7 +7601,7 @@
                 <w:sz w:val="22"/>
                 <w:lang w:val="es-SV"/>
               </w:rPr>
-              <w:t>Programadores, artistas y QA del equipo de desarrollo</w:t>
+              <w:t>Desarrolladores y artistas del equipo de desarrollo</w:t>
             </w:r>
           </w:p>
         </w:tc>
@@ -8456,7 +8180,7 @@
         <w:rPr>
           <w:lang w:val="es-SV"/>
         </w:rPr>
-        <w:t>Programador de Videojuegos (P-005)</w:t>
+        <w:t>Desarrollador de Videojuegos y Control de Calidad (P-005)</w:t>
       </w:r>
       <w:bookmarkEnd w:id="15"/>
     </w:p>
@@ -8483,22 +8207,10 @@
         <w:rPr>
           <w:i/>
         </w:rPr>
-        <w:t xml:space="preserve">Descripción del </w:t>
+        <w:t>Descripción del puesto P-005</w:t>
       </w:r>
       <w:proofErr w:type="spellStart"/>
-      <w:r>
-        <w:rPr>
-          <w:i/>
-        </w:rPr>
-        <w:t>puesto</w:t>
-      </w:r>
       <w:proofErr w:type="spellEnd"/>
-      <w:r>
-        <w:rPr>
-          <w:i/>
-        </w:rPr>
-        <w:t xml:space="preserve"> P-005</w:t>
-      </w:r>
     </w:p>
     <w:tbl>
       <w:tblPr>
@@ -8595,7 +8307,7 @@
               <w:rPr>
                 <w:sz w:val="22"/>
               </w:rPr>
-              <w:t>Programador de Videojuegos</w:t>
+              <w:t>Desarrollador de Videojuegos y Control de Calidad</w:t>
             </w:r>
           </w:p>
         </w:tc>
@@ -8660,16 +8372,9 @@
                 <w:b/>
                 <w:sz w:val="22"/>
               </w:rPr>
-              <w:t>Reporta</w:t>
+              <w:t>Reporta a</w:t>
             </w:r>
             <w:proofErr w:type="spellEnd"/>
-            <w:r>
-              <w:rPr>
-                <w:b/>
-                <w:sz w:val="22"/>
-              </w:rPr>
-              <w:t xml:space="preserve"> a</w:t>
-            </w:r>
           </w:p>
         </w:tc>
         <w:tc>
@@ -8684,7 +8389,7 @@
               <w:rPr>
                 <w:sz w:val="22"/>
               </w:rPr>
-              <w:t>Productor / Líder de Desarrollo</w:t>
+              <w:t>Líder de Desarrollo de Videojuegos</w:t>
             </w:r>
           </w:p>
         </w:tc>
@@ -8802,7 +8507,7 @@
                 <w:sz w:val="22"/>
                 <w:lang w:val="es-SV"/>
               </w:rPr>
-              <w:t>Diseñar, programar e integrar las funcionalidades de los videojuegos y contenidos digitales de la sociedad, garantizando su correcto funcionamiento técnico.</w:t>
+              <w:t>Diseñar, programar e integrar las funcionalidades de los videojuegos y contenidos digitales de la sociedad y verificar su calidad funcional antes del lanzamiento, garantizando su correcto funcionamiento técnico y la ausencia de defectos relevantes.</w:t>
             </w:r>
           </w:p>
         </w:tc>
@@ -8824,16 +8529,9 @@
                 <w:b/>
                 <w:sz w:val="22"/>
               </w:rPr>
-              <w:t xml:space="preserve">Formación </w:t>
+              <w:t>Formación académica</w:t>
             </w:r>
             <w:proofErr w:type="spellStart"/>
-            <w:r>
-              <w:rPr>
-                <w:b/>
-                <w:sz w:val="22"/>
-              </w:rPr>
-              <w:t>académica</w:t>
-            </w:r>
             <w:proofErr w:type="spellEnd"/>
           </w:p>
         </w:tc>
@@ -8853,7 +8551,7 @@
                 <w:sz w:val="22"/>
                 <w:lang w:val="es-SV"/>
               </w:rPr>
-              <w:t>Ingeniería en Sistemas, Software o carreras afines; técnico superior en programación.</w:t>
+              <w:t>Ingeniería en Sistemas, Software o carreras afines; técnico superior en programación o en pruebas de software.</w:t>
             </w:r>
           </w:p>
         </w:tc>
@@ -8897,7 +8595,7 @@
                 <w:sz w:val="22"/>
                 <w:lang w:val="es-SV"/>
               </w:rPr>
-              <w:t>Mínimo dos años en programación; experiencia en desarrollo de videojuegos (deseable).</w:t>
+              <w:t>Mínimo dos años en programación o en pruebas de software; experiencia en desarrollo de videojuegos (deseable).</w:t>
             </w:r>
           </w:p>
         </w:tc>
@@ -8920,24 +8618,10 @@
                 <w:b/>
                 <w:sz w:val="22"/>
               </w:rPr>
-              <w:t>Conocimientos</w:t>
+              <w:t>Conocimientos técnicos</w:t>
             </w:r>
             <w:proofErr w:type="spellEnd"/>
-            <w:r>
-              <w:rPr>
-                <w:b/>
-                <w:sz w:val="22"/>
-              </w:rPr>
-              <w:t xml:space="preserve"> </w:t>
-            </w:r>
             <w:proofErr w:type="spellStart"/>
-            <w:r>
-              <w:rPr>
-                <w:b/>
-                <w:sz w:val="22"/>
-              </w:rPr>
-              <w:t>técnicos</w:t>
-            </w:r>
             <w:proofErr w:type="spellEnd"/>
           </w:p>
         </w:tc>
@@ -8957,24 +8641,10 @@
                 <w:sz w:val="22"/>
                 <w:lang w:val="es-SV"/>
               </w:rPr>
-              <w:t xml:space="preserve">C# / C++, motores Unity y </w:t>
+              <w:t>C# / C++, motores Unity y Unreal, patrones de diseño, control de versiones (Git), bases de datos y metodologías de pruebas (funcionales, de regresión y de compatibilidad).</w:t>
             </w:r>
             <w:proofErr w:type="spellStart"/>
-            <w:r>
-              <w:rPr>
-                <w:sz w:val="22"/>
-                <w:lang w:val="es-SV"/>
-              </w:rPr>
-              <w:t>Unreal</w:t>
-            </w:r>
             <w:proofErr w:type="spellEnd"/>
-            <w:r>
-              <w:rPr>
-                <w:sz w:val="22"/>
-                <w:lang w:val="es-SV"/>
-              </w:rPr>
-              <w:t>, patrones de diseño, control de versiones (Git) y bases de datos.</w:t>
-            </w:r>
           </w:p>
         </w:tc>
       </w:tr>
@@ -9017,7 +8687,7 @@
                 <w:sz w:val="22"/>
                 <w:lang w:val="es-SV"/>
               </w:rPr>
-              <w:t>Pensamiento lógico, resolución de problemas, trabajo en equipo y adaptabilidad tecnológica.</w:t>
+              <w:t>Pensamiento lógico, atención al detalle, resolución de problemas, trabajo en equipo y adaptabilidad tecnológica.</w:t>
             </w:r>
           </w:p>
         </w:tc>
@@ -9040,24 +8710,10 @@
                 <w:b/>
                 <w:sz w:val="22"/>
               </w:rPr>
-              <w:t>Condiciones</w:t>
+              <w:t>Condiciones laborales</w:t>
             </w:r>
             <w:proofErr w:type="spellEnd"/>
-            <w:r>
-              <w:rPr>
-                <w:b/>
-                <w:sz w:val="22"/>
-              </w:rPr>
-              <w:t xml:space="preserve"> </w:t>
-            </w:r>
             <w:proofErr w:type="spellStart"/>
-            <w:r>
-              <w:rPr>
-                <w:b/>
-                <w:sz w:val="22"/>
-              </w:rPr>
-              <w:t>laborales</w:t>
-            </w:r>
             <w:proofErr w:type="spellEnd"/>
           </w:p>
         </w:tc>
@@ -9077,24 +8733,10 @@
                 <w:sz w:val="22"/>
                 <w:lang w:val="es-SV"/>
               </w:rPr>
-              <w:t xml:space="preserve">Contrato a tiempo completo; entregables evaluados por </w:t>
+              <w:t>Contrato a tiempo completo; entregables evaluados por sprints y reportes de calidad por lanzamiento.</w:t>
             </w:r>
             <w:proofErr w:type="spellStart"/>
-            <w:r>
-              <w:rPr>
-                <w:sz w:val="22"/>
-                <w:lang w:val="es-SV"/>
-              </w:rPr>
-              <w:t>sprints</w:t>
-            </w:r>
             <w:proofErr w:type="spellEnd"/>
-            <w:r>
-              <w:rPr>
-                <w:sz w:val="22"/>
-                <w:lang w:val="es-SV"/>
-              </w:rPr>
-              <w:t>.</w:t>
-            </w:r>
           </w:p>
         </w:tc>
       </w:tr>
@@ -9108,29 +8750,11 @@
         <w:rPr>
           <w:b/>
         </w:rPr>
-        <w:t>Funciones</w:t>
+        <w:t xml:space="preserve">Funciones esenciales. </w:t>
       </w:r>
       <w:proofErr w:type="spellEnd"/>
-      <w:r>
-        <w:rPr>
-          <w:b/>
-        </w:rPr>
-        <w:t xml:space="preserve"> </w:t>
-      </w:r>
       <w:proofErr w:type="spellStart"/>
-      <w:r>
-        <w:rPr>
-          <w:b/>
-        </w:rPr>
-        <w:t>esenciales</w:t>
-      </w:r>
       <w:proofErr w:type="spellEnd"/>
-      <w:r>
-        <w:rPr>
-          <w:b/>
-        </w:rPr>
-        <w:t xml:space="preserve">. </w:t>
-      </w:r>
     </w:p>
     <w:p>
       <w:pPr>
@@ -9143,7 +8767,6 @@
         <w:rPr>
           <w:lang w:val="es-SV"/>
         </w:rPr>
-        <w:lastRenderedPageBreak/>
         <w:t>Programar mecánicas de juego, interfaces y funcionalidades de los títulos.</w:t>
       </w:r>
     </w:p>
@@ -9158,22 +8781,10 @@
         <w:rPr>
           <w:lang w:val="es-SV"/>
         </w:rPr>
-        <w:t>Integrar recursos (</w:t>
+        <w:t>Integrar recursos (assets) de arte, audio y animación en el motor de juego.</w:t>
       </w:r>
       <w:proofErr w:type="spellStart"/>
-      <w:r>
-        <w:rPr>
-          <w:lang w:val="es-SV"/>
-        </w:rPr>
-        <w:t>assets</w:t>
-      </w:r>
       <w:proofErr w:type="spellEnd"/>
-      <w:r>
-        <w:rPr>
-          <w:lang w:val="es-SV"/>
-        </w:rPr>
-        <w:t>) de arte, audio y animación en el motor de juego.</w:t>
-      </w:r>
     </w:p>
     <w:p>
       <w:pPr>
@@ -9200,7 +8811,7 @@
         <w:rPr>
           <w:lang w:val="es-SV"/>
         </w:rPr>
-        <w:t>Elaborar y mantener la documentación técnica y el control de versiones del código.</w:t>
+        <w:t>Ejecutar pruebas funcionales, de regresión y de compatibilidad de los títulos antes de su lanzamiento.</w:t>
       </w:r>
     </w:p>
     <w:p>
@@ -9214,7 +8825,7 @@
         <w:rPr>
           <w:lang w:val="es-SV"/>
         </w:rPr>
-        <w:t>Corregir errores (bugs) identificados en las pruebas de calidad.</w:t>
+        <w:t>Documentar y dar seguimiento a los defectos (bugs) y elaborar reportes de pruebas y de calidad por lanzamiento.</w:t>
       </w:r>
     </w:p>
     <w:p>
@@ -9228,32 +8839,60 @@
         <w:rPr>
           <w:lang w:val="es-SV"/>
         </w:rPr>
-        <w:t>Soportar la integración del catálogo y de los sistemas internos (incluido el sistema contable cuando aplique).</w:t>
+        <w:t>Elaborar y mantener la documentación técnica y el control de versiones del código.</w:t>
       </w:r>
     </w:p>
     <w:p>
       <w:pPr>
-        <w:ind w:firstLine="720"/>
-        <w:rPr>
-          <w:lang w:val="es-SV"/>
-        </w:rPr>
-      </w:pPr>
-      <w:r>
-        <w:rPr>
-          <w:b/>
-          <w:lang w:val="es-SV"/>
-        </w:rPr>
-        <w:t xml:space="preserve">Relaciones del puesto. </w:t>
-      </w:r>
-      <w:r>
-        <w:rPr>
-          <w:lang w:val="es-SV"/>
-        </w:rPr>
-        <w:t>Internas: Productor / Líder, QA, arte y diseño. Externas: plataformas de distribución y proveedores de tecnología.</w:t>
+        <w:pStyle w:val="Listaconvietas"/>
+        <w:rPr>
+          <w:lang w:val="es-SV"/>
+        </w:rPr>
+      </w:pPr>
+      <w:r>
+        <w:rPr>
+          <w:lang w:val="es-SV"/>
+        </w:rPr>
+        <w:t>Corregir los errores identificados en las pruebas y verificar el correcto funcionamiento del catálogo de videojuegos y de sus integraciones.</w:t>
       </w:r>
     </w:p>
     <w:p>
       <w:pPr>
+        <w:pStyle w:val="Listaconvietas"/>
+        <w:rPr>
+          <w:lang w:val="es-SV"/>
+        </w:rPr>
+      </w:pPr>
+      <w:r>
+        <w:rPr>
+          <w:lang w:val="es-SV"/>
+        </w:rPr>
+        <w:t>Atender los reportes de errores escalados por Operaciones y Servicio al Cliente y soportar la integración del catálogo y de los sistemas internos, incluido el sistema contable cuando aplique.</w:t>
+      </w:r>
+    </w:p>
+    <w:p>
+      <w:pPr>
+        <w:ind w:firstLine="720"/>
+        <w:rPr>
+          <w:lang w:val="es-SV"/>
+        </w:rPr>
+      </w:pPr>
+      <w:r>
+        <w:rPr>
+          <w:b/>
+          <w:lang w:val="es-SV"/>
+        </w:rPr>
+        <w:t>Relaciones del puesto.</w:t>
+      </w:r>
+      <w:r>
+        <w:rPr>
+          <w:lang w:val="es-SV"/>
+        </w:rPr>
+        <w:t xml:space="preserve"> Internas: Líder de Desarrollo de Videojuegos, Comercial y Marketing, Finanzas y Contabilidad y Operaciones y Servicio al Cliente. Externas: plataformas de distribución y proveedores de tecnología.</w:t>
+      </w:r>
+    </w:p>
+    <w:p>
+      <w:pPr>
         <w:pStyle w:val="Ttulo2"/>
         <w:rPr>
           <w:lang w:val="es-SV"/>
@@ -9264,7 +8903,7 @@
         <w:rPr>
           <w:lang w:val="es-SV"/>
         </w:rPr>
-        <w:t>Analista de Control de Calidad (QA / Tester) (P-006)</w:t>
+        <w:t>Ejecutivo Comercial y Marketing (P-006)</w:t>
       </w:r>
       <w:bookmarkEnd w:id="16"/>
     </w:p>
@@ -9397,7 +9036,7 @@
                 <w:sz w:val="22"/>
                 <w:lang w:val="es-SV"/>
               </w:rPr>
-              <w:t>Analista de Control de Calidad (QA / Tester)</w:t>
+              <w:t>Ejecutivo Comercial y Marketing</w:t>
             </w:r>
           </w:p>
         </w:tc>
@@ -9419,16 +9058,9 @@
                 <w:b/>
                 <w:sz w:val="22"/>
               </w:rPr>
-              <w:t xml:space="preserve">Unidad </w:t>
+              <w:t>Unidad organizativa</w:t>
             </w:r>
             <w:proofErr w:type="spellStart"/>
-            <w:r>
-              <w:rPr>
-                <w:b/>
-                <w:sz w:val="22"/>
-              </w:rPr>
-              <w:t>organizativa</w:t>
-            </w:r>
             <w:proofErr w:type="spellEnd"/>
           </w:p>
         </w:tc>
@@ -9448,7 +9080,7 @@
                 <w:sz w:val="22"/>
                 <w:lang w:val="es-SV"/>
               </w:rPr>
-              <w:t>Tecnología y Desarrollo de Videojuegos</w:t>
+              <w:t>Comercial y Marketing</w:t>
             </w:r>
           </w:p>
         </w:tc>
@@ -9471,16 +9103,9 @@
                 <w:b/>
                 <w:sz w:val="22"/>
               </w:rPr>
-              <w:t>Reporta</w:t>
+              <w:t>Reporta a</w:t>
             </w:r>
             <w:proofErr w:type="spellEnd"/>
-            <w:r>
-              <w:rPr>
-                <w:b/>
-                <w:sz w:val="22"/>
-              </w:rPr>
-              <w:t xml:space="preserve"> a</w:t>
-            </w:r>
           </w:p>
         </w:tc>
         <w:tc>
@@ -9495,7 +9120,7 @@
               <w:rPr>
                 <w:sz w:val="22"/>
               </w:rPr>
-              <w:t>Productor / Líder de Desarrollo</w:t>
+              <w:t>Gerente General</w:t>
             </w:r>
           </w:p>
         </w:tc>
@@ -9613,7 +9238,7 @@
                 <w:sz w:val="22"/>
                 <w:lang w:val="es-SV"/>
               </w:rPr>
-              <w:t>Verificar la calidad funcional y de experiencia de los videojuegos y contenidos antes de su lanzamiento, previniendo y documentando defectos.</w:t>
+              <w:t>Comercializar los productos y servicios de la sociedad, gestionar las ventas en canales físicos y digitales, ejecutar las estrategias de marketing y atender la recepción de clientes y proveedores.</w:t>
             </w:r>
           </w:p>
         </w:tc>
@@ -9635,16 +9260,9 @@
                 <w:b/>
                 <w:sz w:val="22"/>
               </w:rPr>
-              <w:t xml:space="preserve">Formación </w:t>
+              <w:t>Formación académica</w:t>
             </w:r>
             <w:proofErr w:type="spellStart"/>
-            <w:r>
-              <w:rPr>
-                <w:b/>
-                <w:sz w:val="22"/>
-              </w:rPr>
-              <w:t>académica</w:t>
-            </w:r>
             <w:proofErr w:type="spellEnd"/>
           </w:p>
         </w:tc>
@@ -9664,7 +9282,7 @@
                 <w:sz w:val="22"/>
                 <w:lang w:val="es-SV"/>
               </w:rPr>
-              <w:t>Bachillerato o técnico; conocimiento de plataformas y videojuegos.</w:t>
+              <w:t>Licenciatura o técnica en Mercadeo, Administración de Empresas o carreras afines.</w:t>
             </w:r>
           </w:p>
         </w:tc>
@@ -9708,7 +9326,7 @@
                 <w:sz w:val="22"/>
                 <w:lang w:val="es-SV"/>
               </w:rPr>
-              <w:t>Uno a dos años en pruebas de software (deseable); afinidad con la industria de videojuegos.</w:t>
+              <w:t>Mínimo dos años en ventas o marketing digital.</w:t>
             </w:r>
           </w:p>
         </w:tc>
@@ -9731,24 +9349,10 @@
                 <w:b/>
                 <w:sz w:val="22"/>
               </w:rPr>
-              <w:t>Conocimientos</w:t>
+              <w:t>Conocimientos técnicos</w:t>
             </w:r>
             <w:proofErr w:type="spellEnd"/>
-            <w:r>
-              <w:rPr>
-                <w:b/>
-                <w:sz w:val="22"/>
-              </w:rPr>
-              <w:t xml:space="preserve"> </w:t>
-            </w:r>
             <w:proofErr w:type="spellStart"/>
-            <w:r>
-              <w:rPr>
-                <w:b/>
-                <w:sz w:val="22"/>
-              </w:rPr>
-              <w:t>técnicos</w:t>
-            </w:r>
             <w:proofErr w:type="spellEnd"/>
           </w:p>
         </w:tc>
@@ -9768,7 +9372,7 @@
                 <w:sz w:val="22"/>
                 <w:lang w:val="es-SV"/>
               </w:rPr>
-              <w:t>Metodologías de pruebas, reporte de incidencias, plataformas de videojuegos y entornos de distribución.</w:t>
+              <w:t>Comercio electrónico, plataformas de distribución de videojuegos, redes sociales, estrategias de precios y promoción, y herramientas de oficina.</w:t>
             </w:r>
           </w:p>
         </w:tc>
@@ -9812,7 +9416,7 @@
                 <w:sz w:val="22"/>
                 <w:lang w:val="es-SV"/>
               </w:rPr>
-              <w:t>Atención al detalle, método y orden, capacidad analítica y comunicación clara de hallazgos.</w:t>
+              <w:t>Negociación, comunicación, orientación al cliente, creatividad y orientación a resultados.</w:t>
             </w:r>
           </w:p>
         </w:tc>
@@ -9835,24 +9439,10 @@
                 <w:b/>
                 <w:sz w:val="22"/>
               </w:rPr>
-              <w:t>Condiciones</w:t>
+              <w:t>Condiciones laborales</w:t>
             </w:r>
             <w:proofErr w:type="spellEnd"/>
-            <w:r>
-              <w:rPr>
-                <w:b/>
-                <w:sz w:val="22"/>
-              </w:rPr>
-              <w:t xml:space="preserve"> </w:t>
-            </w:r>
             <w:proofErr w:type="spellStart"/>
-            <w:r>
-              <w:rPr>
-                <w:b/>
-                <w:sz w:val="22"/>
-              </w:rPr>
-              <w:t>laborales</w:t>
-            </w:r>
             <w:proofErr w:type="spellEnd"/>
           </w:p>
         </w:tc>
@@ -9872,7 +9462,7 @@
                 <w:sz w:val="22"/>
                 <w:lang w:val="es-SV"/>
               </w:rPr>
-              <w:t>Contrato a tiempo completo o por proyecto.</w:t>
+              <w:t>Contrato a tiempo completo; metas comerciales definidas por período.</w:t>
             </w:r>
           </w:p>
         </w:tc>
@@ -9887,29 +9477,11 @@
         <w:rPr>
           <w:b/>
         </w:rPr>
-        <w:t>Funciones</w:t>
+        <w:t xml:space="preserve">Funciones esenciales. </w:t>
       </w:r>
       <w:proofErr w:type="spellEnd"/>
-      <w:r>
-        <w:rPr>
-          <w:b/>
-        </w:rPr>
-        <w:t xml:space="preserve"> </w:t>
-      </w:r>
       <w:proofErr w:type="spellStart"/>
-      <w:r>
-        <w:rPr>
-          <w:b/>
-        </w:rPr>
-        <w:t>esenciales</w:t>
-      </w:r>
       <w:proofErr w:type="spellEnd"/>
-      <w:r>
-        <w:rPr>
-          <w:b/>
-        </w:rPr>
-        <w:t xml:space="preserve">. </w:t>
-      </w:r>
     </w:p>
     <w:p>
       <w:pPr>
@@ -9922,7 +9494,7 @@
         <w:rPr>
           <w:lang w:val="es-SV"/>
         </w:rPr>
-        <w:t>Ejecutar pruebas funcionales, de regresión y de compatibilidad de los títulos.</w:t>
+        <w:t>Ejecutar el plan de ventas y de marketing anual de la sociedad.</w:t>
       </w:r>
     </w:p>
     <w:p>
@@ -9936,7 +9508,7 @@
         <w:rPr>
           <w:lang w:val="es-SV"/>
         </w:rPr>
-        <w:t>Documentar y dar seguimiento a los defectos (bugs) en el sistema de gestión correspondiente.</w:t>
+        <w:t>Gestionar las tiendas y plataformas digitales de distribución de videojuegos (catálogo, precios, promociones).</w:t>
       </w:r>
     </w:p>
     <w:p>
@@ -9950,8 +9522,7 @@
         <w:rPr>
           <w:lang w:val="es-SV"/>
         </w:rPr>
-        <w:lastRenderedPageBreak/>
-        <w:t>Verificar el correcto funcionamiento del catálogo de videojuegos y de sus integraciones.</w:t>
+        <w:t>Negociar y dar seguimiento a contratos de licencia, distribución y acuerdos comerciales.</w:t>
       </w:r>
     </w:p>
     <w:p>
@@ -9965,7 +9536,7 @@
         <w:rPr>
           <w:lang w:val="es-SV"/>
         </w:rPr>
-        <w:t>Elaborar reportes de pruebas y de calidad por lanzamiento.</w:t>
+        <w:t>Atender clientes mayoristas y minoristas y gestionar la facturación y cobros coordinados con contabilidad.</w:t>
       </w:r>
     </w:p>
     <w:p>
@@ -9979,32 +9550,89 @@
         <w:rPr>
           <w:lang w:val="es-SV"/>
         </w:rPr>
-        <w:t>Participar en la revisión de nuevos contenidos y actualizaciones.</w:t>
+        <w:t>Gestionar las redes sociales y la comunidad de jugadores (community management).</w:t>
       </w:r>
     </w:p>
     <w:p>
       <w:pPr>
-        <w:ind w:firstLine="720"/>
-        <w:rPr>
-          <w:lang w:val="es-SV"/>
-        </w:rPr>
-      </w:pPr>
-      <w:r>
-        <w:rPr>
-          <w:b/>
-          <w:lang w:val="es-SV"/>
-        </w:rPr>
-        <w:t xml:space="preserve">Relaciones del puesto. </w:t>
-      </w:r>
-      <w:r>
-        <w:rPr>
-          <w:lang w:val="es-SV"/>
-        </w:rPr>
-        <w:t>Internas: equipo de desarrollo, Productor / Líder y Soporte. Externas: ninguno en particular.</w:t>
+        <w:pStyle w:val="Listaconvietas"/>
+        <w:rPr>
+          <w:lang w:val="es-SV"/>
+        </w:rPr>
+      </w:pPr>
+      <w:r>
+        <w:rPr>
+          <w:lang w:val="es-SV"/>
+        </w:rPr>
+        <w:t>Medir indicadores comerciales (ventas, conversión, satisfacción) y proponer mejoras.</w:t>
       </w:r>
     </w:p>
     <w:p>
       <w:pPr>
+        <w:pStyle w:val="Listaconvietas"/>
+        <w:rPr>
+          <w:lang w:val="es-SV"/>
+        </w:rPr>
+      </w:pPr>
+      <w:r>
+        <w:rPr>
+          <w:lang w:val="es-SV"/>
+        </w:rPr>
+        <w:t>Asegurar que toda venta esté respaldada con el comprobante autorizado correspondiente.</w:t>
+      </w:r>
+    </w:p>
+    <w:p>
+      <w:pPr>
+        <w:pStyle w:val="Listaconvietas"/>
+        <w:rPr>
+          <w:lang w:val="es-SV"/>
+        </w:rPr>
+      </w:pPr>
+      <w:r>
+        <w:rPr>
+          <w:lang w:val="es-SV"/>
+        </w:rPr>
+        <w:t>Recibir y atender a los visitantes, clientes y proveedores que concurran a las oficinas, y canalizar sus solicitudes con las unidades correspondientes.</w:t>
+      </w:r>
+    </w:p>
+    <w:p>
+      <w:pPr>
+        <w:ind w:firstLine="720"/>
+        <w:rPr>
+          <w:lang w:val="es-SV"/>
+        </w:rPr>
+      </w:pPr>
+      <w:r>
+        <w:rPr>
+          <w:b/>
+          <w:lang w:val="es-SV"/>
+        </w:rPr>
+        <w:t>Relaciones del puesto.</w:t>
+      </w:r>
+      <w:r>
+        <w:rPr>
+          <w:lang w:val="es-SV"/>
+        </w:rPr>
+        <w:t xml:space="preserve"> Internas: Gerencia General, Operaciones y Servicio al Cliente, Tecnología y Desarrollo, Finanzas y Contabilidad y Talento Humano. Externas: clientes, distribuidores, plataformas digitales, agencias y proveedores.</w:t>
+      </w:r>
+    </w:p>
+    <w:p>
+      <w:pPr>
+        <w:ind w:firstLine="720"/>
+        <w:rPr>
+          <w:lang w:val="es-SV"/>
+        </w:rPr>
+      </w:pPr>
+      <w:r>
+        <w:rPr>
+          <w:b w:val="0"/>
+          <w:lang w:val="es-SV"/>
+        </w:rPr>
+        <w:t>La facturación y los cobros deben coordinarse con el área contable para su registro oportuno en el sistema contable.</w:t>
+      </w:r>
+    </w:p>
+    <w:p>
+      <w:pPr>
         <w:pStyle w:val="Ttulo2"/>
         <w:rPr>
           <w:lang w:val="es-SV"/>
@@ -10015,7 +9643,7 @@
         <w:rPr>
           <w:lang w:val="es-SV"/>
         </w:rPr>
-        <w:t>Ejecutivo Comercial y Marketing Digital (P-007)</w:t>
+        <w:t>Encargado de Talento Humano y Planillas (P-007)</w:t>
       </w:r>
       <w:bookmarkEnd w:id="17"/>
     </w:p>
@@ -10148,7 +9776,7 @@
                 <w:sz w:val="22"/>
                 <w:lang w:val="es-SV"/>
               </w:rPr>
-              <w:t>Ejecutivo Comercial y Marketing Digital</w:t>
+              <w:t>Encargado de Talento Humano y Planillas</w:t>
             </w:r>
           </w:p>
         </w:tc>
@@ -10170,16 +9798,9 @@
                 <w:b/>
                 <w:sz w:val="22"/>
               </w:rPr>
-              <w:t xml:space="preserve">Unidad </w:t>
+              <w:t>Unidad organizativa</w:t>
             </w:r>
             <w:proofErr w:type="spellStart"/>
-            <w:r>
-              <w:rPr>
-                <w:b/>
-                <w:sz w:val="22"/>
-              </w:rPr>
-              <w:t>organizativa</w:t>
-            </w:r>
             <w:proofErr w:type="spellEnd"/>
           </w:p>
         </w:tc>
@@ -10195,7 +9816,7 @@
               <w:rPr>
                 <w:sz w:val="22"/>
               </w:rPr>
-              <w:t>Comercial y Marketing</w:t>
+              <w:t>Talento Humano</w:t>
             </w:r>
           </w:p>
         </w:tc>
@@ -10233,7 +9854,7 @@
               <w:rPr>
                 <w:sz w:val="22"/>
               </w:rPr>
-              <w:t>Gerente General (área comercial)</w:t>
+              <w:t>Gerente General</w:t>
             </w:r>
           </w:p>
         </w:tc>
@@ -10271,7 +9892,7 @@
               <w:rPr>
                 <w:sz w:val="22"/>
               </w:rPr>
-              <w:t>No supervisa personal (o community manager)</w:t>
+              <w:t>No supervisa personal</w:t>
             </w:r>
           </w:p>
         </w:tc>
@@ -10351,7 +9972,7 @@
                 <w:sz w:val="22"/>
                 <w:lang w:val="es-SV"/>
               </w:rPr>
-              <w:t>Comercializar los productos y servicios de la sociedad, gestionar las ventas en canales físicos y digitales y ejecutar las estrategias de marketing y comunicación de la empresa.</w:t>
+              <w:t>Administrar el ciclo de vida del personal, garantizar el cumplimiento de las obligaciones laborales y de seguridad social de la sociedad y prestar el apoyo administrativo, documental y de recepción que requiera la organización.</w:t>
             </w:r>
           </w:p>
         </w:tc>
@@ -10373,16 +9994,9 @@
                 <w:b/>
                 <w:sz w:val="22"/>
               </w:rPr>
-              <w:t xml:space="preserve">Formación </w:t>
+              <w:t>Formación académica</w:t>
             </w:r>
             <w:proofErr w:type="spellStart"/>
-            <w:r>
-              <w:rPr>
-                <w:b/>
-                <w:sz w:val="22"/>
-              </w:rPr>
-              <w:t>académica</w:t>
-            </w:r>
             <w:proofErr w:type="spellEnd"/>
           </w:p>
         </w:tc>
@@ -10402,7 +10016,7 @@
                 <w:sz w:val="22"/>
                 <w:lang w:val="es-SV"/>
               </w:rPr>
-              <w:t>Licenciatura o técnica en Mercadeo, Administración de Empresas o carreras afines.</w:t>
+              <w:t>Licenciatura en Administración de Empresas, Relaciones Industriales o Trabajo Social; cursos de RRHH.</w:t>
             </w:r>
           </w:p>
         </w:tc>
@@ -10446,7 +10060,7 @@
                 <w:sz w:val="22"/>
                 <w:lang w:val="es-SV"/>
               </w:rPr>
-              <w:t>Mínimo dos años en ventas o marketing digital.</w:t>
+              <w:t>Mínimo tres años en gestión de personal y planillas.</w:t>
             </w:r>
           </w:p>
         </w:tc>
@@ -10469,24 +10083,10 @@
                 <w:b/>
                 <w:sz w:val="22"/>
               </w:rPr>
-              <w:t>Conocimientos</w:t>
+              <w:t>Conocimientos técnicos</w:t>
             </w:r>
             <w:proofErr w:type="spellEnd"/>
-            <w:r>
-              <w:rPr>
-                <w:b/>
-                <w:sz w:val="22"/>
-              </w:rPr>
-              <w:t xml:space="preserve"> </w:t>
-            </w:r>
             <w:proofErr w:type="spellStart"/>
-            <w:r>
-              <w:rPr>
-                <w:b/>
-                <w:sz w:val="22"/>
-              </w:rPr>
-              <w:t>técnicos</w:t>
-            </w:r>
             <w:proofErr w:type="spellEnd"/>
           </w:p>
         </w:tc>
@@ -10506,7 +10106,7 @@
                 <w:sz w:val="22"/>
                 <w:lang w:val="es-SV"/>
               </w:rPr>
-              <w:t>Comercio electrónico, plataformas de distribución de videojuegos, redes sociales, estrategias de precios y promoción.</w:t>
+              <w:t>Código de Trabajo, legislación de ISSS y AFP, cálculo de planillas y beneficios, administración salarial y herramientas de archivo y oficina.</w:t>
             </w:r>
           </w:p>
         </w:tc>
@@ -10550,7 +10150,7 @@
                 <w:sz w:val="22"/>
                 <w:lang w:val="es-SV"/>
               </w:rPr>
-              <w:t>Negociación, comunicación, orientación al cliente, creatividad y orientación a resultados.</w:t>
+              <w:t>Gestión de personas, confidencialidad, organización, comunicación y cumplimiento normativo.</w:t>
             </w:r>
           </w:p>
         </w:tc>
@@ -10573,24 +10173,10 @@
                 <w:b/>
                 <w:sz w:val="22"/>
               </w:rPr>
-              <w:t>Condiciones</w:t>
+              <w:t>Condiciones laborales</w:t>
             </w:r>
             <w:proofErr w:type="spellEnd"/>
-            <w:r>
-              <w:rPr>
-                <w:b/>
-                <w:sz w:val="22"/>
-              </w:rPr>
-              <w:t xml:space="preserve"> </w:t>
-            </w:r>
             <w:proofErr w:type="spellStart"/>
-            <w:r>
-              <w:rPr>
-                <w:b/>
-                <w:sz w:val="22"/>
-              </w:rPr>
-              <w:t>laborales</w:t>
-            </w:r>
             <w:proofErr w:type="spellEnd"/>
           </w:p>
         </w:tc>
@@ -10610,7 +10196,7 @@
                 <w:sz w:val="22"/>
                 <w:lang w:val="es-SV"/>
               </w:rPr>
-              <w:t>Contrato a tiempo completo; metas comerciales definidas por período.</w:t>
+              <w:t>Contrato a tiempo completo.</w:t>
             </w:r>
           </w:p>
         </w:tc>
@@ -10625,29 +10211,11 @@
         <w:rPr>
           <w:b/>
         </w:rPr>
-        <w:t>Funciones</w:t>
+        <w:t xml:space="preserve">Funciones esenciales. </w:t>
       </w:r>
       <w:proofErr w:type="spellEnd"/>
-      <w:r>
-        <w:rPr>
-          <w:b/>
-        </w:rPr>
-        <w:t xml:space="preserve"> </w:t>
-      </w:r>
       <w:proofErr w:type="spellStart"/>
-      <w:r>
-        <w:rPr>
-          <w:b/>
-        </w:rPr>
-        <w:t>esenciales</w:t>
-      </w:r>
       <w:proofErr w:type="spellEnd"/>
-      <w:r>
-        <w:rPr>
-          <w:b/>
-        </w:rPr>
-        <w:t xml:space="preserve">. </w:t>
-      </w:r>
     </w:p>
     <w:p>
       <w:pPr>
@@ -10660,7 +10228,7 @@
         <w:rPr>
           <w:lang w:val="es-SV"/>
         </w:rPr>
-        <w:t>Ejecutar el plan de ventas y de marketing anual de la sociedad.</w:t>
+        <w:t>Gestionar reclutamiento, selección, contratación e inducción del personal.</w:t>
       </w:r>
     </w:p>
     <w:p>
@@ -10674,7 +10242,7 @@
         <w:rPr>
           <w:lang w:val="es-SV"/>
         </w:rPr>
-        <w:t>Gestionar las tiendas y plataformas digitales de distribución de videojuegos (catálogo, precios, promociones).</w:t>
+        <w:t>Elaborar y administrar las planillas de salarios y las cotizaciones de ISSS, AFP y demás retenciones.</w:t>
       </w:r>
     </w:p>
     <w:p>
@@ -10688,7 +10256,7 @@
         <w:rPr>
           <w:lang w:val="es-SV"/>
         </w:rPr>
-        <w:t>Negociar y dar seguimiento a contratos de licencia, distribución y acuerdos comerciales.</w:t>
+        <w:t>Mantener contratos de trabajo y expedientes del personal conforme al Código de Trabajo.</w:t>
       </w:r>
     </w:p>
     <w:p>
@@ -10702,7 +10270,7 @@
         <w:rPr>
           <w:lang w:val="es-SV"/>
         </w:rPr>
-        <w:t>Atender clientes mayoristas y minoristas y gestionar la facturación y cobros coordinados con contabilidad.</w:t>
+        <w:t>Administrar vacaciones, permisos, ausencias y el control de asistencia.</w:t>
       </w:r>
     </w:p>
     <w:p>
@@ -10716,37 +10284,12 @@
         <w:rPr>
           <w:lang w:val="es-SV"/>
         </w:rPr>
-        <w:lastRenderedPageBreak/>
-        <w:t>Gestionar las redes sociales y la comunidad de jugadores (</w:t>
+        <w:t>Mantener vigente el Reglamento Interno de Trabajo y las políticas de conducta y seguridad.</w:t>
       </w:r>
       <w:proofErr w:type="spellStart"/>
-      <w:r>
-        <w:rPr>
-          <w:lang w:val="es-SV"/>
-        </w:rPr>
-        <w:t>community</w:t>
-      </w:r>
       <w:proofErr w:type="spellEnd"/>
-      <w:r>
-        <w:rPr>
-          <w:lang w:val="es-SV"/>
-        </w:rPr>
-        <w:t xml:space="preserve"> </w:t>
-      </w:r>
       <w:proofErr w:type="spellStart"/>
-      <w:r>
-        <w:rPr>
-          <w:lang w:val="es-SV"/>
-        </w:rPr>
-        <w:t>management</w:t>
-      </w:r>
       <w:proofErr w:type="spellEnd"/>
-      <w:r>
-        <w:rPr>
-          <w:lang w:val="es-SV"/>
-        </w:rPr>
-        <w:t>).</w:t>
-      </w:r>
     </w:p>
     <w:p>
       <w:pPr>
@@ -10759,7 +10302,7 @@
         <w:rPr>
           <w:lang w:val="es-SV"/>
         </w:rPr>
-        <w:t>Medir indicadores comerciales (ventas, conversión, satisfacción) y proponer mejoras.</w:t>
+        <w:t>Coordinar programas de capacitación y la evaluación del desempeño.</w:t>
       </w:r>
     </w:p>
     <w:p>
@@ -10774,53 +10317,80 @@
         <w:rPr>
           <w:lang w:val="es-SV"/>
         </w:rPr>
-        <w:t>Asegurar</w:t>
+        <w:t>Administrar la agenda, la correspondencia y las comunicaciones de la Gerencia General, y coordinar las reuniones institucionales.</w:t>
       </w:r>
       <w:proofErr w:type="gramEnd"/>
-      <w:r>
-        <w:rPr>
-          <w:lang w:val="es-SV"/>
-        </w:rPr>
-        <w:t xml:space="preserve"> que toda venta esté respaldada con el comprobante autorizado correspondiente.</w:t>
-      </w:r>
     </w:p>
     <w:p>
       <w:pPr>
-        <w:ind w:firstLine="720"/>
-        <w:rPr>
-          <w:lang w:val="es-SV"/>
-        </w:rPr>
-      </w:pPr>
-      <w:r>
-        <w:rPr>
-          <w:b/>
-          <w:lang w:val="es-SV"/>
-        </w:rPr>
-        <w:t xml:space="preserve">Relaciones del puesto. </w:t>
-      </w:r>
-      <w:r>
-        <w:rPr>
-          <w:lang w:val="es-SV"/>
-        </w:rPr>
-        <w:t>Internas: Gerencia General, Operaciones, Finanzas y Contabilidad. Externas: clientes, distribuidores, plataformas digitales y agencias.</w:t>
-      </w:r>
+        <w:pStyle w:val="Listaconvietas"/>
+        <w:rPr>
+          <w:lang w:val="es-SV"/>
+        </w:rPr>
+      </w:pPr>
+      <w:proofErr w:type="gramStart"/>
+      <w:r>
+        <w:rPr>
+          <w:lang w:val="es-SV"/>
+        </w:rPr>
+        <w:t>Organizar y custodiar el archivo físico y digital de documentos y expedientes de la sociedad.</w:t>
+      </w:r>
+      <w:proofErr w:type="gramEnd"/>
     </w:p>
     <w:p>
       <w:pPr>
-        <w:ind w:firstLine="720"/>
-        <w:rPr>
-          <w:lang w:val="es-SV"/>
-        </w:rPr>
-      </w:pPr>
-      <w:r>
-        <w:rPr>
-          <w:lang w:val="es-SV"/>
-        </w:rPr>
-        <w:t>La facturación y los cobros deben coordinarse con el área contable para su registro oportuno en el sistema contable.</w:t>
-      </w:r>
+        <w:pStyle w:val="Listaconvietas"/>
+        <w:rPr>
+          <w:lang w:val="es-SV"/>
+        </w:rPr>
+      </w:pPr>
+      <w:proofErr w:type="gramStart"/>
+      <w:r>
+        <w:rPr>
+          <w:lang w:val="es-SV"/>
+        </w:rPr>
+        <w:t>Administrar los suministros de oficina y los servicios generales.</w:t>
+      </w:r>
+      <w:proofErr w:type="gramEnd"/>
     </w:p>
     <w:p>
       <w:pPr>
+        <w:ind w:firstLine="720"/>
+        <w:rPr>
+          <w:lang w:val="es-SV"/>
+        </w:rPr>
+      </w:pPr>
+      <w:r>
+        <w:rPr>
+          <w:b/>
+          <w:lang w:val="es-SV"/>
+        </w:rPr>
+        <w:t>Relaciones del puesto.</w:t>
+      </w:r>
+      <w:r>
+        <w:rPr>
+          <w:lang w:val="es-SV"/>
+        </w:rPr>
+        <w:t xml:space="preserve"> Internas: todas las unidades. Externas: ISSS, AFP, Ministerio de Trabajo (MTPS), proveedores de capacitación y proveedores en general.</w:t>
+      </w:r>
+    </w:p>
+    <w:p>
+      <w:pPr>
+        <w:ind w:firstLine="720"/>
+        <w:rPr>
+          <w:lang w:val="es-SV"/>
+        </w:rPr>
+      </w:pPr>
+      <w:r>
+        <w:rPr>
+          <w:b w:val="0"/>
+          <w:lang w:val="es-SV"/>
+        </w:rPr>
+        <w:t>Las planillas deben ser revisadas por el área de Finanzas y Contabilidad antes de su pago y registro.</w:t>
+      </w:r>
+    </w:p>
+    <w:p>
+      <w:pPr>
         <w:pStyle w:val="Ttulo2"/>
         <w:rPr>
           <w:lang w:val="es-SV"/>
@@ -10831,7 +10401,7 @@
         <w:rPr>
           <w:lang w:val="es-SV"/>
         </w:rPr>
-        <w:t>Encargado de Talento Humano y Planillas (P-008)</w:t>
+        <w:t>Encargado de Operaciones, Logística y Servicio al Cliente (P-008)</w:t>
       </w:r>
       <w:bookmarkEnd w:id="18"/>
     </w:p>
@@ -10964,7 +10534,7 @@
                 <w:sz w:val="22"/>
                 <w:lang w:val="es-SV"/>
               </w:rPr>
-              <w:t>Encargado de Talento Humano y Planillas</w:t>
+              <w:t>Encargado de Operaciones, Logística y Servicio al Cliente</w:t>
             </w:r>
           </w:p>
         </w:tc>
@@ -10986,16 +10556,9 @@
                 <w:b/>
                 <w:sz w:val="22"/>
               </w:rPr>
-              <w:t xml:space="preserve">Unidad </w:t>
+              <w:t>Unidad organizativa</w:t>
             </w:r>
             <w:proofErr w:type="spellStart"/>
-            <w:r>
-              <w:rPr>
-                <w:b/>
-                <w:sz w:val="22"/>
-              </w:rPr>
-              <w:t>organizativa</w:t>
-            </w:r>
             <w:proofErr w:type="spellEnd"/>
           </w:p>
         </w:tc>
@@ -11011,7 +10574,7 @@
               <w:rPr>
                 <w:sz w:val="22"/>
               </w:rPr>
-              <w:t>Talento Humano</w:t>
+              <w:t>Operaciones y Servicio al Cliente</w:t>
             </w:r>
           </w:p>
         </w:tc>
@@ -11167,7 +10730,7 @@
                 <w:sz w:val="22"/>
                 <w:lang w:val="es-SV"/>
               </w:rPr>
-              <w:t>Administrar el ciclo de vida del personal y garantizar el cumplimiento de las obligaciones laborales y de seguridad social de la sociedad.</w:t>
+              <w:t>Ejecutar las operaciones de compras, inventario, almacenamiento y despacho de productos, y brindar soporte técnico y atención a los usuarios y clientes de la sociedad.</w:t>
             </w:r>
           </w:p>
         </w:tc>
@@ -11189,16 +10752,9 @@
                 <w:b/>
                 <w:sz w:val="22"/>
               </w:rPr>
-              <w:t xml:space="preserve">Formación </w:t>
+              <w:t>Formación académica</w:t>
             </w:r>
             <w:proofErr w:type="spellStart"/>
-            <w:r>
-              <w:rPr>
-                <w:b/>
-                <w:sz w:val="22"/>
-              </w:rPr>
-              <w:t>académica</w:t>
-            </w:r>
             <w:proofErr w:type="spellEnd"/>
           </w:p>
         </w:tc>
@@ -11218,7 +10774,7 @@
                 <w:sz w:val="22"/>
                 <w:lang w:val="es-SV"/>
               </w:rPr>
-              <w:t>Licenciatura en Administración de Empresas, Relaciones Industriales o Trabajo Social; cursos de RRHH.</w:t>
+              <w:t>Técnico en logística, Administración o carreras afines; conocimiento de plataformas de videojuegos.</w:t>
             </w:r>
           </w:p>
         </w:tc>
@@ -11262,7 +10818,7 @@
                 <w:sz w:val="22"/>
                 <w:lang w:val="es-SV"/>
               </w:rPr>
-              <w:t>Mínimo tres años en gestión de personal y planillas.</w:t>
+              <w:t>Mínimo dos años en operaciones, compras, logística o atención al cliente.</w:t>
             </w:r>
           </w:p>
         </w:tc>
@@ -11285,24 +10841,10 @@
                 <w:b/>
                 <w:sz w:val="22"/>
               </w:rPr>
-              <w:t>Conocimientos</w:t>
+              <w:t>Conocimientos técnicos</w:t>
             </w:r>
             <w:proofErr w:type="spellEnd"/>
-            <w:r>
-              <w:rPr>
-                <w:b/>
-                <w:sz w:val="22"/>
-              </w:rPr>
-              <w:t xml:space="preserve"> </w:t>
-            </w:r>
             <w:proofErr w:type="spellStart"/>
-            <w:r>
-              <w:rPr>
-                <w:b/>
-                <w:sz w:val="22"/>
-              </w:rPr>
-              <w:t>técnicos</w:t>
-            </w:r>
             <w:proofErr w:type="spellEnd"/>
           </w:p>
         </w:tc>
@@ -11322,7 +10864,7 @@
                 <w:sz w:val="22"/>
                 <w:lang w:val="es-SV"/>
               </w:rPr>
-              <w:t>Código de Trabajo, legislación de ISSS y AFP, cálculo de planillas y beneficios, administración salarial.</w:t>
+              <w:t>Gestión de inventarios, compras y proveedores, facturación y despacho, herramientas de gestión de tickets y de atención al cliente, Excel y sistemas de inventario.</w:t>
             </w:r>
           </w:p>
         </w:tc>
@@ -11366,7 +10908,7 @@
                 <w:sz w:val="22"/>
                 <w:lang w:val="es-SV"/>
               </w:rPr>
-              <w:t>Gestión de personas, confidencialidad, organización, comunicación y cumplimiento normativo.</w:t>
+              <w:t>Organización, planificación, negociación con proveedores, servicio al cliente y resolución de problemas.</w:t>
             </w:r>
           </w:p>
         </w:tc>
@@ -11389,24 +10931,10 @@
                 <w:b/>
                 <w:sz w:val="22"/>
               </w:rPr>
-              <w:t>Condiciones</w:t>
+              <w:t>Condiciones laborales</w:t>
             </w:r>
             <w:proofErr w:type="spellEnd"/>
-            <w:r>
-              <w:rPr>
-                <w:b/>
-                <w:sz w:val="22"/>
-              </w:rPr>
-              <w:t xml:space="preserve"> </w:t>
-            </w:r>
             <w:proofErr w:type="spellStart"/>
-            <w:r>
-              <w:rPr>
-                <w:b/>
-                <w:sz w:val="22"/>
-              </w:rPr>
-              <w:t>laborales</w:t>
-            </w:r>
             <w:proofErr w:type="spellEnd"/>
           </w:p>
         </w:tc>
@@ -11422,7 +10950,7 @@
               <w:rPr>
                 <w:sz w:val="22"/>
               </w:rPr>
-              <w:t>Contrato a tiempo completo.</w:t>
+              <w:t>Contrato a tiempo completo; disponibilidad para la coordinación de despachos y horarios de atención definidos.</w:t>
             </w:r>
           </w:p>
         </w:tc>
@@ -11450,7 +10978,7 @@
         <w:rPr>
           <w:lang w:val="es-SV"/>
         </w:rPr>
-        <w:t>Gestionar reclutamiento, selección, contratación e inducción del personal.</w:t>
+        <w:t>Coordinar el almacenamiento, control y despacho de productos físicos y la disponibilidad de contenidos digitales.</w:t>
       </w:r>
     </w:p>
     <w:p>
@@ -11464,7 +10992,7 @@
         <w:rPr>
           <w:lang w:val="es-SV"/>
         </w:rPr>
-        <w:t>Elaborar y administrar las planillas de salarios y las cotizaciones de ISSS, AFP y demás retenciones.</w:t>
+        <w:t>Gestionar compras y contratos de suministros con proveedores.</w:t>
       </w:r>
     </w:p>
     <w:p>
@@ -11478,7 +11006,7 @@
         <w:rPr>
           <w:lang w:val="es-SV"/>
         </w:rPr>
-        <w:t>Mantener contratos de trabajo y expedientes del personal conforme al Código de Trabajo.</w:t>
+        <w:t>Mantener actualizados los inventarios y reportar existencias y movimientos al área contable.</w:t>
       </w:r>
     </w:p>
     <w:p>
@@ -11492,8 +11020,7 @@
         <w:rPr>
           <w:lang w:val="es-SV"/>
         </w:rPr>
-        <w:lastRenderedPageBreak/>
-        <w:t>Administrar vacaciones, permisos, ausencias y el control de asistencia.</w:t>
+        <w:t>Coordinar la logística de entrega con mensajería y transportistas, y emitir la documentación de soporte de los movimientos (órdenes de salida, guías, recibos).</w:t>
       </w:r>
     </w:p>
     <w:p>
@@ -11507,7 +11034,7 @@
         <w:rPr>
           <w:lang w:val="es-SV"/>
         </w:rPr>
-        <w:t>Mantener vigente el Reglamento Interno de Trabajo y las políticas de conducta y seguridad.</w:t>
+        <w:t>Atender consultas, solicitudes y reclamos de usuarios por los canales establecidos y resolver las incidencias técnicas de primer nivel.</w:t>
       </w:r>
     </w:p>
     <w:p>
@@ -11521,2322 +11048,71 @@
         <w:rPr>
           <w:lang w:val="es-SV"/>
         </w:rPr>
-        <w:t>Coordinar programas de capacitación y la evaluación del desempeño.</w:t>
+        <w:t>Escalar al equipo de desarrollo las incidencias de mayor complejidad y canalizar los reportes de errores o mejoras de productos.</w:t>
       </w:r>
     </w:p>
     <w:p>
       <w:pPr>
-        <w:ind w:firstLine="720"/>
-        <w:rPr>
-          <w:lang w:val="es-SV"/>
-        </w:rPr>
-      </w:pPr>
-      <w:r>
-        <w:rPr>
-          <w:b/>
-          <w:lang w:val="es-SV"/>
-        </w:rPr>
-        <w:t xml:space="preserve">Relaciones del puesto. </w:t>
-      </w:r>
-      <w:r>
-        <w:rPr>
-          <w:lang w:val="es-SV"/>
-        </w:rPr>
-        <w:t>Internas: todas las unidades. Externas: ISSS, AFP, Ministerio de Trabajo (MTPS) y proveedores de capacitación.</w:t>
+        <w:pStyle w:val="Listaconvietas"/>
+        <w:rPr>
+          <w:lang w:val="es-SV"/>
+        </w:rPr>
+      </w:pPr>
+      <w:r>
+        <w:rPr>
+          <w:lang w:val="es-SV"/>
+        </w:rPr>
+        <w:t>Mantener actualizada la base de conocimiento (preguntas frecuentes y guías) y registrar los niveles de servicio (SLA) de atención.</w:t>
       </w:r>
     </w:p>
     <w:p>
       <w:pPr>
-        <w:ind w:firstLine="720"/>
-        <w:rPr>
-          <w:lang w:val="es-SV"/>
-        </w:rPr>
-      </w:pPr>
-      <w:r>
-        <w:rPr>
-          <w:lang w:val="es-SV"/>
-        </w:rPr>
-        <w:t>Las planillas deben ser revisadas por el área de Finanzas y Contabilidad antes de su pago y registro.</w:t>
+        <w:pStyle w:val="Listaconvietas"/>
+        <w:rPr>
+          <w:lang w:val="es-SV"/>
+        </w:rPr>
+      </w:pPr>
+      <w:r>
+        <w:rPr>
+          <w:lang w:val="es-SV"/>
+        </w:rPr>
+        <w:t>Supervisar el mantenimiento de equipos y la infraestructura de oficinas.</w:t>
       </w:r>
     </w:p>
     <w:p>
       <w:pPr>
-        <w:pStyle w:val="Ttulo2"/>
-        <w:rPr>
-          <w:lang w:val="es-SV"/>
-        </w:rPr>
-      </w:pPr>
-      <w:bookmarkStart w:id="19" w:name="_Toc241086782"/>
-      <w:r>
-        <w:rPr>
-          <w:lang w:val="es-SV"/>
-        </w:rPr>
-        <w:t>Encargado de Operaciones y Logística (P-009)</w:t>
-      </w:r>
-      <w:bookmarkEnd w:id="19"/>
+        <w:ind w:firstLine="720"/>
+        <w:rPr>
+          <w:lang w:val="es-SV"/>
+        </w:rPr>
+      </w:pPr>
+      <w:r>
+        <w:rPr>
+          <w:b/>
+          <w:lang w:val="es-SV"/>
+        </w:rPr>
+        <w:t>Relaciones del puesto.</w:t>
+      </w:r>
+      <w:r>
+        <w:rPr>
+          <w:lang w:val="es-SV"/>
+        </w:rPr>
+        <w:t xml:space="preserve"> Internas: Gerencia General, Comercial y Marketing, Tecnología y Desarrollo y Finanzas y Contabilidad. Externas: proveedores, mensajería y operadores de logística, usuarios finales y proveedores de plataformas.</w:t>
+      </w:r>
     </w:p>
     <w:p>
       <w:pPr>
-        <w:keepNext/>
-        <w:rPr>
-          <w:lang w:val="es-SV"/>
-        </w:rPr>
-      </w:pPr>
-      <w:r>
-        <w:rPr>
-          <w:b/>
-          <w:lang w:val="es-SV"/>
-        </w:rPr>
-        <w:t>Tabla 13</w:t>
-      </w:r>
-    </w:p>
-    <w:p>
-      <w:pPr>
-        <w:keepNext/>
-        <w:rPr>
-          <w:lang w:val="es-SV"/>
-        </w:rPr>
-      </w:pPr>
-      <w:r>
-        <w:rPr>
-          <w:i/>
-          <w:lang w:val="es-SV"/>
-        </w:rPr>
-        <w:t>Descripción del puesto P-009</w:t>
-      </w:r>
-    </w:p>
-    <w:tbl>
-      <w:tblPr>
-        <w:tblW w:w="0" w:type="auto"/>
-        <w:jc w:val="center"/>
-        <w:tblBorders>
-          <w:top w:val="single" w:sz="8" w:space="0" w:color="000000"/>
-          <w:bottom w:val="single" w:sz="8" w:space="0" w:color="000000"/>
-        </w:tblBorders>
-        <w:tblLayout w:type="fixed"/>
-        <w:tblLook w:val="04A0" w:firstRow="1" w:lastRow="0" w:firstColumn="1" w:lastColumn="0" w:noHBand="0" w:noVBand="1"/>
-      </w:tblPr>
-      <w:tblGrid>
-        <w:gridCol w:w="2736"/>
-        <w:gridCol w:w="6624"/>
-      </w:tblGrid>
-      <w:tr>
-        <w:trPr>
-          <w:jc w:val="center"/>
-        </w:trPr>
-        <w:tc>
-          <w:tcPr>
-            <w:tcW w:w="2736" w:type="dxa"/>
-            <w:tcBorders>
-              <w:bottom w:val="single" w:sz="8" w:space="0" w:color="000000"/>
-            </w:tcBorders>
-          </w:tcPr>
-          <w:p>
-            <w:pPr>
-              <w:spacing w:line="240" w:lineRule="auto"/>
-              <w:jc w:val="center"/>
-            </w:pPr>
-            <w:r>
-              <w:rPr>
-                <w:b/>
-                <w:sz w:val="22"/>
-              </w:rPr>
-              <w:t>Campo</w:t>
-            </w:r>
-          </w:p>
-        </w:tc>
-        <w:tc>
-          <w:tcPr>
-            <w:tcW w:w="6624" w:type="dxa"/>
-            <w:tcBorders>
-              <w:bottom w:val="single" w:sz="8" w:space="0" w:color="000000"/>
-            </w:tcBorders>
-          </w:tcPr>
-          <w:p>
-            <w:pPr>
-              <w:spacing w:line="240" w:lineRule="auto"/>
-              <w:jc w:val="center"/>
-            </w:pPr>
-            <w:r>
-              <w:rPr>
-                <w:b/>
-                <w:sz w:val="22"/>
-              </w:rPr>
-              <w:t>Descripción</w:t>
-            </w:r>
-          </w:p>
-        </w:tc>
-      </w:tr>
-      <w:tr>
-        <w:trPr>
-          <w:jc w:val="center"/>
-        </w:trPr>
-        <w:tc>
-          <w:tcPr>
-            <w:tcW w:w="2736" w:type="dxa"/>
-          </w:tcPr>
-          <w:p>
-            <w:pPr>
-              <w:spacing w:line="240" w:lineRule="auto"/>
-            </w:pPr>
-            <w:r>
-              <w:rPr>
-                <w:b/>
-                <w:sz w:val="22"/>
-              </w:rPr>
-              <w:t>Denominación del puesto</w:t>
-            </w:r>
-          </w:p>
-        </w:tc>
-        <w:tc>
-          <w:tcPr>
-            <w:tcW w:w="6624" w:type="dxa"/>
-          </w:tcPr>
-          <w:p>
-            <w:pPr>
-              <w:spacing w:line="240" w:lineRule="auto"/>
-              <w:rPr>
-                <w:lang w:val="es-SV"/>
-              </w:rPr>
-            </w:pPr>
-            <w:r>
-              <w:rPr>
-                <w:sz w:val="22"/>
-                <w:lang w:val="es-SV"/>
-              </w:rPr>
-              <w:t>Encargado de Operaciones y Logística</w:t>
-            </w:r>
-          </w:p>
-        </w:tc>
-      </w:tr>
-      <w:tr>
-        <w:trPr>
-          <w:jc w:val="center"/>
-        </w:trPr>
-        <w:tc>
-          <w:tcPr>
-            <w:tcW w:w="2736" w:type="dxa"/>
-          </w:tcPr>
-          <w:p>
-            <w:pPr>
-              <w:spacing w:line="240" w:lineRule="auto"/>
-            </w:pPr>
-            <w:r>
-              <w:rPr>
-                <w:b/>
-                <w:sz w:val="22"/>
-              </w:rPr>
-              <w:t xml:space="preserve">Unidad </w:t>
-            </w:r>
-            <w:proofErr w:type="spellStart"/>
-            <w:r>
-              <w:rPr>
-                <w:b/>
-                <w:sz w:val="22"/>
-              </w:rPr>
-              <w:t>organizativa</w:t>
-            </w:r>
-            <w:proofErr w:type="spellEnd"/>
-          </w:p>
-        </w:tc>
-        <w:tc>
-          <w:tcPr>
-            <w:tcW w:w="6624" w:type="dxa"/>
-          </w:tcPr>
-          <w:p>
-            <w:pPr>
-              <w:spacing w:line="240" w:lineRule="auto"/>
-              <w:rPr>
-                <w:lang w:val="es-SV"/>
-              </w:rPr>
-            </w:pPr>
-            <w:r>
-              <w:rPr>
-                <w:sz w:val="22"/>
-                <w:lang w:val="es-SV"/>
-              </w:rPr>
-              <w:t>Operaciones y Servicio al Cliente</w:t>
-            </w:r>
-          </w:p>
-        </w:tc>
-      </w:tr>
-      <w:tr>
-        <w:trPr>
-          <w:jc w:val="center"/>
-        </w:trPr>
-        <w:tc>
-          <w:tcPr>
-            <w:tcW w:w="2736" w:type="dxa"/>
-          </w:tcPr>
-          <w:p>
-            <w:pPr>
-              <w:spacing w:line="240" w:lineRule="auto"/>
-            </w:pPr>
-            <w:proofErr w:type="spellStart"/>
-            <w:r>
-              <w:rPr>
-                <w:b/>
-                <w:sz w:val="22"/>
-              </w:rPr>
-              <w:t>Reporta</w:t>
-            </w:r>
-            <w:proofErr w:type="spellEnd"/>
-            <w:r>
-              <w:rPr>
-                <w:b/>
-                <w:sz w:val="22"/>
-              </w:rPr>
-              <w:t xml:space="preserve"> a</w:t>
-            </w:r>
-          </w:p>
-        </w:tc>
-        <w:tc>
-          <w:tcPr>
-            <w:tcW w:w="6624" w:type="dxa"/>
-          </w:tcPr>
-          <w:p>
-            <w:pPr>
-              <w:spacing w:line="240" w:lineRule="auto"/>
-            </w:pPr>
-            <w:r>
-              <w:rPr>
-                <w:sz w:val="22"/>
-              </w:rPr>
-              <w:t>Gerente General</w:t>
-            </w:r>
-          </w:p>
-        </w:tc>
-      </w:tr>
-      <w:tr>
-        <w:trPr>
-          <w:jc w:val="center"/>
-        </w:trPr>
-        <w:tc>
-          <w:tcPr>
-            <w:tcW w:w="2736" w:type="dxa"/>
-          </w:tcPr>
-          <w:p>
-            <w:pPr>
-              <w:spacing w:line="240" w:lineRule="auto"/>
-            </w:pPr>
-            <w:r>
-              <w:rPr>
-                <w:b/>
-                <w:sz w:val="22"/>
-              </w:rPr>
-              <w:t>Supervisa a</w:t>
-            </w:r>
-          </w:p>
-        </w:tc>
-        <w:tc>
-          <w:tcPr>
-            <w:tcW w:w="6624" w:type="dxa"/>
-          </w:tcPr>
-          <w:p>
-            <w:pPr>
-              <w:spacing w:line="240" w:lineRule="auto"/>
-              <w:rPr>
-                <w:lang w:val="es-SV"/>
-              </w:rPr>
-            </w:pPr>
-            <w:r>
-              <w:rPr>
-                <w:sz w:val="22"/>
-                <w:lang w:val="es-SV"/>
-              </w:rPr>
-              <w:t>Personal de almacén y despacho (si existe)</w:t>
-            </w:r>
-          </w:p>
-        </w:tc>
-      </w:tr>
-      <w:tr>
-        <w:trPr>
-          <w:jc w:val="center"/>
-        </w:trPr>
-        <w:tc>
-          <w:tcPr>
-            <w:tcW w:w="2736" w:type="dxa"/>
-          </w:tcPr>
-          <w:p>
-            <w:pPr>
-              <w:spacing w:line="240" w:lineRule="auto"/>
-            </w:pPr>
-            <w:r>
-              <w:rPr>
-                <w:b/>
-                <w:sz w:val="22"/>
-              </w:rPr>
-              <w:t xml:space="preserve">Nivel </w:t>
-            </w:r>
-            <w:proofErr w:type="spellStart"/>
-            <w:r>
-              <w:rPr>
-                <w:b/>
-                <w:sz w:val="22"/>
-              </w:rPr>
-              <w:t>jerárquico</w:t>
-            </w:r>
-            <w:proofErr w:type="spellEnd"/>
-          </w:p>
-        </w:tc>
-        <w:tc>
-          <w:tcPr>
-            <w:tcW w:w="6624" w:type="dxa"/>
-          </w:tcPr>
-          <w:p>
-            <w:pPr>
-              <w:spacing w:line="240" w:lineRule="auto"/>
-            </w:pPr>
-            <w:r>
-              <w:rPr>
-                <w:sz w:val="22"/>
-              </w:rPr>
-              <w:t>Técnico-operativo</w:t>
-            </w:r>
-          </w:p>
-        </w:tc>
-      </w:tr>
-      <w:tr>
-        <w:trPr>
-          <w:jc w:val="center"/>
-        </w:trPr>
-        <w:tc>
-          <w:tcPr>
-            <w:tcW w:w="2736" w:type="dxa"/>
-          </w:tcPr>
-          <w:p>
-            <w:pPr>
-              <w:spacing w:line="240" w:lineRule="auto"/>
-            </w:pPr>
-            <w:r>
-              <w:rPr>
-                <w:b/>
-                <w:sz w:val="22"/>
-              </w:rPr>
-              <w:t>Misión del puesto</w:t>
-            </w:r>
-          </w:p>
-        </w:tc>
-        <w:tc>
-          <w:tcPr>
-            <w:tcW w:w="6624" w:type="dxa"/>
-          </w:tcPr>
-          <w:p>
-            <w:pPr>
-              <w:spacing w:line="240" w:lineRule="auto"/>
-              <w:rPr>
-                <w:lang w:val="es-SV"/>
-              </w:rPr>
-            </w:pPr>
-            <w:r>
-              <w:rPr>
-                <w:sz w:val="22"/>
-                <w:lang w:val="es-SV"/>
-              </w:rPr>
-              <w:t>Ejecutar las operaciones de compras, inventario, almacenamiento y despacho de productos, y asegurar la disponibilidad de insumos y suministros.</w:t>
-            </w:r>
-          </w:p>
-        </w:tc>
-      </w:tr>
-      <w:tr>
-        <w:trPr>
-          <w:jc w:val="center"/>
-        </w:trPr>
-        <w:tc>
-          <w:tcPr>
-            <w:tcW w:w="2736" w:type="dxa"/>
-          </w:tcPr>
-          <w:p>
-            <w:pPr>
-              <w:spacing w:line="240" w:lineRule="auto"/>
-            </w:pPr>
-            <w:r>
-              <w:rPr>
-                <w:b/>
-                <w:sz w:val="22"/>
-              </w:rPr>
-              <w:t xml:space="preserve">Formación </w:t>
-            </w:r>
-            <w:proofErr w:type="spellStart"/>
-            <w:r>
-              <w:rPr>
-                <w:b/>
-                <w:sz w:val="22"/>
-              </w:rPr>
-              <w:t>académica</w:t>
-            </w:r>
-            <w:proofErr w:type="spellEnd"/>
-          </w:p>
-        </w:tc>
-        <w:tc>
-          <w:tcPr>
-            <w:tcW w:w="6624" w:type="dxa"/>
-          </w:tcPr>
-          <w:p>
-            <w:pPr>
-              <w:spacing w:line="240" w:lineRule="auto"/>
-              <w:rPr>
-                <w:lang w:val="es-SV"/>
-              </w:rPr>
-            </w:pPr>
-            <w:r>
-              <w:rPr>
-                <w:sz w:val="22"/>
-                <w:lang w:val="es-SV"/>
-              </w:rPr>
-              <w:t>Técnico en logística, Administración o carreras afines.</w:t>
-            </w:r>
-          </w:p>
-        </w:tc>
-      </w:tr>
-      <w:tr>
-        <w:trPr>
-          <w:jc w:val="center"/>
-        </w:trPr>
-        <w:tc>
-          <w:tcPr>
-            <w:tcW w:w="2736" w:type="dxa"/>
-          </w:tcPr>
-          <w:p>
-            <w:pPr>
-              <w:spacing w:line="240" w:lineRule="auto"/>
-            </w:pPr>
-            <w:proofErr w:type="spellStart"/>
-            <w:r>
-              <w:rPr>
-                <w:b/>
-                <w:sz w:val="22"/>
-              </w:rPr>
-              <w:t>Experiencia</w:t>
-            </w:r>
-            <w:proofErr w:type="spellEnd"/>
-          </w:p>
-        </w:tc>
-        <w:tc>
-          <w:tcPr>
-            <w:tcW w:w="6624" w:type="dxa"/>
-          </w:tcPr>
-          <w:p>
-            <w:pPr>
-              <w:spacing w:line="240" w:lineRule="auto"/>
-              <w:rPr>
-                <w:lang w:val="es-SV"/>
-              </w:rPr>
-            </w:pPr>
-            <w:r>
-              <w:rPr>
-                <w:sz w:val="22"/>
-                <w:lang w:val="es-SV"/>
-              </w:rPr>
-              <w:t>Mínimo dos años en operaciones, compras o logística.</w:t>
-            </w:r>
-          </w:p>
-        </w:tc>
-      </w:tr>
-      <w:tr>
-        <w:trPr>
-          <w:jc w:val="center"/>
-        </w:trPr>
-        <w:tc>
-          <w:tcPr>
-            <w:tcW w:w="2736" w:type="dxa"/>
-          </w:tcPr>
-          <w:p>
-            <w:pPr>
-              <w:spacing w:line="240" w:lineRule="auto"/>
-            </w:pPr>
-            <w:proofErr w:type="spellStart"/>
-            <w:r>
-              <w:rPr>
-                <w:b/>
-                <w:sz w:val="22"/>
-              </w:rPr>
-              <w:t>Conocimientos</w:t>
-            </w:r>
-            <w:proofErr w:type="spellEnd"/>
-            <w:r>
-              <w:rPr>
-                <w:b/>
-                <w:sz w:val="22"/>
-              </w:rPr>
-              <w:t xml:space="preserve"> </w:t>
-            </w:r>
-            <w:proofErr w:type="spellStart"/>
-            <w:r>
-              <w:rPr>
-                <w:b/>
-                <w:sz w:val="22"/>
-              </w:rPr>
-              <w:t>técnicos</w:t>
-            </w:r>
-            <w:proofErr w:type="spellEnd"/>
-          </w:p>
-        </w:tc>
-        <w:tc>
-          <w:tcPr>
-            <w:tcW w:w="6624" w:type="dxa"/>
-          </w:tcPr>
-          <w:p>
-            <w:pPr>
-              <w:spacing w:line="240" w:lineRule="auto"/>
-              <w:rPr>
-                <w:lang w:val="es-SV"/>
-              </w:rPr>
-            </w:pPr>
-            <w:r>
-              <w:rPr>
-                <w:sz w:val="22"/>
-                <w:lang w:val="es-SV"/>
-              </w:rPr>
-              <w:t>Gestión de inventarios, compras y proveedores, facturación y despacho, Excel y sistemas de inventario.</w:t>
-            </w:r>
-          </w:p>
-        </w:tc>
-      </w:tr>
-      <w:tr>
-        <w:trPr>
-          <w:jc w:val="center"/>
-        </w:trPr>
-        <w:tc>
-          <w:tcPr>
-            <w:tcW w:w="2736" w:type="dxa"/>
-          </w:tcPr>
-          <w:p>
-            <w:pPr>
-              <w:spacing w:line="240" w:lineRule="auto"/>
-            </w:pPr>
-            <w:proofErr w:type="spellStart"/>
-            <w:r>
-              <w:rPr>
-                <w:b/>
-                <w:sz w:val="22"/>
-              </w:rPr>
-              <w:t>Competencias</w:t>
-            </w:r>
-            <w:proofErr w:type="spellEnd"/>
-          </w:p>
-        </w:tc>
-        <w:tc>
-          <w:tcPr>
-            <w:tcW w:w="6624" w:type="dxa"/>
-          </w:tcPr>
-          <w:p>
-            <w:pPr>
-              <w:spacing w:line="240" w:lineRule="auto"/>
-              <w:rPr>
-                <w:lang w:val="es-SV"/>
-              </w:rPr>
-            </w:pPr>
-            <w:r>
-              <w:rPr>
-                <w:sz w:val="22"/>
-                <w:lang w:val="es-SV"/>
-              </w:rPr>
-              <w:t>Organización, planificación, negociación con proveedores y orientación al servicio.</w:t>
-            </w:r>
-          </w:p>
-        </w:tc>
-      </w:tr>
-      <w:tr>
-        <w:trPr>
-          <w:jc w:val="center"/>
-        </w:trPr>
-        <w:tc>
-          <w:tcPr>
-            <w:tcW w:w="2736" w:type="dxa"/>
-          </w:tcPr>
-          <w:p>
-            <w:pPr>
-              <w:spacing w:line="240" w:lineRule="auto"/>
-            </w:pPr>
-            <w:proofErr w:type="spellStart"/>
-            <w:r>
-              <w:rPr>
-                <w:b/>
-                <w:sz w:val="22"/>
-              </w:rPr>
-              <w:t>Condiciones</w:t>
-            </w:r>
-            <w:proofErr w:type="spellEnd"/>
-            <w:r>
-              <w:rPr>
-                <w:b/>
-                <w:sz w:val="22"/>
-              </w:rPr>
-              <w:t xml:space="preserve"> </w:t>
-            </w:r>
-            <w:proofErr w:type="spellStart"/>
-            <w:r>
-              <w:rPr>
-                <w:b/>
-                <w:sz w:val="22"/>
-              </w:rPr>
-              <w:t>laborales</w:t>
-            </w:r>
-            <w:proofErr w:type="spellEnd"/>
-          </w:p>
-        </w:tc>
-        <w:tc>
-          <w:tcPr>
-            <w:tcW w:w="6624" w:type="dxa"/>
-          </w:tcPr>
-          <w:p>
-            <w:pPr>
-              <w:spacing w:line="240" w:lineRule="auto"/>
-              <w:rPr>
-                <w:lang w:val="es-SV"/>
-              </w:rPr>
-            </w:pPr>
-            <w:r>
-              <w:rPr>
-                <w:sz w:val="22"/>
-                <w:lang w:val="es-SV"/>
-              </w:rPr>
-              <w:t>Contrato a tiempo completo; disponibilidad para la coordinación de despachos.</w:t>
-            </w:r>
-          </w:p>
-        </w:tc>
-      </w:tr>
-    </w:tbl>
-    <w:p>
-      <w:pPr>
         <w:ind w:firstLine="720"/>
-      </w:pPr>
-      <w:proofErr w:type="spellStart"/>
-      <w:r>
-        <w:rPr>
-          <w:b/>
-        </w:rPr>
-        <w:t>Funciones</w:t>
-      </w:r>
-      <w:proofErr w:type="spellEnd"/>
-      <w:r>
-        <w:rPr>
-          <w:b/>
-        </w:rPr>
-        <w:t xml:space="preserve"> </w:t>
-      </w:r>
-      <w:proofErr w:type="spellStart"/>
-      <w:r>
-        <w:rPr>
-          <w:b/>
-        </w:rPr>
-        <w:t>esenciales</w:t>
-      </w:r>
-      <w:proofErr w:type="spellEnd"/>
-      <w:r>
-        <w:rPr>
-          <w:b/>
-        </w:rPr>
-        <w:t xml:space="preserve">. </w:t>
-      </w:r>
-    </w:p>
-    <w:p>
-      <w:pPr>
-        <w:pStyle w:val="Listaconvietas"/>
-        <w:rPr>
-          <w:lang w:val="es-SV"/>
-        </w:rPr>
-      </w:pPr>
-      <w:r>
-        <w:rPr>
-          <w:lang w:val="es-SV"/>
-        </w:rPr>
-        <w:t>Coordinar el almacenamiento, control y despacho de productos físicos y la disponibilidad de contenidos digitales.</w:t>
-      </w:r>
-    </w:p>
-    <w:p>
-      <w:pPr>
-        <w:pStyle w:val="Listaconvietas"/>
-        <w:rPr>
-          <w:lang w:val="es-SV"/>
-        </w:rPr>
-      </w:pPr>
-      <w:r>
-        <w:rPr>
-          <w:lang w:val="es-SV"/>
-        </w:rPr>
-        <w:t>Gestionar compras y contratos de suministros con proveedores.</w:t>
-      </w:r>
-    </w:p>
-    <w:p>
-      <w:pPr>
-        <w:pStyle w:val="Listaconvietas"/>
-        <w:rPr>
-          <w:lang w:val="es-SV"/>
-        </w:rPr>
-      </w:pPr>
-      <w:r>
-        <w:rPr>
-          <w:lang w:val="es-SV"/>
-        </w:rPr>
-        <w:t>Mantener actualizados los inventarios y reportar existencias y movimientos al área contable.</w:t>
-      </w:r>
-    </w:p>
-    <w:p>
-      <w:pPr>
-        <w:pStyle w:val="Listaconvietas"/>
-        <w:rPr>
-          <w:lang w:val="es-SV"/>
-        </w:rPr>
-      </w:pPr>
-      <w:r>
-        <w:rPr>
-          <w:lang w:val="es-SV"/>
-        </w:rPr>
-        <w:lastRenderedPageBreak/>
-        <w:t>Coordinar la logística de entrega con mensajería y transportistas.</w:t>
-      </w:r>
-    </w:p>
-    <w:p>
-      <w:pPr>
-        <w:pStyle w:val="Listaconvietas"/>
-        <w:rPr>
-          <w:lang w:val="es-SV"/>
-        </w:rPr>
-      </w:pPr>
-      <w:r>
-        <w:rPr>
-          <w:lang w:val="es-SV"/>
-        </w:rPr>
-        <w:t>Supervisar el mantenimiento de equipos y la infraestructura de oficinas.</w:t>
-      </w:r>
-    </w:p>
-    <w:p>
-      <w:pPr>
-        <w:pStyle w:val="Listaconvietas"/>
-        <w:rPr>
-          <w:lang w:val="es-SV"/>
-        </w:rPr>
-      </w:pPr>
-      <w:r>
-        <w:rPr>
-          <w:lang w:val="es-SV"/>
-        </w:rPr>
-        <w:t>Emitir la documentación de soporte de los movimientos (órdenes de salida, guías, recibos).</w:t>
-      </w:r>
-    </w:p>
-    <w:p>
-      <w:pPr>
-        <w:ind w:firstLine="720"/>
-        <w:rPr>
-          <w:lang w:val="es-SV"/>
-        </w:rPr>
-      </w:pPr>
-      <w:r>
-        <w:rPr>
-          <w:b/>
-          <w:lang w:val="es-SV"/>
-        </w:rPr>
-        <w:t xml:space="preserve">Relaciones del puesto. </w:t>
-      </w:r>
-      <w:r>
-        <w:rPr>
-          <w:lang w:val="es-SV"/>
-        </w:rPr>
-        <w:t>Internas: Comercial, Finanzas y Contabilidad. Externas: proveedores, mensajería y operadores de logística.</w:t>
-      </w:r>
-    </w:p>
-    <w:p>
-      <w:pPr>
-        <w:ind w:firstLine="720"/>
-        <w:rPr>
-          <w:lang w:val="es-SV"/>
-        </w:rPr>
-      </w:pPr>
-      <w:r>
-        <w:rPr>
-          <w:lang w:val="es-SV"/>
-        </w:rPr>
-        <w:t>Los despachos deben generar el correspondiente soporte para el registro y control de inventarios en el sistema contable.</w:t>
-      </w:r>
-    </w:p>
-    <w:p>
-      <w:pPr>
-        <w:pStyle w:val="Ttulo2"/>
-        <w:rPr>
-          <w:lang w:val="es-SV"/>
-        </w:rPr>
-      </w:pPr>
-      <w:bookmarkStart w:id="20" w:name="_Toc241086783"/>
-      <w:r>
-        <w:rPr>
-          <w:lang w:val="es-SV"/>
-        </w:rPr>
-        <w:t>Soporte Técnico y Servicio al Cliente (P-010)</w:t>
-      </w:r>
-      <w:bookmarkEnd w:id="20"/>
-    </w:p>
-    <w:p>
-      <w:pPr>
-        <w:keepNext/>
-        <w:rPr>
-          <w:lang w:val="es-SV"/>
-        </w:rPr>
-      </w:pPr>
-      <w:r>
-        <w:rPr>
-          <w:b/>
-          <w:lang w:val="es-SV"/>
-        </w:rPr>
-        <w:t>Tabla 14</w:t>
-      </w:r>
-    </w:p>
-    <w:p>
-      <w:pPr>
-        <w:keepNext/>
-        <w:rPr>
-          <w:lang w:val="es-SV"/>
-        </w:rPr>
-      </w:pPr>
-      <w:r>
-        <w:rPr>
-          <w:i/>
-          <w:lang w:val="es-SV"/>
-        </w:rPr>
-        <w:t>Descripción del puesto P-010</w:t>
-      </w:r>
-    </w:p>
-    <w:tbl>
-      <w:tblPr>
-        <w:tblW w:w="0" w:type="auto"/>
-        <w:jc w:val="center"/>
-        <w:tblBorders>
-          <w:top w:val="single" w:sz="8" w:space="0" w:color="000000"/>
-          <w:bottom w:val="single" w:sz="8" w:space="0" w:color="000000"/>
-        </w:tblBorders>
-        <w:tblLayout w:type="fixed"/>
-        <w:tblLook w:val="04A0" w:firstRow="1" w:lastRow="0" w:firstColumn="1" w:lastColumn="0" w:noHBand="0" w:noVBand="1"/>
-      </w:tblPr>
-      <w:tblGrid>
-        <w:gridCol w:w="2736"/>
-        <w:gridCol w:w="6624"/>
-      </w:tblGrid>
-      <w:tr>
-        <w:trPr>
-          <w:jc w:val="center"/>
-        </w:trPr>
-        <w:tc>
-          <w:tcPr>
-            <w:tcW w:w="2736" w:type="dxa"/>
-            <w:tcBorders>
-              <w:bottom w:val="single" w:sz="8" w:space="0" w:color="000000"/>
-            </w:tcBorders>
-          </w:tcPr>
-          <w:p>
-            <w:pPr>
-              <w:spacing w:line="240" w:lineRule="auto"/>
-              <w:jc w:val="center"/>
-            </w:pPr>
-            <w:r>
-              <w:rPr>
-                <w:b/>
-                <w:sz w:val="22"/>
-              </w:rPr>
-              <w:t>Campo</w:t>
-            </w:r>
-          </w:p>
-        </w:tc>
-        <w:tc>
-          <w:tcPr>
-            <w:tcW w:w="6624" w:type="dxa"/>
-            <w:tcBorders>
-              <w:bottom w:val="single" w:sz="8" w:space="0" w:color="000000"/>
-            </w:tcBorders>
-          </w:tcPr>
-          <w:p>
-            <w:pPr>
-              <w:spacing w:line="240" w:lineRule="auto"/>
-              <w:jc w:val="center"/>
-            </w:pPr>
-            <w:r>
-              <w:rPr>
-                <w:b/>
-                <w:sz w:val="22"/>
-              </w:rPr>
-              <w:t>Descripción</w:t>
-            </w:r>
-          </w:p>
-        </w:tc>
-      </w:tr>
-      <w:tr>
-        <w:trPr>
-          <w:jc w:val="center"/>
-        </w:trPr>
-        <w:tc>
-          <w:tcPr>
-            <w:tcW w:w="2736" w:type="dxa"/>
-          </w:tcPr>
-          <w:p>
-            <w:pPr>
-              <w:spacing w:line="240" w:lineRule="auto"/>
-            </w:pPr>
-            <w:r>
-              <w:rPr>
-                <w:b/>
-                <w:sz w:val="22"/>
-              </w:rPr>
-              <w:t>Denominación del puesto</w:t>
-            </w:r>
-          </w:p>
-        </w:tc>
-        <w:tc>
-          <w:tcPr>
-            <w:tcW w:w="6624" w:type="dxa"/>
-          </w:tcPr>
-          <w:p>
-            <w:pPr>
-              <w:spacing w:line="240" w:lineRule="auto"/>
-              <w:rPr>
-                <w:lang w:val="es-SV"/>
-              </w:rPr>
-            </w:pPr>
-            <w:r>
-              <w:rPr>
-                <w:sz w:val="22"/>
-                <w:lang w:val="es-SV"/>
-              </w:rPr>
-              <w:t>Soporte Técnico y Servicio al Cliente</w:t>
-            </w:r>
-          </w:p>
-        </w:tc>
-      </w:tr>
-      <w:tr>
-        <w:trPr>
-          <w:jc w:val="center"/>
-        </w:trPr>
-        <w:tc>
-          <w:tcPr>
-            <w:tcW w:w="2736" w:type="dxa"/>
-          </w:tcPr>
-          <w:p>
-            <w:pPr>
-              <w:spacing w:line="240" w:lineRule="auto"/>
-            </w:pPr>
-            <w:r>
-              <w:rPr>
-                <w:b/>
-                <w:sz w:val="22"/>
-              </w:rPr>
-              <w:t xml:space="preserve">Unidad </w:t>
-            </w:r>
-            <w:proofErr w:type="spellStart"/>
-            <w:r>
-              <w:rPr>
-                <w:b/>
-                <w:sz w:val="22"/>
-              </w:rPr>
-              <w:t>organizativa</w:t>
-            </w:r>
-            <w:proofErr w:type="spellEnd"/>
-          </w:p>
-        </w:tc>
-        <w:tc>
-          <w:tcPr>
-            <w:tcW w:w="6624" w:type="dxa"/>
-          </w:tcPr>
-          <w:p>
-            <w:pPr>
-              <w:spacing w:line="240" w:lineRule="auto"/>
-              <w:rPr>
-                <w:lang w:val="es-SV"/>
-              </w:rPr>
-            </w:pPr>
-            <w:r>
-              <w:rPr>
-                <w:sz w:val="22"/>
-                <w:lang w:val="es-SV"/>
-              </w:rPr>
-              <w:t>Operaciones y Servicio al Cliente</w:t>
-            </w:r>
-          </w:p>
-        </w:tc>
-      </w:tr>
-      <w:tr>
-        <w:trPr>
-          <w:jc w:val="center"/>
-        </w:trPr>
-        <w:tc>
-          <w:tcPr>
-            <w:tcW w:w="2736" w:type="dxa"/>
-          </w:tcPr>
-          <w:p>
-            <w:pPr>
-              <w:spacing w:line="240" w:lineRule="auto"/>
-            </w:pPr>
-            <w:proofErr w:type="spellStart"/>
-            <w:r>
-              <w:rPr>
-                <w:b/>
-                <w:sz w:val="22"/>
-              </w:rPr>
-              <w:t>Reporta</w:t>
-            </w:r>
-            <w:proofErr w:type="spellEnd"/>
-            <w:r>
-              <w:rPr>
-                <w:b/>
-                <w:sz w:val="22"/>
-              </w:rPr>
-              <w:t xml:space="preserve"> a</w:t>
-            </w:r>
-          </w:p>
-        </w:tc>
-        <w:tc>
-          <w:tcPr>
-            <w:tcW w:w="6624" w:type="dxa"/>
-          </w:tcPr>
-          <w:p>
-            <w:pPr>
-              <w:spacing w:line="240" w:lineRule="auto"/>
-              <w:rPr>
-                <w:lang w:val="es-SV"/>
-              </w:rPr>
-            </w:pPr>
-            <w:r>
-              <w:rPr>
-                <w:sz w:val="22"/>
-                <w:lang w:val="es-SV"/>
-              </w:rPr>
-              <w:t>Encargado de Operaciones y Logística</w:t>
-            </w:r>
-          </w:p>
-        </w:tc>
-      </w:tr>
-      <w:tr>
-        <w:trPr>
-          <w:jc w:val="center"/>
-        </w:trPr>
-        <w:tc>
-          <w:tcPr>
-            <w:tcW w:w="2736" w:type="dxa"/>
-          </w:tcPr>
-          <w:p>
-            <w:pPr>
-              <w:spacing w:line="240" w:lineRule="auto"/>
-            </w:pPr>
-            <w:proofErr w:type="spellStart"/>
-            <w:r>
-              <w:rPr>
-                <w:b/>
-                <w:sz w:val="22"/>
-              </w:rPr>
-              <w:t>Supervisa</w:t>
-            </w:r>
-            <w:proofErr w:type="spellEnd"/>
-            <w:r>
-              <w:rPr>
-                <w:b/>
-                <w:sz w:val="22"/>
-              </w:rPr>
-              <w:t xml:space="preserve"> a</w:t>
-            </w:r>
-          </w:p>
-        </w:tc>
-        <w:tc>
-          <w:tcPr>
-            <w:tcW w:w="6624" w:type="dxa"/>
-          </w:tcPr>
-          <w:p>
-            <w:pPr>
-              <w:spacing w:line="240" w:lineRule="auto"/>
-            </w:pPr>
-            <w:r>
-              <w:rPr>
-                <w:sz w:val="22"/>
-              </w:rPr>
-              <w:t>No supervisa personal</w:t>
-            </w:r>
-          </w:p>
-        </w:tc>
-      </w:tr>
-      <w:tr>
-        <w:trPr>
-          <w:jc w:val="center"/>
-        </w:trPr>
-        <w:tc>
-          <w:tcPr>
-            <w:tcW w:w="2736" w:type="dxa"/>
-          </w:tcPr>
-          <w:p>
-            <w:pPr>
-              <w:spacing w:line="240" w:lineRule="auto"/>
-            </w:pPr>
-            <w:r>
-              <w:rPr>
-                <w:b/>
-                <w:sz w:val="22"/>
-              </w:rPr>
-              <w:t>Nivel jerárquico</w:t>
-            </w:r>
-          </w:p>
-        </w:tc>
-        <w:tc>
-          <w:tcPr>
-            <w:tcW w:w="6624" w:type="dxa"/>
-          </w:tcPr>
-          <w:p>
-            <w:pPr>
-              <w:spacing w:line="240" w:lineRule="auto"/>
-            </w:pPr>
-            <w:r>
-              <w:rPr>
-                <w:sz w:val="22"/>
-              </w:rPr>
-              <w:t>Operativo</w:t>
-            </w:r>
-          </w:p>
-        </w:tc>
-      </w:tr>
-      <w:tr>
-        <w:trPr>
-          <w:jc w:val="center"/>
-        </w:trPr>
-        <w:tc>
-          <w:tcPr>
-            <w:tcW w:w="2736" w:type="dxa"/>
-          </w:tcPr>
-          <w:p>
-            <w:pPr>
-              <w:spacing w:line="240" w:lineRule="auto"/>
-            </w:pPr>
-            <w:r>
-              <w:rPr>
-                <w:b/>
-                <w:sz w:val="22"/>
-              </w:rPr>
-              <w:t>Misión del puesto</w:t>
-            </w:r>
-          </w:p>
-        </w:tc>
-        <w:tc>
-          <w:tcPr>
-            <w:tcW w:w="6624" w:type="dxa"/>
-          </w:tcPr>
-          <w:p>
-            <w:pPr>
-              <w:spacing w:line="240" w:lineRule="auto"/>
-              <w:rPr>
-                <w:lang w:val="es-SV"/>
-              </w:rPr>
-            </w:pPr>
-            <w:r>
-              <w:rPr>
-                <w:sz w:val="22"/>
-                <w:lang w:val="es-SV"/>
-              </w:rPr>
-              <w:t>Brindar atención, orientación y soporte técnico a los usuarios y clientes de la sociedad, garantizando una experiencia satisfactoria de servicio.</w:t>
-            </w:r>
-          </w:p>
-        </w:tc>
-      </w:tr>
-      <w:tr>
-        <w:trPr>
-          <w:jc w:val="center"/>
-        </w:trPr>
-        <w:tc>
-          <w:tcPr>
-            <w:tcW w:w="2736" w:type="dxa"/>
-          </w:tcPr>
-          <w:p>
-            <w:pPr>
-              <w:spacing w:line="240" w:lineRule="auto"/>
-            </w:pPr>
-            <w:r>
-              <w:rPr>
-                <w:b/>
-                <w:sz w:val="22"/>
-              </w:rPr>
-              <w:t xml:space="preserve">Formación </w:t>
-            </w:r>
-            <w:proofErr w:type="spellStart"/>
-            <w:r>
-              <w:rPr>
-                <w:b/>
-                <w:sz w:val="22"/>
-              </w:rPr>
-              <w:t>académica</w:t>
-            </w:r>
-            <w:proofErr w:type="spellEnd"/>
-          </w:p>
-        </w:tc>
-        <w:tc>
-          <w:tcPr>
-            <w:tcW w:w="6624" w:type="dxa"/>
-          </w:tcPr>
-          <w:p>
-            <w:pPr>
-              <w:spacing w:line="240" w:lineRule="auto"/>
-              <w:rPr>
-                <w:lang w:val="es-SV"/>
-              </w:rPr>
-            </w:pPr>
-            <w:r>
-              <w:rPr>
-                <w:sz w:val="22"/>
-                <w:lang w:val="es-SV"/>
-              </w:rPr>
-              <w:t>Bachillerato o técnico; conocimiento de plataformas de videojuegos.</w:t>
-            </w:r>
-          </w:p>
-        </w:tc>
-      </w:tr>
-      <w:tr>
-        <w:trPr>
-          <w:jc w:val="center"/>
-        </w:trPr>
-        <w:tc>
-          <w:tcPr>
-            <w:tcW w:w="2736" w:type="dxa"/>
-          </w:tcPr>
-          <w:p>
-            <w:pPr>
-              <w:spacing w:line="240" w:lineRule="auto"/>
-            </w:pPr>
-            <w:proofErr w:type="spellStart"/>
-            <w:r>
-              <w:rPr>
-                <w:b/>
-                <w:sz w:val="22"/>
-              </w:rPr>
-              <w:t>Experiencia</w:t>
-            </w:r>
-            <w:proofErr w:type="spellEnd"/>
-          </w:p>
-        </w:tc>
-        <w:tc>
-          <w:tcPr>
-            <w:tcW w:w="6624" w:type="dxa"/>
-          </w:tcPr>
-          <w:p>
-            <w:pPr>
-              <w:spacing w:line="240" w:lineRule="auto"/>
-              <w:rPr>
-                <w:lang w:val="es-SV"/>
-              </w:rPr>
-            </w:pPr>
-            <w:r>
-              <w:rPr>
-                <w:sz w:val="22"/>
-                <w:lang w:val="es-SV"/>
-              </w:rPr>
-              <w:t>Mínimo un año en atención al cliente o soporte técnico.</w:t>
-            </w:r>
-          </w:p>
-        </w:tc>
-      </w:tr>
-      <w:tr>
-        <w:trPr>
-          <w:jc w:val="center"/>
-        </w:trPr>
-        <w:tc>
-          <w:tcPr>
-            <w:tcW w:w="2736" w:type="dxa"/>
-          </w:tcPr>
-          <w:p>
-            <w:pPr>
-              <w:spacing w:line="240" w:lineRule="auto"/>
-            </w:pPr>
-            <w:proofErr w:type="spellStart"/>
-            <w:r>
-              <w:rPr>
-                <w:b/>
-                <w:sz w:val="22"/>
-              </w:rPr>
-              <w:t>Conocimientos</w:t>
-            </w:r>
-            <w:proofErr w:type="spellEnd"/>
-            <w:r>
-              <w:rPr>
-                <w:b/>
-                <w:sz w:val="22"/>
-              </w:rPr>
-              <w:t xml:space="preserve"> </w:t>
-            </w:r>
-            <w:proofErr w:type="spellStart"/>
-            <w:r>
-              <w:rPr>
-                <w:b/>
-                <w:sz w:val="22"/>
-              </w:rPr>
-              <w:t>técnicos</w:t>
-            </w:r>
-            <w:proofErr w:type="spellEnd"/>
-          </w:p>
-        </w:tc>
-        <w:tc>
-          <w:tcPr>
-            <w:tcW w:w="6624" w:type="dxa"/>
-          </w:tcPr>
-          <w:p>
-            <w:pPr>
-              <w:spacing w:line="240" w:lineRule="auto"/>
-              <w:rPr>
-                <w:lang w:val="es-SV"/>
-              </w:rPr>
-            </w:pPr>
-            <w:r>
-              <w:rPr>
-                <w:sz w:val="22"/>
-                <w:lang w:val="es-SV"/>
-              </w:rPr>
-              <w:t xml:space="preserve">Soporte de plataformas digitales, herramientas de gestión de </w:t>
-            </w:r>
-            <w:proofErr w:type="gramStart"/>
-            <w:r>
-              <w:rPr>
-                <w:sz w:val="22"/>
-                <w:lang w:val="es-SV"/>
-              </w:rPr>
-              <w:t>tickets</w:t>
-            </w:r>
-            <w:proofErr w:type="gramEnd"/>
-            <w:r>
-              <w:rPr>
-                <w:sz w:val="22"/>
-                <w:lang w:val="es-SV"/>
-              </w:rPr>
-              <w:t xml:space="preserve"> y técnicas de atención al cliente.</w:t>
-            </w:r>
-          </w:p>
-        </w:tc>
-      </w:tr>
-      <w:tr>
-        <w:trPr>
-          <w:jc w:val="center"/>
-        </w:trPr>
-        <w:tc>
-          <w:tcPr>
-            <w:tcW w:w="2736" w:type="dxa"/>
-          </w:tcPr>
-          <w:p>
-            <w:pPr>
-              <w:spacing w:line="240" w:lineRule="auto"/>
-            </w:pPr>
-            <w:proofErr w:type="spellStart"/>
-            <w:r>
-              <w:rPr>
-                <w:b/>
-                <w:sz w:val="22"/>
-              </w:rPr>
-              <w:t>Competencias</w:t>
-            </w:r>
-            <w:proofErr w:type="spellEnd"/>
-          </w:p>
-        </w:tc>
-        <w:tc>
-          <w:tcPr>
-            <w:tcW w:w="6624" w:type="dxa"/>
-          </w:tcPr>
-          <w:p>
-            <w:pPr>
-              <w:spacing w:line="240" w:lineRule="auto"/>
-              <w:rPr>
-                <w:lang w:val="es-SV"/>
-              </w:rPr>
-            </w:pPr>
-            <w:r>
-              <w:rPr>
-                <w:sz w:val="22"/>
-                <w:lang w:val="es-SV"/>
-              </w:rPr>
-              <w:t>Servicio al cliente, paciencia, comunicación efectiva y resolución de problemas.</w:t>
-            </w:r>
-          </w:p>
-        </w:tc>
-      </w:tr>
-      <w:tr>
-        <w:trPr>
-          <w:jc w:val="center"/>
-        </w:trPr>
-        <w:tc>
-          <w:tcPr>
-            <w:tcW w:w="2736" w:type="dxa"/>
-          </w:tcPr>
-          <w:p>
-            <w:pPr>
-              <w:spacing w:line="240" w:lineRule="auto"/>
-            </w:pPr>
-            <w:proofErr w:type="spellStart"/>
-            <w:r>
-              <w:rPr>
-                <w:b/>
-                <w:sz w:val="22"/>
-              </w:rPr>
-              <w:t>Condiciones</w:t>
-            </w:r>
-            <w:proofErr w:type="spellEnd"/>
-            <w:r>
-              <w:rPr>
-                <w:b/>
-                <w:sz w:val="22"/>
-              </w:rPr>
-              <w:t xml:space="preserve"> </w:t>
-            </w:r>
-            <w:proofErr w:type="spellStart"/>
-            <w:r>
-              <w:rPr>
-                <w:b/>
-                <w:sz w:val="22"/>
-              </w:rPr>
-              <w:t>laborales</w:t>
-            </w:r>
-            <w:proofErr w:type="spellEnd"/>
-          </w:p>
-        </w:tc>
-        <w:tc>
-          <w:tcPr>
-            <w:tcW w:w="6624" w:type="dxa"/>
-          </w:tcPr>
-          <w:p>
-            <w:pPr>
-              <w:spacing w:line="240" w:lineRule="auto"/>
-              <w:rPr>
-                <w:lang w:val="es-SV"/>
-              </w:rPr>
-            </w:pPr>
-            <w:r>
-              <w:rPr>
-                <w:sz w:val="22"/>
-                <w:lang w:val="es-SV"/>
-              </w:rPr>
-              <w:t>Contrato a tiempo completo; horarios de atención definidos.</w:t>
-            </w:r>
-          </w:p>
-        </w:tc>
-      </w:tr>
-    </w:tbl>
-    <w:p>
-      <w:pPr>
-        <w:ind w:firstLine="720"/>
-      </w:pPr>
-      <w:proofErr w:type="spellStart"/>
-      <w:r>
-        <w:rPr>
-          <w:b/>
-        </w:rPr>
-        <w:t>Funciones</w:t>
-      </w:r>
-      <w:proofErr w:type="spellEnd"/>
-      <w:r>
-        <w:rPr>
-          <w:b/>
-        </w:rPr>
-        <w:t xml:space="preserve"> </w:t>
-      </w:r>
-      <w:proofErr w:type="spellStart"/>
-      <w:r>
-        <w:rPr>
-          <w:b/>
-        </w:rPr>
-        <w:t>esenciales</w:t>
-      </w:r>
-      <w:proofErr w:type="spellEnd"/>
-      <w:r>
-        <w:rPr>
-          <w:b/>
-        </w:rPr>
-        <w:t xml:space="preserve">. </w:t>
-      </w:r>
-    </w:p>
-    <w:p>
-      <w:pPr>
-        <w:pStyle w:val="Listaconvietas"/>
-        <w:rPr>
-          <w:lang w:val="es-SV"/>
-        </w:rPr>
-      </w:pPr>
-      <w:r>
-        <w:rPr>
-          <w:lang w:val="es-SV"/>
-        </w:rPr>
-        <w:t>Atender consultas, solicitudes y reclamos de usuarios por los canales establecidos.</w:t>
-      </w:r>
-    </w:p>
-    <w:p>
-      <w:pPr>
-        <w:pStyle w:val="Listaconvietas"/>
-        <w:rPr>
-          <w:lang w:val="es-SV"/>
-        </w:rPr>
-      </w:pPr>
-      <w:r>
-        <w:rPr>
-          <w:lang w:val="es-SV"/>
-        </w:rPr>
-        <w:t>Resolver las incidencias técnicas de primer nivel y escalar las de mayor complejidad.</w:t>
-      </w:r>
-    </w:p>
-    <w:p>
-      <w:pPr>
-        <w:pStyle w:val="Listaconvietas"/>
-        <w:rPr>
-          <w:lang w:val="es-SV"/>
-        </w:rPr>
-      </w:pPr>
-      <w:r>
-        <w:rPr>
-          <w:lang w:val="es-SV"/>
-        </w:rPr>
-        <w:t>Mantener actualizada la base de conocimiento (preguntas frecuentes y guías).</w:t>
-      </w:r>
-    </w:p>
-    <w:p>
-      <w:pPr>
-        <w:pStyle w:val="Listaconvietas"/>
-        <w:rPr>
-          <w:lang w:val="es-SV"/>
-        </w:rPr>
-      </w:pPr>
-      <w:r>
-        <w:rPr>
-          <w:lang w:val="es-SV"/>
-        </w:rPr>
-        <w:t>Registrar y dar seguimiento a los niveles de servicio (SLA) de atención.</w:t>
-      </w:r>
-    </w:p>
-    <w:p>
-      <w:pPr>
-        <w:pStyle w:val="Listaconvietas"/>
-        <w:rPr>
-          <w:lang w:val="es-SV"/>
-        </w:rPr>
-      </w:pPr>
-      <w:r>
-        <w:rPr>
-          <w:lang w:val="es-SV"/>
-        </w:rPr>
-        <w:t>Canalizar a las áreas correspondientes los reportes de errores o mejoras de productos.</w:t>
-      </w:r>
-    </w:p>
-    <w:p>
-      <w:pPr>
-        <w:ind w:firstLine="720"/>
-        <w:rPr>
-          <w:lang w:val="es-SV"/>
-        </w:rPr>
-      </w:pPr>
-      <w:r>
-        <w:rPr>
-          <w:b/>
-          <w:lang w:val="es-SV"/>
-        </w:rPr>
-        <w:lastRenderedPageBreak/>
-        <w:t xml:space="preserve">Relaciones del puesto. </w:t>
-      </w:r>
-      <w:r>
-        <w:rPr>
-          <w:lang w:val="es-SV"/>
-        </w:rPr>
-        <w:t>Internas: QA y desarrollo, Comercial. Externas: usuarios finales y proveedores de plataformas.</w:t>
-      </w:r>
-    </w:p>
-    <w:p>
-      <w:pPr>
-        <w:pStyle w:val="Ttulo2"/>
-        <w:rPr>
-          <w:lang w:val="es-SV"/>
-        </w:rPr>
-      </w:pPr>
-      <w:bookmarkStart w:id="21" w:name="_Toc241086784"/>
-      <w:r>
-        <w:rPr>
-          <w:lang w:val="es-SV"/>
-        </w:rPr>
-        <w:t>Asistente Administrativo / Recepción (P-011)</w:t>
-      </w:r>
-      <w:bookmarkEnd w:id="21"/>
-    </w:p>
-    <w:p>
-      <w:pPr>
-        <w:keepNext/>
-        <w:rPr>
-          <w:lang w:val="es-SV"/>
-        </w:rPr>
-      </w:pPr>
-      <w:r>
-        <w:rPr>
-          <w:b/>
-          <w:lang w:val="es-SV"/>
-        </w:rPr>
-        <w:t>Tabla 15</w:t>
-      </w:r>
-    </w:p>
-    <w:p>
-      <w:pPr>
-        <w:keepNext/>
-      </w:pPr>
-      <w:r>
-        <w:rPr>
-          <w:i/>
-        </w:rPr>
-        <w:t xml:space="preserve">Descripción del </w:t>
-      </w:r>
-      <w:proofErr w:type="spellStart"/>
-      <w:r>
-        <w:rPr>
-          <w:i/>
-        </w:rPr>
-        <w:t>puesto</w:t>
-      </w:r>
-      <w:proofErr w:type="spellEnd"/>
-      <w:r>
-        <w:rPr>
-          <w:i/>
-        </w:rPr>
-        <w:t xml:space="preserve"> P-011</w:t>
-      </w:r>
-    </w:p>
-    <w:tbl>
-      <w:tblPr>
-        <w:tblW w:w="0" w:type="auto"/>
-        <w:jc w:val="center"/>
-        <w:tblBorders>
-          <w:top w:val="single" w:sz="8" w:space="0" w:color="000000"/>
-          <w:bottom w:val="single" w:sz="8" w:space="0" w:color="000000"/>
-        </w:tblBorders>
-        <w:tblLayout w:type="fixed"/>
-        <w:tblLook w:val="04A0" w:firstRow="1" w:lastRow="0" w:firstColumn="1" w:lastColumn="0" w:noHBand="0" w:noVBand="1"/>
-      </w:tblPr>
-      <w:tblGrid>
-        <w:gridCol w:w="2736"/>
-        <w:gridCol w:w="6624"/>
-      </w:tblGrid>
-      <w:tr>
-        <w:trPr>
-          <w:jc w:val="center"/>
-        </w:trPr>
-        <w:tc>
-          <w:tcPr>
-            <w:tcW w:w="2736" w:type="dxa"/>
-            <w:tcBorders>
-              <w:bottom w:val="single" w:sz="8" w:space="0" w:color="000000"/>
-            </w:tcBorders>
-          </w:tcPr>
-          <w:p>
-            <w:pPr>
-              <w:spacing w:line="240" w:lineRule="auto"/>
-              <w:jc w:val="center"/>
-            </w:pPr>
-            <w:r>
-              <w:rPr>
-                <w:b/>
-                <w:sz w:val="22"/>
-              </w:rPr>
-              <w:t>Campo</w:t>
-            </w:r>
-          </w:p>
-        </w:tc>
-        <w:tc>
-          <w:tcPr>
-            <w:tcW w:w="6624" w:type="dxa"/>
-            <w:tcBorders>
-              <w:bottom w:val="single" w:sz="8" w:space="0" w:color="000000"/>
-            </w:tcBorders>
-          </w:tcPr>
-          <w:p>
-            <w:pPr>
-              <w:spacing w:line="240" w:lineRule="auto"/>
-              <w:jc w:val="center"/>
-            </w:pPr>
-            <w:r>
-              <w:rPr>
-                <w:b/>
-                <w:sz w:val="22"/>
-              </w:rPr>
-              <w:t>Descripción</w:t>
-            </w:r>
-          </w:p>
-        </w:tc>
-      </w:tr>
-      <w:tr>
-        <w:trPr>
-          <w:jc w:val="center"/>
-        </w:trPr>
-        <w:tc>
-          <w:tcPr>
-            <w:tcW w:w="2736" w:type="dxa"/>
-          </w:tcPr>
-          <w:p>
-            <w:pPr>
-              <w:spacing w:line="240" w:lineRule="auto"/>
-            </w:pPr>
-            <w:r>
-              <w:rPr>
-                <w:b/>
-                <w:sz w:val="22"/>
-              </w:rPr>
-              <w:t>Denominación del puesto</w:t>
-            </w:r>
-          </w:p>
-        </w:tc>
-        <w:tc>
-          <w:tcPr>
-            <w:tcW w:w="6624" w:type="dxa"/>
-          </w:tcPr>
-          <w:p>
-            <w:pPr>
-              <w:spacing w:line="240" w:lineRule="auto"/>
-            </w:pPr>
-            <w:r>
-              <w:rPr>
-                <w:sz w:val="22"/>
-              </w:rPr>
-              <w:t>Asistente Administrativo / Recepción</w:t>
-            </w:r>
-          </w:p>
-        </w:tc>
-      </w:tr>
-      <w:tr>
-        <w:trPr>
-          <w:jc w:val="center"/>
-        </w:trPr>
-        <w:tc>
-          <w:tcPr>
-            <w:tcW w:w="2736" w:type="dxa"/>
-          </w:tcPr>
-          <w:p>
-            <w:pPr>
-              <w:spacing w:line="240" w:lineRule="auto"/>
-            </w:pPr>
-            <w:r>
-              <w:rPr>
-                <w:b/>
-                <w:sz w:val="22"/>
-              </w:rPr>
-              <w:t>Unidad organizativa</w:t>
-            </w:r>
-          </w:p>
-        </w:tc>
-        <w:tc>
-          <w:tcPr>
-            <w:tcW w:w="6624" w:type="dxa"/>
-          </w:tcPr>
-          <w:p>
-            <w:pPr>
-              <w:spacing w:line="240" w:lineRule="auto"/>
-            </w:pPr>
-            <w:r>
-              <w:rPr>
-                <w:sz w:val="22"/>
-              </w:rPr>
-              <w:t>Gerencia General (apoyo)</w:t>
-            </w:r>
-          </w:p>
-        </w:tc>
-      </w:tr>
-      <w:tr>
-        <w:trPr>
-          <w:jc w:val="center"/>
-        </w:trPr>
-        <w:tc>
-          <w:tcPr>
-            <w:tcW w:w="2736" w:type="dxa"/>
-          </w:tcPr>
-          <w:p>
-            <w:pPr>
-              <w:spacing w:line="240" w:lineRule="auto"/>
-            </w:pPr>
-            <w:r>
-              <w:rPr>
-                <w:b/>
-                <w:sz w:val="22"/>
-              </w:rPr>
-              <w:t>Reporta a</w:t>
-            </w:r>
-          </w:p>
-        </w:tc>
-        <w:tc>
-          <w:tcPr>
-            <w:tcW w:w="6624" w:type="dxa"/>
-          </w:tcPr>
-          <w:p>
-            <w:pPr>
-              <w:spacing w:line="240" w:lineRule="auto"/>
-            </w:pPr>
-            <w:r>
-              <w:rPr>
-                <w:sz w:val="22"/>
-              </w:rPr>
-              <w:t>Gerente General</w:t>
-            </w:r>
-          </w:p>
-        </w:tc>
-      </w:tr>
-      <w:tr>
-        <w:trPr>
-          <w:jc w:val="center"/>
-        </w:trPr>
-        <w:tc>
-          <w:tcPr>
-            <w:tcW w:w="2736" w:type="dxa"/>
-          </w:tcPr>
-          <w:p>
-            <w:pPr>
-              <w:spacing w:line="240" w:lineRule="auto"/>
-            </w:pPr>
-            <w:r>
-              <w:rPr>
-                <w:b/>
-                <w:sz w:val="22"/>
-              </w:rPr>
-              <w:t>Supervisa a</w:t>
-            </w:r>
-          </w:p>
-        </w:tc>
-        <w:tc>
-          <w:tcPr>
-            <w:tcW w:w="6624" w:type="dxa"/>
-          </w:tcPr>
-          <w:p>
-            <w:pPr>
-              <w:spacing w:line="240" w:lineRule="auto"/>
-            </w:pPr>
-            <w:r>
-              <w:rPr>
-                <w:sz w:val="22"/>
-              </w:rPr>
-              <w:t>No supervisa personal</w:t>
-            </w:r>
-          </w:p>
-        </w:tc>
-      </w:tr>
-      <w:tr>
-        <w:trPr>
-          <w:jc w:val="center"/>
-        </w:trPr>
-        <w:tc>
-          <w:tcPr>
-            <w:tcW w:w="2736" w:type="dxa"/>
-          </w:tcPr>
-          <w:p>
-            <w:pPr>
-              <w:spacing w:line="240" w:lineRule="auto"/>
-            </w:pPr>
-            <w:r>
-              <w:rPr>
-                <w:b/>
-                <w:sz w:val="22"/>
-              </w:rPr>
-              <w:t>Nivel jerárquico</w:t>
-            </w:r>
-          </w:p>
-        </w:tc>
-        <w:tc>
-          <w:tcPr>
-            <w:tcW w:w="6624" w:type="dxa"/>
-          </w:tcPr>
-          <w:p>
-            <w:pPr>
-              <w:spacing w:line="240" w:lineRule="auto"/>
-            </w:pPr>
-            <w:r>
-              <w:rPr>
-                <w:sz w:val="22"/>
-              </w:rPr>
-              <w:t>Administrativo de apoyo</w:t>
-            </w:r>
-          </w:p>
-        </w:tc>
-      </w:tr>
-      <w:tr>
-        <w:trPr>
-          <w:jc w:val="center"/>
-        </w:trPr>
-        <w:tc>
-          <w:tcPr>
-            <w:tcW w:w="2736" w:type="dxa"/>
-          </w:tcPr>
-          <w:p>
-            <w:pPr>
-              <w:spacing w:line="240" w:lineRule="auto"/>
-            </w:pPr>
-            <w:r>
-              <w:rPr>
-                <w:b/>
-                <w:sz w:val="22"/>
-              </w:rPr>
-              <w:t>Misión del puesto</w:t>
-            </w:r>
-          </w:p>
-        </w:tc>
-        <w:tc>
-          <w:tcPr>
-            <w:tcW w:w="6624" w:type="dxa"/>
-          </w:tcPr>
-          <w:p>
-            <w:pPr>
-              <w:spacing w:line="240" w:lineRule="auto"/>
-              <w:rPr>
-                <w:lang w:val="es-SV"/>
-              </w:rPr>
-            </w:pPr>
-            <w:r>
-              <w:rPr>
-                <w:sz w:val="22"/>
-                <w:lang w:val="es-SV"/>
-              </w:rPr>
-              <w:t>Proporcionar apoyo administrativo, documental y de recepción a la Gerencia General y a las unidades de la sociedad.</w:t>
-            </w:r>
-          </w:p>
-        </w:tc>
-      </w:tr>
-      <w:tr>
-        <w:trPr>
-          <w:jc w:val="center"/>
-        </w:trPr>
-        <w:tc>
-          <w:tcPr>
-            <w:tcW w:w="2736" w:type="dxa"/>
-          </w:tcPr>
-          <w:p>
-            <w:pPr>
-              <w:spacing w:line="240" w:lineRule="auto"/>
-            </w:pPr>
-            <w:r>
-              <w:rPr>
-                <w:b/>
-                <w:sz w:val="22"/>
-              </w:rPr>
-              <w:t xml:space="preserve">Formación </w:t>
-            </w:r>
-            <w:proofErr w:type="spellStart"/>
-            <w:r>
-              <w:rPr>
-                <w:b/>
-                <w:sz w:val="22"/>
-              </w:rPr>
-              <w:t>académica</w:t>
-            </w:r>
-            <w:proofErr w:type="spellEnd"/>
-          </w:p>
-        </w:tc>
-        <w:tc>
-          <w:tcPr>
-            <w:tcW w:w="6624" w:type="dxa"/>
-          </w:tcPr>
-          <w:p>
-            <w:pPr>
-              <w:spacing w:line="240" w:lineRule="auto"/>
-              <w:rPr>
-                <w:lang w:val="es-SV"/>
-              </w:rPr>
-            </w:pPr>
-            <w:r>
-              <w:rPr>
-                <w:sz w:val="22"/>
-                <w:lang w:val="es-SV"/>
-              </w:rPr>
-              <w:t>Bachillerato o técnico administrativo; cursos de secretariado ejecutivo (deseable).</w:t>
-            </w:r>
-          </w:p>
-        </w:tc>
-      </w:tr>
-      <w:tr>
-        <w:trPr>
-          <w:jc w:val="center"/>
-        </w:trPr>
-        <w:tc>
-          <w:tcPr>
-            <w:tcW w:w="2736" w:type="dxa"/>
-          </w:tcPr>
-          <w:p>
-            <w:pPr>
-              <w:spacing w:line="240" w:lineRule="auto"/>
-            </w:pPr>
-            <w:proofErr w:type="spellStart"/>
-            <w:r>
-              <w:rPr>
-                <w:b/>
-                <w:sz w:val="22"/>
-              </w:rPr>
-              <w:t>Experiencia</w:t>
-            </w:r>
-            <w:proofErr w:type="spellEnd"/>
-          </w:p>
-        </w:tc>
-        <w:tc>
-          <w:tcPr>
-            <w:tcW w:w="6624" w:type="dxa"/>
-          </w:tcPr>
-          <w:p>
-            <w:pPr>
-              <w:spacing w:line="240" w:lineRule="auto"/>
-              <w:rPr>
-                <w:lang w:val="es-SV"/>
-              </w:rPr>
-            </w:pPr>
-            <w:r>
-              <w:rPr>
-                <w:sz w:val="22"/>
-                <w:lang w:val="es-SV"/>
-              </w:rPr>
-              <w:t>Uno a dos años en labores administrativas.</w:t>
-            </w:r>
-          </w:p>
-        </w:tc>
-      </w:tr>
-      <w:tr>
-        <w:trPr>
-          <w:jc w:val="center"/>
-        </w:trPr>
-        <w:tc>
-          <w:tcPr>
-            <w:tcW w:w="2736" w:type="dxa"/>
-          </w:tcPr>
-          <w:p>
-            <w:pPr>
-              <w:spacing w:line="240" w:lineRule="auto"/>
-            </w:pPr>
-            <w:proofErr w:type="spellStart"/>
-            <w:r>
-              <w:rPr>
-                <w:b/>
-                <w:sz w:val="22"/>
-              </w:rPr>
-              <w:t>Conocimientos</w:t>
-            </w:r>
-            <w:proofErr w:type="spellEnd"/>
-            <w:r>
-              <w:rPr>
-                <w:b/>
-                <w:sz w:val="22"/>
-              </w:rPr>
-              <w:t xml:space="preserve"> </w:t>
-            </w:r>
-            <w:proofErr w:type="spellStart"/>
-            <w:r>
-              <w:rPr>
-                <w:b/>
-                <w:sz w:val="22"/>
-              </w:rPr>
-              <w:t>técnicos</w:t>
-            </w:r>
-            <w:proofErr w:type="spellEnd"/>
-          </w:p>
-        </w:tc>
-        <w:tc>
-          <w:tcPr>
-            <w:tcW w:w="6624" w:type="dxa"/>
-          </w:tcPr>
-          <w:p>
-            <w:pPr>
-              <w:spacing w:line="240" w:lineRule="auto"/>
-              <w:rPr>
-                <w:lang w:val="es-SV"/>
-              </w:rPr>
-            </w:pPr>
-            <w:r>
-              <w:rPr>
-                <w:sz w:val="22"/>
-                <w:lang w:val="es-SV"/>
-              </w:rPr>
-              <w:t>Herramientas de oficina, redacción y archivo, y herramientas de organización.</w:t>
-            </w:r>
-          </w:p>
-        </w:tc>
-      </w:tr>
-      <w:tr>
-        <w:trPr>
-          <w:jc w:val="center"/>
-        </w:trPr>
-        <w:tc>
-          <w:tcPr>
-            <w:tcW w:w="2736" w:type="dxa"/>
-          </w:tcPr>
-          <w:p>
-            <w:pPr>
-              <w:spacing w:line="240" w:lineRule="auto"/>
-            </w:pPr>
-            <w:proofErr w:type="spellStart"/>
-            <w:r>
-              <w:rPr>
-                <w:b/>
-                <w:sz w:val="22"/>
-              </w:rPr>
-              <w:t>Competencias</w:t>
-            </w:r>
-            <w:proofErr w:type="spellEnd"/>
-          </w:p>
-        </w:tc>
-        <w:tc>
-          <w:tcPr>
-            <w:tcW w:w="6624" w:type="dxa"/>
-          </w:tcPr>
-          <w:p>
-            <w:pPr>
-              <w:spacing w:line="240" w:lineRule="auto"/>
-              <w:rPr>
-                <w:lang w:val="es-SV"/>
-              </w:rPr>
-            </w:pPr>
-            <w:r>
-              <w:rPr>
-                <w:sz w:val="22"/>
-                <w:lang w:val="es-SV"/>
-              </w:rPr>
-              <w:t>Organización, discreción, cordialidad y proactividad.</w:t>
-            </w:r>
-          </w:p>
-        </w:tc>
-      </w:tr>
-      <w:tr>
-        <w:trPr>
-          <w:jc w:val="center"/>
-        </w:trPr>
-        <w:tc>
-          <w:tcPr>
-            <w:tcW w:w="2736" w:type="dxa"/>
-          </w:tcPr>
-          <w:p>
-            <w:pPr>
-              <w:spacing w:line="240" w:lineRule="auto"/>
-            </w:pPr>
-            <w:proofErr w:type="spellStart"/>
-            <w:r>
-              <w:rPr>
-                <w:b/>
-                <w:sz w:val="22"/>
-              </w:rPr>
-              <w:t>Condiciones</w:t>
-            </w:r>
-            <w:proofErr w:type="spellEnd"/>
-            <w:r>
-              <w:rPr>
-                <w:b/>
-                <w:sz w:val="22"/>
-              </w:rPr>
-              <w:t xml:space="preserve"> </w:t>
-            </w:r>
-            <w:proofErr w:type="spellStart"/>
-            <w:r>
-              <w:rPr>
-                <w:b/>
-                <w:sz w:val="22"/>
-              </w:rPr>
-              <w:t>laborales</w:t>
-            </w:r>
-            <w:proofErr w:type="spellEnd"/>
-          </w:p>
-        </w:tc>
-        <w:tc>
-          <w:tcPr>
-            <w:tcW w:w="6624" w:type="dxa"/>
-          </w:tcPr>
-          <w:p>
-            <w:pPr>
-              <w:spacing w:line="240" w:lineRule="auto"/>
-            </w:pPr>
-            <w:r>
-              <w:rPr>
-                <w:sz w:val="22"/>
-              </w:rPr>
-              <w:t>Contrato a tiempo completo.</w:t>
-            </w:r>
-          </w:p>
-        </w:tc>
-      </w:tr>
-    </w:tbl>
-    <w:p>
-      <w:pPr>
-        <w:ind w:firstLine="720"/>
-      </w:pPr>
-      <w:r>
-        <w:rPr>
-          <w:b/>
-        </w:rPr>
-        <w:t xml:space="preserve">Funciones esenciales. </w:t>
-      </w:r>
-    </w:p>
-    <w:p>
-      <w:pPr>
-        <w:pStyle w:val="Listaconvietas"/>
-        <w:rPr>
-          <w:lang w:val="es-SV"/>
-        </w:rPr>
-      </w:pPr>
-      <w:r>
-        <w:rPr>
-          <w:lang w:val="es-SV"/>
-        </w:rPr>
-        <w:t>Administrar la agenda, la correspondencia y las comunicaciones de la Gerencia General.</w:t>
-      </w:r>
-    </w:p>
-    <w:p>
-      <w:pPr>
-        <w:pStyle w:val="Listaconvietas"/>
-        <w:rPr>
-          <w:lang w:val="es-SV"/>
-        </w:rPr>
-      </w:pPr>
-      <w:r>
-        <w:rPr>
-          <w:lang w:val="es-SV"/>
-        </w:rPr>
-        <w:t>Organizar el archivo físico y digital de documentos y expedientes.</w:t>
-      </w:r>
-    </w:p>
-    <w:p>
-      <w:pPr>
-        <w:pStyle w:val="Listaconvietas"/>
-        <w:rPr>
-          <w:lang w:val="es-SV"/>
-        </w:rPr>
-      </w:pPr>
-      <w:r>
-        <w:rPr>
-          <w:lang w:val="es-SV"/>
-        </w:rPr>
-        <w:t>Coordinar reuniones y apoyar en la preparación de informes y presentaciones.</w:t>
-      </w:r>
-    </w:p>
-    <w:p>
-      <w:pPr>
-        <w:pStyle w:val="Listaconvietas"/>
-        <w:rPr>
-          <w:lang w:val="es-SV"/>
-        </w:rPr>
-      </w:pPr>
-      <w:r>
-        <w:rPr>
-          <w:lang w:val="es-SV"/>
-        </w:rPr>
-        <w:t>Recibir y canalizar a las visitas y llamadas de los clientes y proveedores.</w:t>
-      </w:r>
-    </w:p>
-    <w:p>
-      <w:pPr>
-        <w:pStyle w:val="Listaconvietas"/>
-        <w:rPr>
-          <w:lang w:val="es-SV"/>
-        </w:rPr>
-      </w:pPr>
-      <w:r>
-        <w:rPr>
-          <w:lang w:val="es-SV"/>
-        </w:rPr>
-        <w:t>Apoyar la administración de suministros de oficina y servicios generales.</w:t>
-      </w:r>
-    </w:p>
-    <w:p>
-      <w:pPr>
-        <w:ind w:firstLine="720"/>
-        <w:rPr>
-          <w:lang w:val="es-SV"/>
-        </w:rPr>
-      </w:pPr>
-      <w:r>
-        <w:rPr>
-          <w:b/>
-          <w:lang w:val="es-SV"/>
-        </w:rPr>
-        <w:t xml:space="preserve">Relaciones del puesto. </w:t>
-      </w:r>
-      <w:r>
-        <w:rPr>
-          <w:lang w:val="es-SV"/>
-        </w:rPr>
-        <w:t>Internas: todas las unidades. Externas: visitantes, proveedores y mensajería.</w:t>
+        <w:rPr>
+          <w:lang w:val="es-SV"/>
+        </w:rPr>
+      </w:pPr>
+      <w:r>
+        <w:rPr>
+          <w:b w:val="0"/>
+          <w:lang w:val="es-SV"/>
+        </w:rPr>
+        <w:t>Los despachos y las atenciones al usuario deben generar el soporte correspondiente para el registro contable y el control de inventarios en el sistema.</w:t>
       </w:r>
     </w:p>
     <w:p>
@@ -15883,7 +13159,7 @@
               <w:rPr>
                 <w:sz w:val="20"/>
               </w:rPr>
-              <w:t>15/09/2026</w:t>
+              <w:t>23/09/2026</w:t>
             </w:r>
           </w:p>
         </w:tc>
@@ -15900,6 +13176,107 @@
                 <w:sz w:val="20"/>
               </w:rPr>
               <w:t>Emisión inicial del manual.</w:t>
+            </w:r>
+          </w:p>
+        </w:tc>
+        <w:tc>
+          <w:tcPr>
+            <w:tcW w:w="1728" w:type="dxa"/>
+          </w:tcPr>
+          <w:p>
+            <w:pPr>
+              <w:spacing w:line="240" w:lineRule="auto"/>
+            </w:pPr>
+            <w:r>
+              <w:rPr>
+                <w:sz w:val="20"/>
+              </w:rPr>
+              <w:t>Departamento de talento humano</w:t>
+            </w:r>
+          </w:p>
+        </w:tc>
+        <w:tc>
+          <w:tcPr>
+            <w:tcW w:w="1584" w:type="dxa"/>
+          </w:tcPr>
+          <w:p>
+            <w:pPr>
+              <w:spacing w:line="240" w:lineRule="auto"/>
+            </w:pPr>
+            <w:r>
+              <w:rPr>
+                <w:sz w:val="20"/>
+              </w:rPr>
+              <w:t>Gerencia general</w:t>
+            </w:r>
+          </w:p>
+        </w:tc>
+        <w:tc>
+          <w:tcPr>
+            <w:tcW w:w="1872" w:type="dxa"/>
+          </w:tcPr>
+          <w:p>
+            <w:pPr>
+              <w:spacing w:line="240" w:lineRule="auto"/>
+            </w:pPr>
+            <w:r>
+              <w:rPr>
+                <w:sz w:val="20"/>
+              </w:rPr>
+              <w:t>Junta directiva</w:t>
+            </w:r>
+          </w:p>
+        </w:tc>
+      </w:tr>
+      <w:tr>
+        <w:trPr>
+          <w:jc w:val="center"/>
+        </w:trPr>
+        <w:tc>
+          <w:tcPr>
+            <w:tcW w:w="864" w:type="dxa"/>
+          </w:tcPr>
+          <w:p>
+            <w:pPr>
+              <w:spacing w:line="240" w:lineRule="auto"/>
+            </w:pPr>
+            <w:r>
+              <w:rPr>
+                <w:sz w:val="20"/>
+              </w:rPr>
+              <w:t>1.1</w:t>
+            </w:r>
+          </w:p>
+        </w:tc>
+        <w:tc>
+          <w:tcPr>
+            <w:tcW w:w="1296" w:type="dxa"/>
+          </w:tcPr>
+          <w:p>
+            <w:pPr>
+              <w:spacing w:line="240" w:lineRule="auto"/>
+            </w:pPr>
+            <w:r>
+              <w:rPr>
+                <w:sz w:val="20"/>
+              </w:rPr>
+              <w:t>06/10/2026</w:t>
+            </w:r>
+          </w:p>
+        </w:tc>
+        <w:tc>
+          <w:tcPr>
+            <w:tcW w:w="2160" w:type="dxa"/>
+          </w:tcPr>
+          <w:p>
+            <w:pPr>
+              <w:spacing w:line="240" w:lineRule="auto"/>
+            </w:pPr>
+            <w:r>
+              <w:rPr>
+                <w:sz w:val="20"/>
+              </w:rPr>
+              <w:t>Reducción de la plantilla a ocho puestos (P-001 a P-008) y redistribución de las tareas entre los colaboradores; organigrama hasta el nivel departamental.</w:t>
             </w:r>
           </w:p>
         </w:tc>

</xml_diff>

<commit_message>
Limpieza de manuales y mejoras
</commit_message>
<xml_diff>
--- a/sunGames_sa_de_cv/Manuales/Manual_de_Descripcion_de_Puestos_SunGames_SA_de_CV_APA7.docx
+++ b/sunGames_sa_de_cv/Manuales/Manual_de_Descripcion_de_Puestos_SunGames_SA_de_CV_APA7.docx
@@ -4,98 +4,28 @@
   <w:body>
     <w:p>
       <w:pPr>
-        <w:jc w:val="center"/>
+        <w:spacing w:line="240" w:lineRule="auto"/>
         <w:rPr>
           <w:lang w:val="es-ES"/>
         </w:rPr>
       </w:pPr>
       <w:r>
         <w:rPr>
-          <w:lang w:val="es-ES"/>
-        </w:rPr>
-        <w:t>UNIVERSIDAD DE EL SALVADOR</w:t>
-      </w:r>
-    </w:p>
-    <w:p>
-      <w:pPr>
-        <w:jc w:val="center"/>
-        <w:rPr>
-          <w:lang w:val="es-ES"/>
-        </w:rPr>
-      </w:pPr>
-      <w:r>
-        <w:rPr>
-          <w:lang w:val="es-ES"/>
-        </w:rPr>
-        <w:t>FACULTAD DE INGENIERÍA Y ARQUITECTURA</w:t>
-      </w:r>
-    </w:p>
-    <w:p>
-      <w:pPr>
-        <w:jc w:val="center"/>
-        <w:rPr>
-          <w:lang w:val="es-ES"/>
-        </w:rPr>
-      </w:pPr>
-      <w:r>
-        <w:rPr>
-          <w:lang w:val="es-ES"/>
-        </w:rPr>
-        <w:t>ESCUELA DE INGENIERIA DE SISTEMAS INFORMÁTICOS</w:t>
-      </w:r>
-    </w:p>
-    <w:p>
-      <w:pPr>
-        <w:jc w:val="center"/>
-        <w:rPr>
-          <w:lang w:val="es-ES"/>
-        </w:rPr>
-      </w:pPr>
-      <w:r>
-        <w:rPr>
-          <w:lang w:val="es-ES"/>
-        </w:rPr>
-        <w:t>SISTEMAS CONTABLES SIC115</w:t>
-      </w:r>
-    </w:p>
-    <w:p>
-      <w:pPr>
-        <w:jc w:val="center"/>
-        <w:rPr>
-          <w:lang w:val="es-ES"/>
-        </w:rPr>
-      </w:pPr>
-      <w:r>
-        <w:rPr>
-          <w:lang w:val="es-ES"/>
-        </w:rPr>
-        <w:t>CICLO II-2026</w:t>
-      </w:r>
-    </w:p>
-    <w:p>
-      <w:pPr>
-        <w:jc w:val="center"/>
-        <w:rPr>
-          <w:lang w:val="es-ES"/>
-        </w:rPr>
-      </w:pPr>
-      <w:r>
-        <w:rPr>
           <w:noProof/>
         </w:rPr>
         <w:drawing>
-          <wp:anchor distT="0" distB="0" distL="114300" distR="114300" simplePos="0" relativeHeight="251659264" behindDoc="0" locked="0" layoutInCell="1" allowOverlap="1" wp14:anchorId="6465E26C" wp14:editId="33AC41DF">
+          <wp:anchor distT="0" distB="0" distL="114300" distR="114300" simplePos="0" relativeHeight="251659264" behindDoc="0" locked="0" layoutInCell="1" allowOverlap="1" wp14:anchorId="7267CC6B" wp14:editId="6564DB04">
             <wp:simplePos x="0" y="0"/>
             <wp:positionH relativeFrom="column">
-              <wp:posOffset>996950</wp:posOffset>
+              <wp:posOffset>3617883</wp:posOffset>
             </wp:positionH>
             <wp:positionV relativeFrom="paragraph">
-              <wp:posOffset>73660</wp:posOffset>
+              <wp:posOffset>-666691</wp:posOffset>
             </wp:positionV>
-            <wp:extent cx="1543050" cy="1923415"/>
-            <wp:effectExtent l="0" t="0" r="0" b="635"/>
+            <wp:extent cx="2835408" cy="1101203"/>
+            <wp:effectExtent l="0" t="0" r="0" b="0"/>
             <wp:wrapNone/>
-            <wp:docPr id="739355002" name="Imagen 4"/>
+            <wp:docPr id="915594244" name="Imagen 3"/>
             <wp:cNvGraphicFramePr>
               <a:graphicFrameLocks xmlns:a="http://schemas.openxmlformats.org/drawingml/2006/main" noChangeAspect="1"/>
             </wp:cNvGraphicFramePr>
@@ -103,7 +33,7 @@
               <a:graphicData uri="http://schemas.openxmlformats.org/drawingml/2006/picture">
                 <pic:pic xmlns:pic="http://schemas.openxmlformats.org/drawingml/2006/picture">
                   <pic:nvPicPr>
-                    <pic:cNvPr id="0" name="Imagen 727176803"/>
+                    <pic:cNvPr id="0" name="Imagen 2"/>
                     <pic:cNvPicPr>
                       <a:picLocks noChangeAspect="1" noChangeArrowheads="1"/>
                     </pic:cNvPicPr>
@@ -124,7 +54,7 @@
                   <pic:spPr bwMode="auto">
                     <a:xfrm>
                       <a:off x="0" y="0"/>
-                      <a:ext cx="1543050" cy="1923415"/>
+                      <a:ext cx="2835408" cy="1101203"/>
                     </a:xfrm>
                     <a:prstGeom prst="rect">
                       <a:avLst/>
@@ -145,80 +75,30 @@
       </w:r>
       <w:r>
         <w:rPr>
-          <w:noProof/>
-        </w:rPr>
-        <w:drawing>
-          <wp:anchor distT="0" distB="0" distL="114300" distR="114300" simplePos="0" relativeHeight="251660288" behindDoc="0" locked="0" layoutInCell="1" allowOverlap="1" wp14:anchorId="7267CC6B" wp14:editId="131A1EDB">
-            <wp:simplePos x="0" y="0"/>
-            <wp:positionH relativeFrom="column">
-              <wp:posOffset>3176270</wp:posOffset>
-            </wp:positionH>
-            <wp:positionV relativeFrom="paragraph">
-              <wp:posOffset>385445</wp:posOffset>
-            </wp:positionV>
-            <wp:extent cx="3299460" cy="1281430"/>
-            <wp:effectExtent l="0" t="0" r="0" b="0"/>
-            <wp:wrapNone/>
-            <wp:docPr id="915594244" name="Imagen 3"/>
-            <wp:cNvGraphicFramePr>
-              <a:graphicFrameLocks xmlns:a="http://schemas.openxmlformats.org/drawingml/2006/main" noChangeAspect="1"/>
-            </wp:cNvGraphicFramePr>
-            <a:graphic xmlns:a="http://schemas.openxmlformats.org/drawingml/2006/main">
-              <a:graphicData uri="http://schemas.openxmlformats.org/drawingml/2006/picture">
-                <pic:pic xmlns:pic="http://schemas.openxmlformats.org/drawingml/2006/picture">
-                  <pic:nvPicPr>
-                    <pic:cNvPr id="0" name="Imagen 2"/>
-                    <pic:cNvPicPr>
-                      <a:picLocks noChangeAspect="1" noChangeArrowheads="1"/>
-                    </pic:cNvPicPr>
-                  </pic:nvPicPr>
-                  <pic:blipFill>
-                    <a:blip r:embed="rId9">
-                      <a:extLst>
-                        <a:ext uri="{28A0092B-C50C-407E-A947-70E740481C1C}">
-                          <a14:useLocalDpi xmlns:a14="http://schemas.microsoft.com/office/drawing/2010/main" val="0"/>
-                        </a:ext>
-                      </a:extLst>
-                    </a:blip>
-                    <a:srcRect/>
-                    <a:stretch>
-                      <a:fillRect/>
-                    </a:stretch>
-                  </pic:blipFill>
-                  <pic:spPr bwMode="auto">
-                    <a:xfrm>
-                      <a:off x="0" y="0"/>
-                      <a:ext cx="3299460" cy="1281430"/>
-                    </a:xfrm>
-                    <a:prstGeom prst="rect">
-                      <a:avLst/>
-                    </a:prstGeom>
-                    <a:noFill/>
-                  </pic:spPr>
-                </pic:pic>
-              </a:graphicData>
-            </a:graphic>
-            <wp14:sizeRelH relativeFrom="margin">
-              <wp14:pctWidth>0</wp14:pctWidth>
-            </wp14:sizeRelH>
-            <wp14:sizeRelV relativeFrom="margin">
-              <wp14:pctHeight>0</wp14:pctHeight>
-            </wp14:sizeRelV>
-          </wp:anchor>
-        </w:drawing>
+          <w:lang w:val="es-ES"/>
+        </w:rPr>
+        <w:t>SUNGAMES S.A. DE C.V.</w:t>
       </w:r>
     </w:p>
     <w:p>
       <w:pPr>
-        <w:jc w:val="center"/>
+        <w:pBdr>
+          <w:bottom w:val="single" w:sz="6" w:space="1" w:color="auto"/>
+        </w:pBdr>
+        <w:spacing w:line="240" w:lineRule="auto"/>
         <w:rPr>
           <w:lang w:val="es-ES"/>
         </w:rPr>
       </w:pPr>
+      <w:r>
+        <w:rPr>
+          <w:lang w:val="es-ES"/>
+        </w:rPr>
+        <w:t>GERENCIA GENERAL</w:t>
+      </w:r>
     </w:p>
     <w:p>
       <w:pPr>
-        <w:jc w:val="center"/>
         <w:rPr>
           <w:lang w:val="es-ES"/>
         </w:rPr>
@@ -250,8 +130,9 @@
     </w:p>
     <w:p>
       <w:pPr>
-        <w:jc w:val="center"/>
-        <w:rPr>
+        <w:rPr>
+          <w:sz w:val="52"/>
+          <w:szCs w:val="52"/>
           <w:lang w:val="es-ES"/>
         </w:rPr>
       </w:pPr>
@@ -260,65 +141,48 @@
       <w:pPr>
         <w:jc w:val="center"/>
         <w:rPr>
-          <w:i/>
-          <w:iCs/>
+          <w:b/>
+          <w:bCs/>
+          <w:sz w:val="52"/>
+          <w:szCs w:val="52"/>
           <w:lang w:val="es-ES"/>
         </w:rPr>
       </w:pPr>
       <w:r>
         <w:rPr>
+          <w:b/>
+          <w:bCs/>
+          <w:sz w:val="52"/>
+          <w:szCs w:val="52"/>
           <w:lang w:val="es-ES"/>
         </w:rPr>
-        <w:t>“</w:t>
-      </w:r>
-      <w:r>
-        <w:rPr>
-          <w:i/>
-          <w:iCs/>
-          <w:lang w:val="es-ES"/>
-        </w:rPr>
-        <w:t xml:space="preserve">MANUAL DE </w:t>
-      </w:r>
-      <w:r>
-        <w:rPr>
-          <w:i/>
-          <w:iCs/>
-          <w:lang w:val="es-ES"/>
-        </w:rPr>
-        <w:t>DESCRIPCION DE PUESTOS</w:t>
-      </w:r>
-      <w:r>
-        <w:rPr>
-          <w:i/>
-          <w:iCs/>
-          <w:lang w:val="es-ES"/>
-        </w:rPr>
-        <w:t>”</w:t>
+        <w:t>MANUAL DE DESCRIPCIÓN DE PUESTOS</w:t>
       </w:r>
     </w:p>
     <w:p>
       <w:pPr>
         <w:jc w:val="center"/>
         <w:rPr>
-          <w:i/>
-          <w:iCs/>
+          <w:szCs w:val="24"/>
           <w:lang w:val="es-ES"/>
         </w:rPr>
       </w:pPr>
+      <w:r>
+        <w:rPr>
+          <w:szCs w:val="24"/>
+          <w:lang w:val="es-ES"/>
+        </w:rPr>
+        <w:t>Plan Estratégico Institucional 2026-2029</w:t>
+      </w:r>
     </w:p>
     <w:p>
       <w:pPr>
         <w:jc w:val="center"/>
         <w:rPr>
+          <w:szCs w:val="24"/>
           <w:lang w:val="es-ES"/>
         </w:rPr>
       </w:pPr>
-      <w:r>
-        <w:rPr>
-          <w:lang w:val="es-ES"/>
-        </w:rPr>
-        <w:t>PRESENTADO POR:</w:t>
-      </w:r>
     </w:p>
     <w:p>
       <w:pPr>
@@ -328,349 +192,6 @@
         </w:rPr>
       </w:pPr>
     </w:p>
-    <w:tbl>
-      <w:tblPr>
-        <w:tblStyle w:val="Tablaconcuadrcula"/>
-        <w:tblW w:w="0" w:type="auto"/>
-        <w:tblLook w:val="04A0" w:firstRow="1" w:lastRow="0" w:firstColumn="1" w:lastColumn="0" w:noHBand="0" w:noVBand="1"/>
-      </w:tblPr>
-      <w:tblGrid>
-        <w:gridCol w:w="3131"/>
-        <w:gridCol w:w="3131"/>
-        <w:gridCol w:w="3132"/>
-      </w:tblGrid>
-      <w:tr>
-        <w:tc>
-          <w:tcPr>
-            <w:tcW w:w="3131" w:type="dxa"/>
-            <w:tcBorders>
-              <w:top w:val="single" w:sz="4" w:space="0" w:color="auto"/>
-              <w:left w:val="single" w:sz="4" w:space="0" w:color="auto"/>
-              <w:bottom w:val="single" w:sz="4" w:space="0" w:color="auto"/>
-              <w:right w:val="single" w:sz="4" w:space="0" w:color="auto"/>
-            </w:tcBorders>
-            <w:shd w:val="clear" w:color="auto" w:fill="95B3D7" w:themeFill="accent1" w:themeFillTint="99"/>
-            <w:hideMark/>
-          </w:tcPr>
-          <w:p>
-            <w:pPr>
-              <w:jc w:val="center"/>
-              <w:rPr>
-                <w:lang w:val="es-ES"/>
-              </w:rPr>
-            </w:pPr>
-            <w:r>
-              <w:rPr>
-                <w:lang w:val="es-ES"/>
-              </w:rPr>
-              <w:t>CARNET</w:t>
-            </w:r>
-          </w:p>
-        </w:tc>
-        <w:tc>
-          <w:tcPr>
-            <w:tcW w:w="3131" w:type="dxa"/>
-            <w:tcBorders>
-              <w:top w:val="single" w:sz="4" w:space="0" w:color="auto"/>
-              <w:left w:val="single" w:sz="4" w:space="0" w:color="auto"/>
-              <w:bottom w:val="single" w:sz="4" w:space="0" w:color="auto"/>
-              <w:right w:val="single" w:sz="4" w:space="0" w:color="auto"/>
-            </w:tcBorders>
-            <w:shd w:val="clear" w:color="auto" w:fill="95B3D7" w:themeFill="accent1" w:themeFillTint="99"/>
-            <w:hideMark/>
-          </w:tcPr>
-          <w:p>
-            <w:pPr>
-              <w:jc w:val="center"/>
-              <w:rPr>
-                <w:lang w:val="es-ES"/>
-              </w:rPr>
-            </w:pPr>
-            <w:r>
-              <w:rPr>
-                <w:lang w:val="es-ES"/>
-              </w:rPr>
-              <w:t>APELLIDOS</w:t>
-            </w:r>
-          </w:p>
-        </w:tc>
-        <w:tc>
-          <w:tcPr>
-            <w:tcW w:w="3132" w:type="dxa"/>
-            <w:tcBorders>
-              <w:top w:val="single" w:sz="4" w:space="0" w:color="auto"/>
-              <w:left w:val="single" w:sz="4" w:space="0" w:color="auto"/>
-              <w:bottom w:val="single" w:sz="4" w:space="0" w:color="auto"/>
-              <w:right w:val="single" w:sz="4" w:space="0" w:color="auto"/>
-            </w:tcBorders>
-            <w:shd w:val="clear" w:color="auto" w:fill="95B3D7" w:themeFill="accent1" w:themeFillTint="99"/>
-            <w:hideMark/>
-          </w:tcPr>
-          <w:p>
-            <w:pPr>
-              <w:jc w:val="center"/>
-              <w:rPr>
-                <w:lang w:val="es-ES"/>
-              </w:rPr>
-            </w:pPr>
-            <w:r>
-              <w:rPr>
-                <w:lang w:val="es-ES"/>
-              </w:rPr>
-              <w:t>NOMBRES</w:t>
-            </w:r>
-          </w:p>
-        </w:tc>
-      </w:tr>
-      <w:tr>
-        <w:tc>
-          <w:tcPr>
-            <w:tcW w:w="3131" w:type="dxa"/>
-            <w:tcBorders>
-              <w:top w:val="single" w:sz="4" w:space="0" w:color="auto"/>
-              <w:left w:val="single" w:sz="4" w:space="0" w:color="auto"/>
-              <w:bottom w:val="single" w:sz="4" w:space="0" w:color="auto"/>
-              <w:right w:val="single" w:sz="4" w:space="0" w:color="auto"/>
-            </w:tcBorders>
-            <w:hideMark/>
-          </w:tcPr>
-          <w:p>
-            <w:pPr>
-              <w:jc w:val="center"/>
-              <w:rPr>
-                <w:lang w:val="es-ES"/>
-              </w:rPr>
-            </w:pPr>
-            <w:r>
-              <w:rPr>
-                <w:lang w:val="es-ES"/>
-              </w:rPr>
-              <w:t>GS24026</w:t>
-            </w:r>
-          </w:p>
-        </w:tc>
-        <w:tc>
-          <w:tcPr>
-            <w:tcW w:w="3131" w:type="dxa"/>
-            <w:tcBorders>
-              <w:top w:val="single" w:sz="4" w:space="0" w:color="auto"/>
-              <w:left w:val="single" w:sz="4" w:space="0" w:color="auto"/>
-              <w:bottom w:val="single" w:sz="4" w:space="0" w:color="auto"/>
-              <w:right w:val="single" w:sz="4" w:space="0" w:color="auto"/>
-            </w:tcBorders>
-            <w:hideMark/>
-          </w:tcPr>
-          <w:p>
-            <w:pPr>
-              <w:jc w:val="center"/>
-              <w:rPr>
-                <w:lang w:val="es-ES"/>
-              </w:rPr>
-            </w:pPr>
-            <w:r>
-              <w:rPr>
-                <w:lang w:val="es-ES"/>
-              </w:rPr>
-              <w:t>González Sánchez</w:t>
-            </w:r>
-          </w:p>
-        </w:tc>
-        <w:tc>
-          <w:tcPr>
-            <w:tcW w:w="3132" w:type="dxa"/>
-            <w:tcBorders>
-              <w:top w:val="single" w:sz="4" w:space="0" w:color="auto"/>
-              <w:left w:val="single" w:sz="4" w:space="0" w:color="auto"/>
-              <w:bottom w:val="single" w:sz="4" w:space="0" w:color="auto"/>
-              <w:right w:val="single" w:sz="4" w:space="0" w:color="auto"/>
-            </w:tcBorders>
-            <w:hideMark/>
-          </w:tcPr>
-          <w:p>
-            <w:pPr>
-              <w:jc w:val="center"/>
-              <w:rPr>
-                <w:lang w:val="es-ES"/>
-              </w:rPr>
-            </w:pPr>
-            <w:r>
-              <w:rPr>
-                <w:lang w:val="es-ES"/>
-              </w:rPr>
-              <w:t>Diego Edgardo</w:t>
-            </w:r>
-          </w:p>
-        </w:tc>
-      </w:tr>
-      <w:tr>
-        <w:tc>
-          <w:tcPr>
-            <w:tcW w:w="3131" w:type="dxa"/>
-            <w:tcBorders>
-              <w:top w:val="single" w:sz="4" w:space="0" w:color="auto"/>
-              <w:left w:val="single" w:sz="4" w:space="0" w:color="auto"/>
-              <w:bottom w:val="single" w:sz="4" w:space="0" w:color="auto"/>
-              <w:right w:val="single" w:sz="4" w:space="0" w:color="auto"/>
-            </w:tcBorders>
-            <w:hideMark/>
-          </w:tcPr>
-          <w:p>
-            <w:pPr>
-              <w:jc w:val="center"/>
-              <w:rPr>
-                <w:lang w:val="es-ES"/>
-              </w:rPr>
-            </w:pPr>
-            <w:r>
-              <w:rPr>
-                <w:lang w:val="es-ES"/>
-              </w:rPr>
-              <w:t>RH23022</w:t>
-            </w:r>
-          </w:p>
-        </w:tc>
-        <w:tc>
-          <w:tcPr>
-            <w:tcW w:w="3131" w:type="dxa"/>
-            <w:tcBorders>
-              <w:top w:val="single" w:sz="4" w:space="0" w:color="auto"/>
-              <w:left w:val="single" w:sz="4" w:space="0" w:color="auto"/>
-              <w:bottom w:val="single" w:sz="4" w:space="0" w:color="auto"/>
-              <w:right w:val="single" w:sz="4" w:space="0" w:color="auto"/>
-            </w:tcBorders>
-            <w:hideMark/>
-          </w:tcPr>
-          <w:p>
-            <w:pPr>
-              <w:jc w:val="center"/>
-              <w:rPr>
-                <w:lang w:val="es-ES"/>
-              </w:rPr>
-            </w:pPr>
-            <w:r>
-              <w:rPr>
-                <w:lang w:val="es-ES"/>
-              </w:rPr>
-              <w:t>Renderos Hernández</w:t>
-            </w:r>
-          </w:p>
-        </w:tc>
-        <w:tc>
-          <w:tcPr>
-            <w:tcW w:w="3132" w:type="dxa"/>
-            <w:tcBorders>
-              <w:top w:val="single" w:sz="4" w:space="0" w:color="auto"/>
-              <w:left w:val="single" w:sz="4" w:space="0" w:color="auto"/>
-              <w:bottom w:val="single" w:sz="4" w:space="0" w:color="auto"/>
-              <w:right w:val="single" w:sz="4" w:space="0" w:color="auto"/>
-            </w:tcBorders>
-            <w:hideMark/>
-          </w:tcPr>
-          <w:p>
-            <w:pPr>
-              <w:jc w:val="center"/>
-              <w:rPr>
-                <w:lang w:val="es-ES"/>
-              </w:rPr>
-            </w:pPr>
-            <w:r>
-              <w:rPr>
-                <w:lang w:val="es-ES"/>
-              </w:rPr>
-              <w:t>Josué Nehemías</w:t>
-            </w:r>
-          </w:p>
-        </w:tc>
-      </w:tr>
-      <w:tr>
-        <w:tc>
-          <w:tcPr>
-            <w:tcW w:w="3131" w:type="dxa"/>
-            <w:tcBorders>
-              <w:top w:val="single" w:sz="4" w:space="0" w:color="auto"/>
-              <w:left w:val="single" w:sz="4" w:space="0" w:color="auto"/>
-              <w:bottom w:val="single" w:sz="4" w:space="0" w:color="auto"/>
-              <w:right w:val="single" w:sz="4" w:space="0" w:color="auto"/>
-            </w:tcBorders>
-            <w:hideMark/>
-          </w:tcPr>
-          <w:p>
-            <w:pPr>
-              <w:jc w:val="center"/>
-              <w:rPr>
-                <w:lang w:val="es-ES"/>
-              </w:rPr>
-            </w:pPr>
-            <w:r>
-              <w:rPr>
-                <w:lang w:val="es-ES"/>
-              </w:rPr>
-              <w:t>RR24028</w:t>
-            </w:r>
-          </w:p>
-        </w:tc>
-        <w:tc>
-          <w:tcPr>
-            <w:tcW w:w="3131" w:type="dxa"/>
-            <w:tcBorders>
-              <w:top w:val="single" w:sz="4" w:space="0" w:color="auto"/>
-              <w:left w:val="single" w:sz="4" w:space="0" w:color="auto"/>
-              <w:bottom w:val="single" w:sz="4" w:space="0" w:color="auto"/>
-              <w:right w:val="single" w:sz="4" w:space="0" w:color="auto"/>
-            </w:tcBorders>
-            <w:hideMark/>
-          </w:tcPr>
-          <w:p>
-            <w:pPr>
-              <w:jc w:val="center"/>
-              <w:rPr>
-                <w:lang w:val="es-ES"/>
-              </w:rPr>
-            </w:pPr>
-            <w:r>
-              <w:rPr>
-                <w:lang w:val="es-ES"/>
-              </w:rPr>
-              <w:t xml:space="preserve">Rivas </w:t>
-            </w:r>
-            <w:proofErr w:type="spellStart"/>
-            <w:r>
-              <w:rPr>
-                <w:lang w:val="es-ES"/>
-              </w:rPr>
-              <w:t>Rivas</w:t>
-            </w:r>
-            <w:proofErr w:type="spellEnd"/>
-          </w:p>
-        </w:tc>
-        <w:tc>
-          <w:tcPr>
-            <w:tcW w:w="3132" w:type="dxa"/>
-            <w:tcBorders>
-              <w:top w:val="single" w:sz="4" w:space="0" w:color="auto"/>
-              <w:left w:val="single" w:sz="4" w:space="0" w:color="auto"/>
-              <w:bottom w:val="single" w:sz="4" w:space="0" w:color="auto"/>
-              <w:right w:val="single" w:sz="4" w:space="0" w:color="auto"/>
-            </w:tcBorders>
-            <w:hideMark/>
-          </w:tcPr>
-          <w:p>
-            <w:pPr>
-              <w:jc w:val="center"/>
-              <w:rPr>
-                <w:lang w:val="es-ES"/>
-              </w:rPr>
-            </w:pPr>
-            <w:r>
-              <w:rPr>
-                <w:lang w:val="es-ES"/>
-              </w:rPr>
-              <w:t>David Alexander</w:t>
-            </w:r>
-          </w:p>
-        </w:tc>
-      </w:tr>
-    </w:tbl>
     <w:p>
       <w:pPr>
         <w:jc w:val="center"/>
@@ -686,12 +207,6 @@
           <w:lang w:val="es-ES"/>
         </w:rPr>
       </w:pPr>
-      <w:r>
-        <w:rPr>
-          <w:lang w:val="es-ES"/>
-        </w:rPr>
-        <w:t>A LA INGENIERA:</w:t>
-      </w:r>
     </w:p>
     <w:p>
       <w:pPr>
@@ -700,12 +215,62 @@
           <w:lang w:val="es-ES"/>
         </w:rPr>
       </w:pPr>
-      <w:r>
+    </w:p>
+    <w:p>
+      <w:pPr>
+        <w:jc w:val="center"/>
         <w:rPr>
           <w:lang w:val="es-ES"/>
         </w:rPr>
-        <w:t>LIZETH CARMELINE GOCHEZ DE PEÑATE</w:t>
-      </w:r>
+      </w:pPr>
+    </w:p>
+    <w:p>
+      <w:pPr>
+        <w:jc w:val="center"/>
+        <w:rPr>
+          <w:lang w:val="es-ES"/>
+        </w:rPr>
+      </w:pPr>
+    </w:p>
+    <w:p>
+      <w:pPr>
+        <w:jc w:val="center"/>
+        <w:rPr>
+          <w:lang w:val="es-ES"/>
+        </w:rPr>
+      </w:pPr>
+    </w:p>
+    <w:p>
+      <w:pPr>
+        <w:jc w:val="center"/>
+        <w:rPr>
+          <w:lang w:val="es-ES"/>
+        </w:rPr>
+      </w:pPr>
+    </w:p>
+    <w:p>
+      <w:pPr>
+        <w:jc w:val="center"/>
+        <w:rPr>
+          <w:lang w:val="es-ES"/>
+        </w:rPr>
+      </w:pPr>
+    </w:p>
+    <w:p>
+      <w:pPr>
+        <w:jc w:val="center"/>
+        <w:rPr>
+          <w:lang w:val="es-ES"/>
+        </w:rPr>
+      </w:pPr>
+    </w:p>
+    <w:p>
+      <w:pPr>
+        <w:jc w:val="center"/>
+        <w:rPr>
+          <w:lang w:val="es-ES"/>
+        </w:rPr>
+      </w:pPr>
     </w:p>
     <w:p>
       <w:pPr>
@@ -722,7 +287,6 @@
           <w:b/>
           <w:lang w:val="es-SV"/>
         </w:rPr>
-        <w:lastRenderedPageBreak/>
         <w:t>Tabla de contenido</w:t>
       </w:r>
       <w:bookmarkEnd w:id="0"/>
@@ -2615,19 +2179,7 @@
         <w:rPr>
           <w:lang w:val="es-SV"/>
         </w:rPr>
-        <w:t xml:space="preserve">El Manual de Descripción de Puestos (MDP) de SunGames, S.A. de C.V. es el instrumento técnico que describe y documenta los puestos de trabajo de la sociedad: su ubicación en la </w:t>
-      </w:r>
-      <w:r>
-        <w:rPr>
-          <w:lang w:val="es-SV"/>
-        </w:rPr>
-        <w:t>estructura organizativa, su misión, sus funciones esenciales, los requisitos de formación y experiencia, los conocimientos técnicos, las competencias y las condiciones laborales. Constituye el complemento operativo del Manual de Organización y Funciones (S</w:t>
-      </w:r>
-      <w:r>
-        <w:rPr>
-          <w:lang w:val="es-SV"/>
-        </w:rPr>
-        <w:t>G-MOF-001) y del Manual de Estructura Organizativa (SG-MEO-001).</w:t>
+        <w:t>El Manual de Descripción de Puestos (MDP) de SunGames, S.A. de C.V. es el instrumento técnico que describe y documenta los puestos de trabajo de la sociedad: su ubicación en la estructura organizativa, su misión, sus funciones esenciales, los requisitos de formación y experiencia, los conocimientos técnicos, las competencias y las condiciones laborales. Constituye el complemento operativo del Manual de Organización y Funciones (SG-MOF-001) y del Manual de Estructura Organizativa (SG-MEO-001).</w:t>
       </w:r>
     </w:p>
     <w:p>
@@ -2641,13 +2193,7 @@
         <w:rPr>
           <w:lang w:val="es-SV"/>
         </w:rPr>
-        <w:t>El manual se elaboró conforme a los lineamientos del Instructivo para la elaboración de manuales de organización (Ministerio de Agricultura y Ganadería, 2008) y a las normas de presentación d</w:t>
-      </w:r>
-      <w:r>
-        <w:rPr>
-          <w:lang w:val="es-SV"/>
-        </w:rPr>
-        <w:t xml:space="preserve">e la American </w:t>
+        <w:t xml:space="preserve">El manual se elaboró conforme a los lineamientos del Instructivo para la elaboración de manuales de organización (Ministerio de Agricultura y Ganadería, 2008) y a las normas de presentación de la American </w:t>
       </w:r>
       <w:proofErr w:type="spellStart"/>
       <w:r>
@@ -2700,10 +2246,7 @@
       <w:bookmarkStart w:id="2" w:name="_Toc243594574"/>
       <w:r>
         <w:lastRenderedPageBreak/>
-        <w:t>Objetivos d</w:t>
-      </w:r>
-      <w:r>
-        <w:t>el Manual</w:t>
+        <w:t>Objetivos del Manual</w:t>
       </w:r>
       <w:bookmarkEnd w:id="2"/>
     </w:p>
@@ -2772,13 +2315,7 @@
         <w:rPr>
           <w:lang w:val="es-SV"/>
         </w:rPr>
-        <w:t>Servir de base para los procesos de reclut</w:t>
-      </w:r>
-      <w:r>
-        <w:rPr>
-          <w:lang w:val="es-SV"/>
-        </w:rPr>
-        <w:t>amiento, selección, inducción y evaluación del desempeño.</w:t>
+        <w:t>Servir de base para los procesos de reclutamiento, selección, inducción y evaluación del desempeño.</w:t>
       </w:r>
     </w:p>
     <w:p>
@@ -2856,19 +2393,7 @@
         <w:rPr>
           <w:lang w:val="es-SV"/>
         </w:rPr>
-        <w:t>El manual</w:t>
-      </w:r>
-      <w:r>
-        <w:rPr>
-          <w:lang w:val="es-SV"/>
-        </w:rPr>
-        <w:t xml:space="preserve"> aplica a los ocho puestos (P-001 a P-008) que integran la estructura de la sociedad. Las descripciones son de carácter enunciativo y no limitativo; el superior jerárquico podrá asignar funciones afines siempre que no contravengan la segregación de funcion</w:t>
-      </w:r>
-      <w:r>
-        <w:rPr>
-          <w:lang w:val="es-SV"/>
-        </w:rPr>
-        <w:t>es y el marco normativo.</w:t>
+        <w:t>El manual aplica a los ocho puestos (P-001 a P-008) que integran la estructura de la sociedad. Las descripciones son de carácter enunciativo y no limitativo; el superior jerárquico podrá asignar funciones afines siempre que no contravengan la segregación de funciones y el marco normativo.</w:t>
       </w:r>
     </w:p>
     <w:p>
@@ -3299,14 +2824,7 @@
                 <w:sz w:val="20"/>
                 <w:lang w:val="es-SV"/>
               </w:rPr>
-              <w:t>Principal: 6201001 (elaboración y modificación de software). Secundaria: 5820001 (edición de programas info</w:t>
-            </w:r>
-            <w:r>
-              <w:rPr>
-                <w:sz w:val="20"/>
-                <w:lang w:val="es-SV"/>
-              </w:rPr>
-              <w:t xml:space="preserve">rmáticos). </w:t>
+              <w:t xml:space="preserve">Principal: 6201001 (elaboración y modificación de software). Secundaria: 5820001 (edición de programas informáticos). </w:t>
             </w:r>
             <w:proofErr w:type="spellStart"/>
             <w:r>
@@ -3510,14 +3028,7 @@
                 <w:sz w:val="20"/>
                 <w:lang w:val="es-SV"/>
               </w:rPr>
-              <w:t xml:space="preserve">Distrito de San Salvador, Municipio de </w:t>
-            </w:r>
-            <w:r>
-              <w:rPr>
-                <w:sz w:val="20"/>
-                <w:lang w:val="es-SV"/>
-              </w:rPr>
-              <w:t>San Salvador Centro, Departamento de San Salvador</w:t>
+              <w:t>Distrito de San Salvador, Municipio de San Salvador Centro, Departamento de San Salvador</w:t>
             </w:r>
           </w:p>
         </w:tc>
@@ -3657,14 +3168,7 @@
                 <w:sz w:val="20"/>
                 <w:lang w:val="es-SV"/>
               </w:rPr>
-              <w:t xml:space="preserve">US$30,000.00, dividido en 30,000 acciones nominativas comunes de US$1.00 cada </w:t>
-            </w:r>
-            <w:r>
-              <w:rPr>
-                <w:sz w:val="20"/>
-                <w:lang w:val="es-SV"/>
-              </w:rPr>
-              <w:t>una; capital mínimo de US$2,000.00 (datos simulados)</w:t>
+              <w:t>US$30,000.00, dividido en 30,000 acciones nominativas comunes de US$1.00 cada una; capital mínimo de US$2,000.00 (datos simulados)</w:t>
             </w:r>
           </w:p>
         </w:tc>
@@ -3834,15 +3338,7 @@
                 <w:sz w:val="22"/>
                 <w:lang w:val="es-SV"/>
               </w:rPr>
-              <w:t>Director Presidente</w:t>
-            </w:r>
-            <w:r>
-              <w:rPr>
-                <w:b/>
-                <w:sz w:val="22"/>
-                <w:lang w:val="es-SV"/>
-              </w:rPr>
-              <w:t xml:space="preserve"> y Representante Legal</w:t>
+              <w:t>Director Presidente y Representante Legal</w:t>
             </w:r>
           </w:p>
         </w:tc>
@@ -4024,13 +3520,7 @@
         <w:rPr>
           <w:lang w:val="es-SV"/>
         </w:rPr>
-        <w:t>El presente manual considera e</w:t>
-      </w:r>
-      <w:r>
-        <w:rPr>
-          <w:lang w:val="es-SV"/>
-        </w:rPr>
-        <w:t>l siguiente marco legal y normativo:</w:t>
+        <w:t>El presente manual considera el siguiente marco legal y normativo:</w:t>
       </w:r>
     </w:p>
     <w:p>
@@ -4058,13 +3548,7 @@
         <w:rPr>
           <w:lang w:val="es-SV"/>
         </w:rPr>
-        <w:t>Código Tri</w:t>
-      </w:r>
-      <w:r>
-        <w:rPr>
-          <w:lang w:val="es-SV"/>
-        </w:rPr>
-        <w:t>butario, arts. 139 a 149-C (contabilidad formal y obligaciones del contador) (Asamblea Legislativa de la República de El Salvador, 2000).</w:t>
+        <w:t>Código Tributario, arts. 139 a 149-C (contabilidad formal y obligaciones del contador) (Asamblea Legislativa de la República de El Salvador, 2000).</w:t>
       </w:r>
     </w:p>
     <w:p>
@@ -4078,13 +3562,7 @@
         <w:rPr>
           <w:lang w:val="es-SV"/>
         </w:rPr>
-        <w:t>Código de Trabajo (Asamblea Legislativa de la República de El Salvador, 1972) y Ley del Seguro Social (Asamblea Legisl</w:t>
-      </w:r>
-      <w:r>
-        <w:rPr>
-          <w:lang w:val="es-SV"/>
-        </w:rPr>
-        <w:t>ativa de la República de El Salvador, 1953), en materia de contratación, planillas y condiciones laborales. En la determinación de impuestos y retenciones se consideran también la Ley de Impuesto sobre la Renta y la Ley de IVA.</w:t>
+        <w:t>Código de Trabajo (Asamblea Legislativa de la República de El Salvador, 1972) y Ley del Seguro Social (Asamblea Legislativa de la República de El Salvador, 1953), en materia de contratación, planillas y condiciones laborales. En la determinación de impuestos y retenciones se consideran también la Ley de Impuesto sobre la Renta y la Ley de IVA.</w:t>
       </w:r>
     </w:p>
     <w:p>
@@ -4098,13 +3576,7 @@
         <w:rPr>
           <w:lang w:val="es-SV"/>
         </w:rPr>
-        <w:t xml:space="preserve">NIIF para PYMES (Consejo de </w:t>
-      </w:r>
-      <w:r>
-        <w:rPr>
-          <w:lang w:val="es-SV"/>
-        </w:rPr>
-        <w:t>Normas Internacionales de Contabilidad, 2015) y Normas Técnicas de Control Interno de la Corte de Cuentas de la República (2004), como referencia de buenas prácticas de control interno.</w:t>
+        <w:t>NIIF para PYMES (Consejo de Normas Internacionales de Contabilidad, 2015) y Normas Técnicas de Control Interno de la Corte de Cuentas de la República (2004), como referencia de buenas prácticas de control interno.</w:t>
       </w:r>
     </w:p>
     <w:p>
@@ -4154,13 +3626,7 @@
         <w:rPr>
           <w:lang w:val="es-SV"/>
         </w:rPr>
-        <w:t>Cada descripci</w:t>
-      </w:r>
-      <w:r>
-        <w:rPr>
-          <w:lang w:val="es-SV"/>
-        </w:rPr>
-        <w:t>ón de puesto contiene los siguientes campos (ver Tabla 3).</w:t>
+        <w:t>Cada descripción de puesto contiene los siguientes campos (ver Tabla 3).</w:t>
       </w:r>
     </w:p>
     <w:p>
@@ -4516,14 +3982,7 @@
                 <w:sz w:val="22"/>
                 <w:lang w:val="es-SV"/>
               </w:rPr>
-              <w:t xml:space="preserve">Tipo de </w:t>
-            </w:r>
-            <w:r>
-              <w:rPr>
-                <w:sz w:val="22"/>
-                <w:lang w:val="es-SV"/>
-              </w:rPr>
-              <w:t>contrato, jornada y condiciones particulares.</w:t>
+              <w:t>Tipo de contrato, jornada y condiciones particulares.</w:t>
             </w:r>
           </w:p>
         </w:tc>
@@ -4584,13 +4043,7 @@
         <w:rPr>
           <w:lang w:val="es-SV"/>
         </w:rPr>
-        <w:t xml:space="preserve">La metodología de elaboración comprende: (a) entrevista con el titular del puesto y su superior jerárquico; (b) observación directa de las tareas del </w:t>
-      </w:r>
-      <w:r>
-        <w:rPr>
-          <w:lang w:val="es-SV"/>
-        </w:rPr>
-        <w:t>puesto; (c) revisión de funciones afines en la estructura; y (d) validación con la Gerencia General y aprobación de la Junta Directiva.</w:t>
+        <w:t>La metodología de elaboración comprende: (a) entrevista con el titular del puesto y su superior jerárquico; (b) observación directa de las tareas del puesto; (c) revisión de funciones afines en la estructura; y (d) validación con la Gerencia General y aprobación de la Junta Directiva.</w:t>
       </w:r>
     </w:p>
     <w:p>
@@ -4640,13 +4093,7 @@
         <w:rPr>
           <w:lang w:val="es-SV"/>
         </w:rPr>
-        <w:t>Los puestos de la sociedad se ordenan en los siguientes niveles jerárquicos (ver Ta</w:t>
-      </w:r>
-      <w:r>
-        <w:rPr>
-          <w:lang w:val="es-SV"/>
-        </w:rPr>
-        <w:t>bla 4).</w:t>
+        <w:t>Los puestos de la sociedad se ordenan en los siguientes niveles jerárquicos (ver Tabla 4).</w:t>
       </w:r>
     </w:p>
     <w:p>
@@ -4878,14 +4325,7 @@
                 <w:sz w:val="20"/>
                 <w:lang w:val="es-SV"/>
               </w:rPr>
-              <w:t xml:space="preserve">Dirige la operación de la </w:t>
-            </w:r>
-            <w:r>
-              <w:rPr>
-                <w:sz w:val="20"/>
-                <w:lang w:val="es-SV"/>
-              </w:rPr>
-              <w:t>sociedad.</w:t>
+              <w:t>Dirige la operación de la sociedad.</w:t>
             </w:r>
           </w:p>
         </w:tc>
@@ -4999,14 +4439,7 @@
                 <w:sz w:val="20"/>
                 <w:lang w:val="es-SV"/>
               </w:rPr>
-              <w:t>Auxiliar Contable y Tesorero, Líder de Desarrollo, desarrollador y control de calidad, ejecutivo comercial, talento humano y pla</w:t>
-            </w:r>
-            <w:r>
-              <w:rPr>
-                <w:sz w:val="20"/>
-                <w:lang w:val="es-SV"/>
-              </w:rPr>
-              <w:t>nillas, y operaciones y servicio al cliente</w:t>
+              <w:t>Auxiliar Contable y Tesorero, Líder de Desarrollo, desarrollador y control de calidad, ejecutivo comercial, talento humano y planillas, y operaciones y servicio al cliente</w:t>
             </w:r>
           </w:p>
         </w:tc>
@@ -5087,13 +4520,7 @@
         <w:rPr>
           <w:lang w:val="es-SV"/>
         </w:rPr>
-        <w:t xml:space="preserve">A continuación se presentan las descripciones de los ocho puestos de la estructura de la sociedad (P-001 a P-008), ordenadas según su </w:t>
-      </w:r>
-      <w:r>
-        <w:rPr>
-          <w:lang w:val="es-SV"/>
-        </w:rPr>
-        <w:t>código de puesto. Cada descripción comprende la identificación del puesto, los requisitos, las funciones esenciales y las relaciones del puesto.</w:t>
+        <w:t>A continuación se presentan las descripciones de los ocho puestos de la estructura de la sociedad (P-001 a P-008), ordenadas según su código de puesto. Cada descripción comprende la identificación del puesto, los requisitos, las funciones esenciales y las relaciones del puesto.</w:t>
       </w:r>
     </w:p>
     <w:p>
@@ -5431,14 +4858,7 @@
                 <w:sz w:val="22"/>
                 <w:lang w:val="es-SV"/>
               </w:rPr>
-              <w:t xml:space="preserve">Conducir la gestión operativa y estratégica de la sociedad, </w:t>
-            </w:r>
-            <w:r>
-              <w:rPr>
-                <w:sz w:val="22"/>
-                <w:lang w:val="es-SV"/>
-              </w:rPr>
-              <w:t>asegurar el cumplimiento de los objetivos del negocio y de las directrices de la Junta General y de la Junta Directiva, y garantizar el cumplimiento del marco legal, tributario y contable aplicable.</w:t>
+              <w:t>Conducir la gestión operativa y estratégica de la sociedad, asegurar el cumplimiento de los objetivos del negocio y de las directrices de la Junta General y de la Junta Directiva, y garantizar el cumplimiento del marco legal, tributario y contable aplicable.</w:t>
             </w:r>
           </w:p>
         </w:tc>
@@ -5498,14 +4918,7 @@
                 <w:sz w:val="22"/>
                 <w:lang w:val="es-SV"/>
               </w:rPr>
-              <w:t>Licenciatura en Administración de Em</w:t>
-            </w:r>
-            <w:r>
-              <w:rPr>
-                <w:sz w:val="22"/>
-                <w:lang w:val="es-SV"/>
-              </w:rPr>
-              <w:t>presas, Ingeniería Industrial, Ingeniería en Sistemas o carreras afines; estudios de posgrado (deseable).</w:t>
+              <w:t>Licenciatura en Administración de Empresas, Ingeniería Industrial, Ingeniería en Sistemas o carreras afines; estudios de posgrado (deseable).</w:t>
             </w:r>
           </w:p>
         </w:tc>
@@ -5549,14 +4962,7 @@
                 <w:sz w:val="22"/>
                 <w:lang w:val="es-SV"/>
               </w:rPr>
-              <w:t>Mínimo cinco años en cargos de dirección o gerencia; experiencia en empresas de tecnología, entretenimiento o comercio digital (deseable)</w:t>
-            </w:r>
-            <w:r>
-              <w:rPr>
-                <w:sz w:val="22"/>
-                <w:lang w:val="es-SV"/>
-              </w:rPr>
-              <w:t>.</w:t>
+              <w:t>Mínimo cinco años en cargos de dirección o gerencia; experiencia en empresas de tecnología, entretenimiento o comercio digital (deseable).</w:t>
             </w:r>
           </w:p>
         </w:tc>
@@ -5660,14 +5066,7 @@
                 <w:sz w:val="22"/>
                 <w:lang w:val="es-SV"/>
               </w:rPr>
-              <w:t xml:space="preserve">Liderazgo, visión estratégica, toma de </w:t>
-            </w:r>
-            <w:r>
-              <w:rPr>
-                <w:sz w:val="22"/>
-                <w:lang w:val="es-SV"/>
-              </w:rPr>
-              <w:t>decisiones, negociación, orientación a resultados, comunicación efectiva, integridad.</w:t>
+              <w:t>Liderazgo, visión estratégica, toma de decisiones, negociación, orientación a resultados, comunicación efectiva, integridad.</w:t>
             </w:r>
           </w:p>
         </w:tc>
@@ -5742,13 +5141,7 @@
         <w:rPr>
           <w:b/>
         </w:rPr>
-        <w:t>Funcion</w:t>
-      </w:r>
-      <w:r>
-        <w:rPr>
-          <w:b/>
-        </w:rPr>
-        <w:t>es</w:t>
+        <w:t>Funciones</w:t>
       </w:r>
       <w:proofErr w:type="spellEnd"/>
       <w:r>
@@ -5811,13 +5204,7 @@
         <w:rPr>
           <w:lang w:val="es-SV"/>
         </w:rPr>
-        <w:t>Coordinar, supervisar y evaluar el desempeño de las gerencias y unidades funci</w:t>
-      </w:r>
-      <w:r>
-        <w:rPr>
-          <w:lang w:val="es-SV"/>
-        </w:rPr>
-        <w:t>onales.</w:t>
+        <w:t>Coordinar, supervisar y evaluar el desempeño de las gerencias y unidades funcionales.</w:t>
       </w:r>
     </w:p>
     <w:p>
@@ -5846,13 +5233,7 @@
           <w:lang w:val="es-SV"/>
         </w:rPr>
         <w:lastRenderedPageBreak/>
-        <w:t>Representar a la sociedad en el giro ordinario de sus negocios, conforme a las facultades del pacto social y del poder respectivo (art.</w:t>
-      </w:r>
-      <w:r>
-        <w:rPr>
-          <w:lang w:val="es-SV"/>
-        </w:rPr>
-        <w:t xml:space="preserve"> 260, Código de Comercio).</w:t>
+        <w:t>Representar a la sociedad en el giro ordinario de sus negocios, conforme a las facultades del pacto social y del poder respectivo (art. 260, Código de Comercio).</w:t>
       </w:r>
     </w:p>
     <w:p>
@@ -5880,13 +5261,7 @@
         <w:rPr>
           <w:lang w:val="es-SV"/>
         </w:rPr>
-        <w:t>Velar por la exactitud y oportunidad de la información contable y por el correcto funcionamiento del sistema contable inst</w:t>
-      </w:r>
-      <w:r>
-        <w:rPr>
-          <w:lang w:val="es-SV"/>
-        </w:rPr>
-        <w:t>itucional.</w:t>
+        <w:t>Velar por la exactitud y oportunidad de la información contable y por el correcto funcionamiento del sistema contable institucional.</w:t>
       </w:r>
     </w:p>
     <w:p>
@@ -5921,13 +5296,7 @@
         <w:rPr>
           <w:lang w:val="es-SV"/>
         </w:rPr>
-        <w:t xml:space="preserve">Internas: Junta Directiva, Auditoría Externa y todas las unidades. Externas: clientes, proveedores, entidades </w:t>
-      </w:r>
-      <w:r>
-        <w:rPr>
-          <w:lang w:val="es-SV"/>
-        </w:rPr>
-        <w:t>financieras, DGII del Ministerio de Hacienda, Registro de Comercio y socios estratégicos.</w:t>
+        <w:t>Internas: Junta Directiva, Auditoría Externa y todas las unidades. Externas: clientes, proveedores, entidades financieras, DGII del Ministerio de Hacienda, Registro de Comercio y socios estratégicos.</w:t>
       </w:r>
     </w:p>
     <w:p>
@@ -5956,13 +5325,7 @@
         <w:rPr>
           <w:lang w:val="es-SV"/>
         </w:rPr>
-        <w:t>Contador General (Jefe</w:t>
-      </w:r>
-      <w:r>
-        <w:rPr>
-          <w:lang w:val="es-SV"/>
-        </w:rPr>
-        <w:t xml:space="preserve"> de Finanzas y Contabilidad) (P-002)</w:t>
+        <w:t>Contador General (Jefe de Finanzas y Contabilidad) (P-002)</w:t>
       </w:r>
       <w:bookmarkEnd w:id="12"/>
     </w:p>
@@ -6193,13 +5556,7 @@
               <w:rPr>
                 <w:sz w:val="22"/>
               </w:rPr>
-              <w:t xml:space="preserve">Gerente </w:t>
-            </w:r>
-            <w:r>
-              <w:rPr>
-                <w:sz w:val="22"/>
-              </w:rPr>
-              <w:t>General</w:t>
+              <w:t>Gerente General</w:t>
             </w:r>
           </w:p>
         </w:tc>
@@ -6330,14 +5687,7 @@
                 <w:sz w:val="22"/>
                 <w:lang w:val="es-SV"/>
               </w:rPr>
-              <w:t>Garantizar el registro, control, análisis y reporte de las operaciones económicas y financieras de la sociedad, conforme a las NIIF para PYMES y a la</w:t>
-            </w:r>
-            <w:r>
-              <w:rPr>
-                <w:sz w:val="22"/>
-                <w:lang w:val="es-SV"/>
-              </w:rPr>
-              <w:t xml:space="preserve"> normativa tributaria, y administrar la operación del sistema contable institucional.</w:t>
+              <w:t>Garantizar el registro, control, análisis y reporte de las operaciones económicas y financieras de la sociedad, conforme a las NIIF para PYMES y a la normativa tributaria, y administrar la operación del sistema contable institucional.</w:t>
             </w:r>
           </w:p>
         </w:tc>
@@ -6397,14 +5747,7 @@
                 <w:sz w:val="22"/>
                 <w:lang w:val="es-SV"/>
               </w:rPr>
-              <w:t>Título de Contador Público, o estudiante en los dos últimos años de la carrera con experiencia demostrada; requisito de llevar la contabilidad de los</w:t>
-            </w:r>
-            <w:r>
-              <w:rPr>
-                <w:sz w:val="22"/>
-                <w:lang w:val="es-SV"/>
-              </w:rPr>
-              <w:t xml:space="preserve"> comerciantes sociales conforme al art. 437 del Código de Comercio.</w:t>
+              <w:t>Título de Contador Público, o estudiante en los dos últimos años de la carrera con experiencia demostrada; requisito de llevar la contabilidad de los comerciantes sociales conforme al art. 437 del Código de Comercio.</w:t>
             </w:r>
           </w:p>
         </w:tc>
@@ -6561,14 +5904,7 @@
                 <w:sz w:val="22"/>
                 <w:lang w:val="es-SV"/>
               </w:rPr>
-              <w:t>Precisión y rigor técnico, análisis, integridad, confiden</w:t>
-            </w:r>
-            <w:r>
-              <w:rPr>
-                <w:sz w:val="22"/>
-                <w:lang w:val="es-SV"/>
-              </w:rPr>
-              <w:t>cialidad, manejo de plazos y capacidad de comunicación de información financiera.</w:t>
+              <w:t>Precisión y rigor técnico, análisis, integridad, confidencialidad, manejo de plazos y capacidad de comunicación de información financiera.</w:t>
             </w:r>
           </w:p>
         </w:tc>
@@ -6706,13 +6042,7 @@
         <w:rPr>
           <w:lang w:val="es-SV"/>
         </w:rPr>
-        <w:t>Elaborar la balanza de comprobación mensual y l</w:t>
-      </w:r>
-      <w:r>
-        <w:rPr>
-          <w:lang w:val="es-SV"/>
-        </w:rPr>
-        <w:t>os estados financieros (situación financiera, resultados, cambios en el patrimonio y flujos de efectivo) y sus notas (NIIF para PYMES).</w:t>
+        <w:t>Elaborar la balanza de comprobación mensual y los estados financieros (situación financiera, resultados, cambios en el patrimonio y flujos de efectivo) y sus notas (NIIF para PYMES).</w:t>
       </w:r>
     </w:p>
     <w:p>
@@ -6740,13 +6070,7 @@
         <w:rPr>
           <w:lang w:val="es-SV"/>
         </w:rPr>
-        <w:t>Ejecutar y supervisar los cierres contables mensuales y anuales y los asientos de ajuste</w:t>
-      </w:r>
-      <w:r>
-        <w:rPr>
-          <w:lang w:val="es-SV"/>
-        </w:rPr>
-        <w:t>.</w:t>
+        <w:t>Ejecutar y supervisar los cierres contables mensuales y anuales y los asientos de ajuste.</w:t>
       </w:r>
     </w:p>
     <w:p>
@@ -6838,13 +6162,7 @@
           <w:lang w:val="es-SV"/>
         </w:rPr>
         <w:lastRenderedPageBreak/>
-        <w:t xml:space="preserve">La persona responsable de la contabilidad debe cumplir las obligaciones previstas en </w:t>
-      </w:r>
-      <w:r>
-        <w:rPr>
-          <w:lang w:val="es-SV"/>
-        </w:rPr>
-        <w:t>el art. 149-C del Código Tributario y no podrá intervenir en operaciones incompatibles con su cargo (segregación de funciones con caja y tesorería).</w:t>
+        <w:t>La persona responsable de la contabilidad debe cumplir las obligaciones previstas en el art. 149-C del Código Tributario y no podrá intervenir en operaciones incompatibles con su cargo (segregación de funciones con caja y tesorería).</w:t>
       </w:r>
     </w:p>
     <w:p>
@@ -6990,14 +6308,7 @@
                 <w:b/>
                 <w:sz w:val="22"/>
               </w:rPr>
-              <w:t>Denominación d</w:t>
-            </w:r>
-            <w:r>
-              <w:rPr>
-                <w:b/>
-                <w:sz w:val="22"/>
-              </w:rPr>
-              <w:t>el puesto</w:t>
+              <w:t>Denominación del puesto</w:t>
             </w:r>
           </w:p>
         </w:tc>
@@ -7220,14 +6531,7 @@
                 <w:sz w:val="22"/>
                 <w:lang w:val="es-SV"/>
               </w:rPr>
-              <w:t xml:space="preserve">Ejecutar las operaciones diarias de </w:t>
-            </w:r>
-            <w:r>
-              <w:rPr>
-                <w:sz w:val="22"/>
-                <w:lang w:val="es-SV"/>
-              </w:rPr>
-              <w:t>registro, facturación, cobros, pagos y custodia de fondos, bajo la supervisión del Contador General y en observancia de la segregación de funciones.</w:t>
+              <w:t>Ejecutar las operaciones diarias de registro, facturación, cobros, pagos y custodia de fondos, bajo la supervisión del Contador General y en observancia de la segregación de funciones.</w:t>
             </w:r>
           </w:p>
         </w:tc>
@@ -7287,14 +6591,7 @@
                 <w:sz w:val="22"/>
                 <w:lang w:val="es-SV"/>
               </w:rPr>
-              <w:t>Bachillerato comercial o técnico en contabilidad; los tenedores de libros deben acredi</w:t>
-            </w:r>
-            <w:r>
-              <w:rPr>
-                <w:sz w:val="22"/>
-                <w:lang w:val="es-SV"/>
-              </w:rPr>
-              <w:t>tar su calidad conforme al art. 437 del Código de Comercio.</w:t>
+              <w:t>Bachillerato comercial o técnico en contabilidad; los tenedores de libros deben acreditar su calidad conforme al art. 437 del Código de Comercio.</w:t>
             </w:r>
           </w:p>
         </w:tc>
@@ -7398,14 +6695,7 @@
                 <w:sz w:val="22"/>
                 <w:lang w:val="es-SV"/>
               </w:rPr>
-              <w:t xml:space="preserve">Registros contables básicos, IVA y facturación, conciliaciones bancarias, planillas auxiliares y </w:t>
-            </w:r>
-            <w:r>
-              <w:rPr>
-                <w:sz w:val="22"/>
-                <w:lang w:val="es-SV"/>
-              </w:rPr>
-              <w:t>sistemas contables.</w:t>
+              <w:t>Registros contables básicos, IVA y facturación, conciliaciones bancarias, planillas auxiliares y sistemas contables.</w:t>
             </w:r>
           </w:p>
         </w:tc>
@@ -7587,13 +6877,7 @@
         <w:rPr>
           <w:lang w:val="es-SV"/>
         </w:rPr>
-        <w:t xml:space="preserve">Administrar cuentas por cobrar y por pagar y dar seguimiento a </w:t>
-      </w:r>
-      <w:r>
-        <w:rPr>
-          <w:lang w:val="es-SV"/>
-        </w:rPr>
-        <w:t>su liquidación.</w:t>
+        <w:t>Administrar cuentas por cobrar y por pagar y dar seguimiento a su liquidación.</w:t>
       </w:r>
     </w:p>
     <w:p>
@@ -7635,13 +6919,7 @@
         <w:rPr>
           <w:lang w:val="es-SV"/>
         </w:rPr>
-        <w:t>Archivar de forma cronológica la documentación de soporte de las partidas contables (</w:t>
-      </w:r>
-      <w:r>
-        <w:rPr>
-          <w:lang w:val="es-SV"/>
-        </w:rPr>
-        <w:t>art. 139, Código Tributario).</w:t>
+        <w:t>Archivar de forma cronológica la documentación de soporte de las partidas contables (art. 139, Código Tributario).</w:t>
       </w:r>
     </w:p>
     <w:p>
@@ -7677,13 +6955,7 @@
         <w:rPr>
           <w:lang w:val="es-SV"/>
         </w:rPr>
-        <w:t xml:space="preserve">Internas: Contador General, Comercial (facturación) y Operaciones (despachos). Externas: </w:t>
-      </w:r>
-      <w:r>
-        <w:rPr>
-          <w:lang w:val="es-SV"/>
-        </w:rPr>
-        <w:t>bancos y proveedores.</w:t>
+        <w:t>Internas: Contador General, Comercial (facturación) y Operaciones (despachos). Externas: bancos y proveedores.</w:t>
       </w:r>
     </w:p>
     <w:p>
@@ -7803,14 +7075,7 @@
                 <w:b/>
                 <w:sz w:val="22"/>
               </w:rPr>
-              <w:t>Descripci</w:t>
-            </w:r>
-            <w:r>
-              <w:rPr>
-                <w:b/>
-                <w:sz w:val="22"/>
-              </w:rPr>
-              <w:t>ón</w:t>
+              <w:t>Descripción</w:t>
             </w:r>
           </w:p>
         </w:tc>
@@ -8104,14 +7369,7 @@
                 <w:b/>
                 <w:sz w:val="22"/>
               </w:rPr>
-              <w:t>For</w:t>
-            </w:r>
-            <w:r>
-              <w:rPr>
-                <w:b/>
-                <w:sz w:val="22"/>
-              </w:rPr>
-              <w:t>mación</w:t>
+              <w:t>Formación</w:t>
             </w:r>
             <w:proofErr w:type="spellEnd"/>
             <w:r>
@@ -8312,14 +7570,7 @@
                 <w:sz w:val="22"/>
                 <w:lang w:val="es-SV"/>
               </w:rPr>
-              <w:t>Gestión de proyectos, liderazgo técnico, creatividad, planificación, comunicación y res</w:t>
-            </w:r>
-            <w:r>
-              <w:rPr>
-                <w:sz w:val="22"/>
-                <w:lang w:val="es-SV"/>
-              </w:rPr>
-              <w:t>olución de problemas.</w:t>
+              <w:t>Gestión de proyectos, liderazgo técnico, creatividad, planificación, comunicación y resolución de problemas.</w:t>
             </w:r>
           </w:p>
         </w:tc>
@@ -8473,13 +7724,7 @@
         <w:rPr>
           <w:lang w:val="es-SV"/>
         </w:rPr>
-        <w:t xml:space="preserve">Dirigir y coordinar al </w:t>
-      </w:r>
-      <w:r>
-        <w:rPr>
-          <w:lang w:val="es-SV"/>
-        </w:rPr>
-        <w:t>equipo de desarrollo (programación, arte, diseño y pruebas).</w:t>
+        <w:t>Dirigir y coordinar al equipo de desarrollo (programación, arte, diseño y pruebas).</w:t>
       </w:r>
     </w:p>
     <w:p>
@@ -8508,13 +7753,7 @@
           <w:lang w:val="es-SV"/>
         </w:rPr>
         <w:lastRenderedPageBreak/>
-        <w:t>Proveer a contabilidad los costos asociados a cada proyecto o título (recursos, tiempo y materiales) para la contabilidad d</w:t>
-      </w:r>
-      <w:r>
-        <w:rPr>
-          <w:lang w:val="es-SV"/>
-        </w:rPr>
-        <w:t>e costos.</w:t>
+        <w:t>Proveer a contabilidad los costos asociados a cada proyecto o título (recursos, tiempo y materiales) para la contabilidad de costos.</w:t>
       </w:r>
     </w:p>
     <w:p>
@@ -8556,13 +7795,7 @@
         <w:rPr>
           <w:lang w:val="es-SV"/>
         </w:rPr>
-        <w:t xml:space="preserve">Gestionar la protección de la propiedad intelectual (registros, </w:t>
-      </w:r>
-      <w:r>
-        <w:rPr>
-          <w:lang w:val="es-SV"/>
-        </w:rPr>
-        <w:t>marcas y derechos de autor cuando corresponda).</w:t>
+        <w:t>Gestionar la protección de la propiedad intelectual (registros, marcas y derechos de autor cuando corresponda).</w:t>
       </w:r>
     </w:p>
     <w:p>
@@ -8597,13 +7830,7 @@
         <w:rPr>
           <w:lang w:val="es-SV"/>
         </w:rPr>
-        <w:t xml:space="preserve">Los costos de </w:t>
-      </w:r>
-      <w:r>
-        <w:rPr>
-          <w:lang w:val="es-SV"/>
-        </w:rPr>
-        <w:t>desarrollo deben registrarse de forma verificable para sustentar la contabilidad de costos y la valuación de intangibles en desarrollo (NIIF para PYMES).</w:t>
+        <w:t>Los costos de desarrollo deben registrarse de forma verificable para sustentar la contabilidad de costos y la valuación de intangibles en desarrollo (NIIF para PYMES).</w:t>
       </w:r>
     </w:p>
     <w:p>
@@ -8727,14 +7954,7 @@
                 <w:b/>
                 <w:sz w:val="22"/>
               </w:rPr>
-              <w:t>D</w:t>
-            </w:r>
-            <w:r>
-              <w:rPr>
-                <w:b/>
-                <w:sz w:val="22"/>
-              </w:rPr>
-              <w:t>escripción</w:t>
+              <w:t>Descripción</w:t>
             </w:r>
           </w:p>
         </w:tc>
@@ -8979,14 +8199,7 @@
                 <w:sz w:val="22"/>
                 <w:lang w:val="es-SV"/>
               </w:rPr>
-              <w:t>Diseñar, programar e integrar las funcionalidades de los videojuegos y contenidos digitales de la sociedad y verificar su calidad funcional antes del lanzamiento, garantizando su correcto funcionamiento técnico y la aus</w:t>
-            </w:r>
-            <w:r>
-              <w:rPr>
-                <w:sz w:val="22"/>
-                <w:lang w:val="es-SV"/>
-              </w:rPr>
-              <w:t>encia de defectos relevantes.</w:t>
+              <w:t>Diseñar, programar e integrar las funcionalidades de los videojuegos y contenidos digitales de la sociedad y verificar su calidad funcional antes del lanzamiento, garantizando su correcto funcionamiento técnico y la ausencia de defectos relevantes.</w:t>
             </w:r>
           </w:p>
         </w:tc>
@@ -9090,14 +8303,7 @@
                 <w:sz w:val="22"/>
                 <w:lang w:val="es-SV"/>
               </w:rPr>
-              <w:t xml:space="preserve">Mínimo dos años en programación o en pruebas de software; experiencia en </w:t>
-            </w:r>
-            <w:r>
-              <w:rPr>
-                <w:sz w:val="22"/>
-                <w:lang w:val="es-SV"/>
-              </w:rPr>
-              <w:t>desarrollo de videojuegos (deseable).</w:t>
+              <w:t>Mínimo dos años en programación o en pruebas de software; experiencia en desarrollo de videojuegos (deseable).</w:t>
             </w:r>
           </w:p>
         </w:tc>
@@ -9291,13 +8497,7 @@
         <w:rPr>
           <w:b/>
         </w:rPr>
-        <w:t>esencial</w:t>
-      </w:r>
-      <w:r>
-        <w:rPr>
-          <w:b/>
-        </w:rPr>
-        <w:t>es</w:t>
+        <w:t>esenciales</w:t>
       </w:r>
       <w:proofErr w:type="spellEnd"/>
       <w:r>
@@ -9360,13 +8560,7 @@
         <w:rPr>
           <w:lang w:val="es-SV"/>
         </w:rPr>
-        <w:t>Ejecutar pruebas funcionale</w:t>
-      </w:r>
-      <w:r>
-        <w:rPr>
-          <w:lang w:val="es-SV"/>
-        </w:rPr>
-        <w:t>s, de regresión y de compatibilidad de los títulos antes de su lanzamiento.</w:t>
+        <w:t>Ejecutar pruebas funcionales, de regresión y de compatibilidad de los títulos antes de su lanzamiento.</w:t>
       </w:r>
     </w:p>
     <w:p>
@@ -9394,13 +8588,7 @@
         <w:rPr>
           <w:lang w:val="es-SV"/>
         </w:rPr>
-        <w:t>Elaborar y mantener la documentación técnica y el control de version</w:t>
-      </w:r>
-      <w:r>
-        <w:rPr>
-          <w:lang w:val="es-SV"/>
-        </w:rPr>
-        <w:t>es del código.</w:t>
+        <w:t>Elaborar y mantener la documentación técnica y el control de versiones del código.</w:t>
       </w:r>
     </w:p>
     <w:p>
@@ -9428,13 +8616,7 @@
         <w:rPr>
           <w:lang w:val="es-SV"/>
         </w:rPr>
-        <w:t xml:space="preserve">Atender los reportes de errores escalados por Operaciones y Servicio al Cliente y soportar la </w:t>
-      </w:r>
-      <w:r>
-        <w:rPr>
-          <w:lang w:val="es-SV"/>
-        </w:rPr>
-        <w:t>integración del catálogo y de los sistemas internos, incluido el sistema contable cuando aplique.</w:t>
+        <w:t>Atender los reportes de errores escalados por Operaciones y Servicio al Cliente y soportar la integración del catálogo y de los sistemas internos, incluido el sistema contable cuando aplique.</w:t>
       </w:r>
     </w:p>
     <w:p>
@@ -9455,13 +8637,7 @@
         <w:rPr>
           <w:lang w:val="es-SV"/>
         </w:rPr>
-        <w:t xml:space="preserve"> Internas: Líder de Desarrollo de Videojuegos, Comercial y Marketing, Finanzas y Contabilidad y Operaciones y Servicio al Cliente. Exter</w:t>
-      </w:r>
-      <w:r>
-        <w:rPr>
-          <w:lang w:val="es-SV"/>
-        </w:rPr>
-        <w:t>nas: plataformas de distribución y proveedores de tecnología.</w:t>
+        <w:t xml:space="preserve"> Internas: Líder de Desarrollo de Videojuegos, Comercial y Marketing, Finanzas y Contabilidad y Operaciones y Servicio al Cliente. Externas: plataformas de distribución y proveedores de tecnología.</w:t>
       </w:r>
     </w:p>
     <w:p>
@@ -9660,14 +8836,7 @@
                 <w:sz w:val="22"/>
                 <w:lang w:val="es-SV"/>
               </w:rPr>
-              <w:t xml:space="preserve">Comercial y </w:t>
-            </w:r>
-            <w:r>
-              <w:rPr>
-                <w:sz w:val="22"/>
-                <w:lang w:val="es-SV"/>
-              </w:rPr>
-              <w:t>Marketing</w:t>
+              <w:t>Comercial y Marketing</w:t>
             </w:r>
           </w:p>
         </w:tc>
@@ -9833,14 +9002,7 @@
                 <w:sz w:val="22"/>
                 <w:lang w:val="es-SV"/>
               </w:rPr>
-              <w:t>Comercializar los productos y servicios de la sociedad, gestionar las ventas en canales físicos y digitales, ejecutar las estrate</w:t>
-            </w:r>
-            <w:r>
-              <w:rPr>
-                <w:sz w:val="22"/>
-                <w:lang w:val="es-SV"/>
-              </w:rPr>
-              <w:t>gias de marketing y atender la recepción de clientes y proveedores.</w:t>
+              <w:t>Comercializar los productos y servicios de la sociedad, gestionar las ventas en canales físicos y digitales, ejecutar las estrategias de marketing y atender la recepción de clientes y proveedores.</w:t>
             </w:r>
           </w:p>
         </w:tc>
@@ -10048,14 +9210,7 @@
                 <w:sz w:val="22"/>
                 <w:lang w:val="es-SV"/>
               </w:rPr>
-              <w:t xml:space="preserve">Negociación, comunicación, orientación al cliente, creatividad y </w:t>
-            </w:r>
-            <w:r>
-              <w:rPr>
-                <w:sz w:val="22"/>
-                <w:lang w:val="es-SV"/>
-              </w:rPr>
-              <w:t>orientación a resultados.</w:t>
+              <w:t>Negociación, comunicación, orientación al cliente, creatividad y orientación a resultados.</w:t>
             </w:r>
           </w:p>
         </w:tc>
@@ -10179,13 +9334,7 @@
         <w:rPr>
           <w:lang w:val="es-SV"/>
         </w:rPr>
-        <w:t>Gestionar las tiendas y plataformas digitales de d</w:t>
-      </w:r>
-      <w:r>
-        <w:rPr>
-          <w:lang w:val="es-SV"/>
-        </w:rPr>
-        <w:t>istribución de videojuegos (catálogo, precios, promociones).</w:t>
+        <w:t>Gestionar las tiendas y plataformas digitales de distribución de videojuegos (catálogo, precios, promociones).</w:t>
       </w:r>
     </w:p>
     <w:p>
@@ -10290,13 +9439,7 @@
         <w:rPr>
           <w:lang w:val="es-SV"/>
         </w:rPr>
-        <w:t xml:space="preserve"> Internas: Gerencia General, Operaciones y Servicio al Cliente, Tecnología y Desar</w:t>
-      </w:r>
-      <w:r>
-        <w:rPr>
-          <w:lang w:val="es-SV"/>
-        </w:rPr>
-        <w:t>rollo, Finanzas y Contabilidad y Talento Humano. Externas: clientes, distribuidores, plataformas digitales, agencias y proveedores.</w:t>
+        <w:t xml:space="preserve"> Internas: Gerencia General, Operaciones y Servicio al Cliente, Tecnología y Desarrollo, Finanzas y Contabilidad y Talento Humano. Externas: clientes, distribuidores, plataformas digitales, agencias y proveedores.</w:t>
       </w:r>
     </w:p>
     <w:p>
@@ -10326,13 +9469,7 @@
           <w:lang w:val="es-SV"/>
         </w:rPr>
         <w:lastRenderedPageBreak/>
-        <w:t>Encarga</w:t>
-      </w:r>
-      <w:r>
-        <w:rPr>
-          <w:lang w:val="es-SV"/>
-        </w:rPr>
-        <w:t>do de Talento Humano y Planillas (P-007)</w:t>
+        <w:t>Encargado de Talento Humano y Planillas (P-007)</w:t>
       </w:r>
       <w:bookmarkEnd w:id="17"/>
     </w:p>
@@ -10588,13 +9725,7 @@
               <w:rPr>
                 <w:sz w:val="22"/>
               </w:rPr>
-              <w:t xml:space="preserve">No </w:t>
-            </w:r>
-            <w:r>
-              <w:rPr>
-                <w:sz w:val="22"/>
-              </w:rPr>
-              <w:t>supervisa personal</w:t>
+              <w:t>No supervisa personal</w:t>
             </w:r>
           </w:p>
         </w:tc>
@@ -10674,14 +9805,7 @@
                 <w:sz w:val="22"/>
                 <w:lang w:val="es-SV"/>
               </w:rPr>
-              <w:t>Administrar el ciclo de vida del personal, garantizar el cumplimiento de las obligaciones laborales y de seguridad social de la sociedad y prestar el apoyo administrativo, documental</w:t>
-            </w:r>
-            <w:r>
-              <w:rPr>
-                <w:sz w:val="22"/>
-                <w:lang w:val="es-SV"/>
-              </w:rPr>
-              <w:t xml:space="preserve"> y de recepción que requiera la organización.</w:t>
+              <w:t>Administrar el ciclo de vida del personal, garantizar el cumplimiento de las obligaciones laborales y de seguridad social de la sociedad y prestar el apoyo administrativo, documental y de recepción que requiera la organización.</w:t>
             </w:r>
           </w:p>
         </w:tc>
@@ -10889,14 +10013,7 @@
                 <w:sz w:val="22"/>
                 <w:lang w:val="es-SV"/>
               </w:rPr>
-              <w:t>Gestión de personas, confidencialidad, organización, comunicación y cumplimie</w:t>
-            </w:r>
-            <w:r>
-              <w:rPr>
-                <w:sz w:val="22"/>
-                <w:lang w:val="es-SV"/>
-              </w:rPr>
-              <w:t>nto normativo.</w:t>
+              <w:t>Gestión de personas, confidencialidad, organización, comunicación y cumplimiento normativo.</w:t>
             </w:r>
           </w:p>
         </w:tc>
@@ -11020,13 +10137,7 @@
         <w:rPr>
           <w:lang w:val="es-SV"/>
         </w:rPr>
-        <w:t>Elaborar y administrar las planillas de salarios y las cotizaciones de ISSS, AFP y demás re</w:t>
-      </w:r>
-      <w:r>
-        <w:rPr>
-          <w:lang w:val="es-SV"/>
-        </w:rPr>
-        <w:t>tenciones.</w:t>
+        <w:t>Elaborar y administrar las planillas de salarios y las cotizaciones de ISSS, AFP y demás retenciones.</w:t>
       </w:r>
     </w:p>
     <w:p>
@@ -11068,13 +10179,7 @@
         <w:rPr>
           <w:lang w:val="es-SV"/>
         </w:rPr>
-        <w:t>Mantener vigente el Reglamento Interno de Trabajo y las políticas de conducta y segur</w:t>
-      </w:r>
-      <w:r>
-        <w:rPr>
-          <w:lang w:val="es-SV"/>
-        </w:rPr>
-        <w:t>idad.</w:t>
+        <w:t>Mantener vigente el Reglamento Interno de Trabajo y las políticas de conducta y seguridad.</w:t>
       </w:r>
     </w:p>
     <w:p>
@@ -11116,13 +10221,7 @@
         <w:rPr>
           <w:lang w:val="es-SV"/>
         </w:rPr>
-        <w:t xml:space="preserve">Organizar y custodiar el archivo físico y </w:t>
-      </w:r>
-      <w:r>
-        <w:rPr>
-          <w:lang w:val="es-SV"/>
-        </w:rPr>
-        <w:t>digital de documentos y expedientes de la sociedad.</w:t>
+        <w:t>Organizar y custodiar el archivo físico y digital de documentos y expedientes de la sociedad.</w:t>
       </w:r>
     </w:p>
     <w:p>
@@ -11158,13 +10257,7 @@
         <w:rPr>
           <w:lang w:val="es-SV"/>
         </w:rPr>
-        <w:t xml:space="preserve"> Internas: todas las unidades. Externas: ISSS, AFP, Ministerio de Trabajo (MTPS), proveedores de capacitación y prov</w:t>
-      </w:r>
-      <w:r>
-        <w:rPr>
-          <w:lang w:val="es-SV"/>
-        </w:rPr>
-        <w:t>eedores en general.</w:t>
+        <w:t xml:space="preserve"> Internas: todas las unidades. Externas: ISSS, AFP, Ministerio de Trabajo (MTPS), proveedores de capacitación y proveedores en general.</w:t>
       </w:r>
     </w:p>
     <w:p>
@@ -11306,14 +10399,7 @@
                 <w:b/>
                 <w:sz w:val="22"/>
               </w:rPr>
-              <w:t>Denominació</w:t>
-            </w:r>
-            <w:r>
-              <w:rPr>
-                <w:b/>
-                <w:sz w:val="22"/>
-              </w:rPr>
-              <w:t>n del puesto</w:t>
+              <w:t>Denominación del puesto</w:t>
             </w:r>
           </w:p>
         </w:tc>
@@ -11596,14 +10682,7 @@
                 <w:sz w:val="22"/>
                 <w:lang w:val="es-SV"/>
               </w:rPr>
-              <w:t>Técnico en logística, Administración o carreras afines; conocimient</w:t>
-            </w:r>
-            <w:r>
-              <w:rPr>
-                <w:sz w:val="22"/>
-                <w:lang w:val="es-SV"/>
-              </w:rPr>
-              <w:t>o de plataformas de videojuegos.</w:t>
+              <w:t>Técnico en logística, Administración o carreras afines; conocimiento de plataformas de videojuegos.</w:t>
             </w:r>
           </w:p>
         </w:tc>
@@ -11707,14 +10786,7 @@
                 <w:sz w:val="22"/>
                 <w:lang w:val="es-SV"/>
               </w:rPr>
-              <w:t xml:space="preserve">Gestión de inventarios, compras y proveedores, facturación y despacho, herramientas de gestión de tickets y de </w:t>
-            </w:r>
-            <w:r>
-              <w:rPr>
-                <w:sz w:val="22"/>
-                <w:lang w:val="es-SV"/>
-              </w:rPr>
-              <w:t>atención al cliente, Excel y sistemas de inventario.</w:t>
+              <w:t>Gestión de inventarios, compras y proveedores, facturación y despacho, herramientas de gestión de tickets y de atención al cliente, Excel y sistemas de inventario.</w:t>
             </w:r>
           </w:p>
         </w:tc>
@@ -11814,13 +10886,7 @@
               <w:rPr>
                 <w:sz w:val="22"/>
               </w:rPr>
-              <w:t>Contrato a tiempo completo; disponibilidad para la coordinaci</w:t>
-            </w:r>
-            <w:r>
-              <w:rPr>
-                <w:sz w:val="22"/>
-              </w:rPr>
-              <w:t>ón de despachos y horarios de atención definidos.</w:t>
+              <w:t>Contrato a tiempo completo; disponibilidad para la coordinación de despachos y horarios de atención definidos.</w:t>
             </w:r>
           </w:p>
         </w:tc>
@@ -11876,13 +10942,7 @@
         <w:rPr>
           <w:lang w:val="es-SV"/>
         </w:rPr>
-        <w:t>Manten</w:t>
-      </w:r>
-      <w:r>
-        <w:rPr>
-          <w:lang w:val="es-SV"/>
-        </w:rPr>
-        <w:t>er actualizados los inventarios y reportar existencias y movimientos al área contable.</w:t>
+        <w:t>Mantener actualizados los inventarios y reportar existencias y movimientos al área contable.</w:t>
       </w:r>
     </w:p>
     <w:p>
@@ -11911,13 +10971,7 @@
           <w:lang w:val="es-SV"/>
         </w:rPr>
         <w:lastRenderedPageBreak/>
-        <w:t>Atender c</w:t>
-      </w:r>
-      <w:r>
-        <w:rPr>
-          <w:lang w:val="es-SV"/>
-        </w:rPr>
-        <w:t>onsultas, solicitudes y reclamos de usuarios por los canales establecidos y resolver las incidencias técnicas de primer nivel.</w:t>
+        <w:t>Atender consultas, solicitudes y reclamos de usuarios por los canales establecidos y resolver las incidencias técnicas de primer nivel.</w:t>
       </w:r>
     </w:p>
     <w:p>
@@ -11994,13 +11048,7 @@
         <w:rPr>
           <w:lang w:val="es-SV"/>
         </w:rPr>
-        <w:t>Los despachos y las atenciones al usuario deb</w:t>
-      </w:r>
-      <w:r>
-        <w:rPr>
-          <w:lang w:val="es-SV"/>
-        </w:rPr>
-        <w:t>en generar el soporte correspondiente para el registro contable y el control de inventarios en el sistema.</w:t>
+        <w:t>Los despachos y las atenciones al usuario deben generar el soporte correspondiente para el registro contable y el control de inventarios en el sistema.</w:t>
       </w:r>
     </w:p>
     <w:p>
@@ -12037,13 +11085,7 @@
         <w:rPr>
           <w:lang w:val="es-SV"/>
         </w:rPr>
-        <w:t>Los administradores y gerentes deben tener la capacidad necesar</w:t>
-      </w:r>
-      <w:r>
-        <w:rPr>
-          <w:lang w:val="es-SV"/>
-        </w:rPr>
-        <w:t>ia para ejercer el comercio (art. 254, Código de Comercio).</w:t>
+        <w:t>Los administradores y gerentes deben tener la capacidad necesaria para ejercer el comercio (art. 254, Código de Comercio).</w:t>
       </w:r>
     </w:p>
     <w:p>
@@ -12085,13 +11127,7 @@
         <w:rPr>
           <w:lang w:val="es-SV"/>
         </w:rPr>
-        <w:t>El cargo de director es personal e indelegable (art</w:t>
-      </w:r>
-      <w:r>
-        <w:rPr>
-          <w:lang w:val="es-SV"/>
-        </w:rPr>
-        <w:t>. 257, Código de Comercio).</w:t>
+        <w:t>El cargo de director es personal e indelegable (art. 257, Código de Comercio).</w:t>
       </w:r>
     </w:p>
     <w:p>
@@ -12128,14 +11164,7 @@
           <w:lang w:val="es-SV"/>
         </w:rPr>
         <w:lastRenderedPageBreak/>
-        <w:t>Segregación de</w:t>
-      </w:r>
-      <w:r>
-        <w:rPr>
-          <w:b/>
-          <w:lang w:val="es-SV"/>
-        </w:rPr>
-        <w:t xml:space="preserve"> funciones. </w:t>
+        <w:t xml:space="preserve">Segregación de funciones. </w:t>
       </w:r>
       <w:r>
         <w:rPr>
@@ -12191,13 +11220,7 @@
         <w:rPr>
           <w:lang w:val="es-SV"/>
         </w:rPr>
-        <w:t xml:space="preserve">El presente manual será revisado por la Gerencia General con apoyo de Talento Humano, al </w:t>
-      </w:r>
-      <w:r>
-        <w:rPr>
-          <w:lang w:val="es-SV"/>
-        </w:rPr>
-        <w:t>menos una vez al año o cuando se creen, modifiquen o supriman puestos. Toda actualización requiere la aprobación de la Junta Directiva y debe registrarse en el control de versiones.</w:t>
+        <w:t>El presente manual será revisado por la Gerencia General con apoyo de Talento Humano, al menos una vez al año o cuando se creen, modifiquen o supriman puestos. Toda actualización requiere la aprobación de la Junta Directiva y debe registrarse en el control de versiones.</w:t>
       </w:r>
     </w:p>
     <w:p>
@@ -12227,13 +11250,7 @@
         <w:rPr>
           <w:lang w:val="es-SV"/>
         </w:rPr>
-        <w:t xml:space="preserve">Los abajo firmantes declaran que conocen y aceptan el </w:t>
-      </w:r>
-      <w:r>
-        <w:rPr>
-          <w:lang w:val="es-SV"/>
-        </w:rPr>
-        <w:t>contenido del presente manual, el cual entrará en vigencia a partir de su aprobación y será de obligatorio cumplimiento para todos los órganos y unidades de la sociedad.</w:t>
+        <w:t>Los abajo firmantes declaran que conocen y aceptan el contenido del presente manual, el cual entrará en vigencia a partir de su aprobación y será de obligatorio cumplimiento para todos los órganos y unidades de la sociedad.</w:t>
       </w:r>
     </w:p>
     <w:tbl>
@@ -12380,13 +11397,7 @@
               <w:rPr>
                 <w:sz w:val="22"/>
               </w:rPr>
-              <w:t xml:space="preserve">Nombre: </w:t>
-            </w:r>
-            <w:r>
-              <w:rPr>
-                <w:sz w:val="22"/>
-              </w:rPr>
-              <w:t>[____________]</w:t>
+              <w:t>Nombre: [____________]</w:t>
             </w:r>
           </w:p>
         </w:tc>
@@ -12577,13 +11588,7 @@
               <w:rPr>
                 <w:sz w:val="22"/>
               </w:rPr>
-              <w:t xml:space="preserve">Fecha: </w:t>
-            </w:r>
-            <w:r>
-              <w:rPr>
-                <w:sz w:val="22"/>
-              </w:rPr>
-              <w:t>[____/____/____]</w:t>
+              <w:t>Fecha: [____/____/____]</w:t>
             </w:r>
           </w:p>
         </w:tc>
@@ -12661,13 +11666,7 @@
         <w:rPr>
           <w:lang w:val="es-SV"/>
         </w:rPr>
-        <w:t xml:space="preserve"> (D</w:t>
-      </w:r>
-      <w:r>
-        <w:rPr>
-          <w:lang w:val="es-SV"/>
-        </w:rPr>
-        <w:t xml:space="preserve">ecreto </w:t>
+        <w:t xml:space="preserve"> (Decreto </w:t>
       </w:r>
       <w:proofErr w:type="spellStart"/>
       <w:r>
@@ -12736,13 +11735,7 @@
         <w:rPr>
           <w:lang w:val="es-SV"/>
         </w:rPr>
-        <w:t xml:space="preserve"> 671 del 8 de </w:t>
-      </w:r>
-      <w:r>
-        <w:rPr>
-          <w:lang w:val="es-SV"/>
-        </w:rPr>
-        <w:t xml:space="preserve">mayo de 1970; Diario Oficial </w:t>
+        <w:t xml:space="preserve"> 671 del 8 de mayo de 1970; Diario Oficial </w:t>
       </w:r>
       <w:proofErr w:type="spellStart"/>
       <w:r>
@@ -12811,13 +11804,7 @@
         <w:rPr>
           <w:lang w:val="es-SV"/>
         </w:rPr>
-        <w:t xml:space="preserve"> 142, Tomo 236, del 31 de julio </w:t>
-      </w:r>
-      <w:r>
-        <w:rPr>
-          <w:lang w:val="es-SV"/>
-        </w:rPr>
-        <w:t>de 1972).</w:t>
+        <w:t xml:space="preserve"> 142, Tomo 236, del 31 de julio de 1972).</w:t>
       </w:r>
     </w:p>
     <w:p>
@@ -12886,13 +11873,7 @@
         <w:rPr>
           <w:lang w:val="es-SV"/>
         </w:rPr>
-        <w:t xml:space="preserve">Asamblea Legislativa de la República de El Salvador. </w:t>
-      </w:r>
-      <w:r>
-        <w:rPr>
-          <w:lang w:val="es-SV"/>
-        </w:rPr>
-        <w:t xml:space="preserve">(1991). </w:t>
+        <w:t xml:space="preserve">Asamblea Legislativa de la República de El Salvador. (1991). </w:t>
       </w:r>
       <w:r>
         <w:rPr>
@@ -12988,13 +11969,7 @@
         <w:rPr>
           <w:lang w:val="es-SV"/>
         </w:rPr>
-        <w:t xml:space="preserve"> 143, Tomo 316, del 31 de julio de 199</w:t>
-      </w:r>
-      <w:r>
-        <w:rPr>
-          <w:lang w:val="es-SV"/>
-        </w:rPr>
-        <w:t>2).</w:t>
+        <w:t xml:space="preserve"> 143, Tomo 316, del 31 de julio de 1992).</w:t>
       </w:r>
     </w:p>
     <w:p>
@@ -13064,13 +12039,7 @@
         <w:rPr>
           <w:lang w:val="es-SV"/>
         </w:rPr>
-        <w:t>Asamblea Legi</w:t>
-      </w:r>
-      <w:r>
-        <w:rPr>
-          <w:lang w:val="es-SV"/>
-        </w:rPr>
-        <w:t xml:space="preserve">slativa de la República de El Salvador. (2000). </w:t>
+        <w:t xml:space="preserve">Asamblea Legislativa de la República de El Salvador. (2000). </w:t>
       </w:r>
       <w:r>
         <w:rPr>
@@ -13125,13 +12094,7 @@
         <w:rPr>
           <w:lang w:val="es-SV"/>
         </w:rPr>
-        <w:t xml:space="preserve">Consejo de Normas Internacionales de </w:t>
-      </w:r>
-      <w:r>
-        <w:rPr>
-          <w:lang w:val="es-SV"/>
-        </w:rPr>
-        <w:t xml:space="preserve">Contabilidad. (2015). </w:t>
+        <w:t xml:space="preserve">Consejo de Normas Internacionales de Contabilidad. (2015). </w:t>
       </w:r>
       <w:r>
         <w:rPr>
@@ -13185,13 +12148,7 @@
         <w:rPr>
           <w:lang w:val="es-SV"/>
         </w:rPr>
-        <w:t xml:space="preserve"> 4 de la Presidencia de l</w:t>
-      </w:r>
-      <w:r>
-        <w:rPr>
-          <w:lang w:val="es-SV"/>
-        </w:rPr>
-        <w:t xml:space="preserve">a Corte de Cuentas de la República del 14 de septiembre de 2004; Diario Oficial </w:t>
+        <w:t xml:space="preserve"> 4 de la Presidencia de la Corte de Cuentas de la República del 14 de septiembre de 2004; Diario Oficial </w:t>
       </w:r>
       <w:proofErr w:type="spellStart"/>
       <w:r>
@@ -13232,13 +12189,7 @@
         <w:rPr>
           <w:lang w:val="es-SV"/>
         </w:rPr>
-        <w:t>. Oficina de Planifi</w:t>
-      </w:r>
-      <w:r>
-        <w:rPr>
-          <w:lang w:val="es-SV"/>
-        </w:rPr>
-        <w:t>cación Agropecuaria.</w:t>
+        <w:t>. Oficina de Planificación Agropecuaria.</w:t>
       </w:r>
     </w:p>
     <w:p>
@@ -13410,14 +12361,7 @@
                 <w:b/>
                 <w:sz w:val="22"/>
               </w:rPr>
-              <w:t xml:space="preserve">Código del </w:t>
-            </w:r>
-            <w:r>
-              <w:rPr>
-                <w:b/>
-                <w:sz w:val="22"/>
-              </w:rPr>
-              <w:t>puesto</w:t>
+              <w:t>Código del puesto</w:t>
             </w:r>
           </w:p>
         </w:tc>
@@ -13920,13 +12864,7 @@
         <w:rPr>
           <w:lang w:val="es-SV"/>
         </w:rPr>
-        <w:t xml:space="preserve">El presente manual se controla mediante el siguiente registro de </w:t>
-      </w:r>
-      <w:r>
-        <w:rPr>
-          <w:lang w:val="es-SV"/>
-        </w:rPr>
-        <w:t>versiones (ver Tabla B1).</w:t>
+        <w:t>El presente manual se controla mediante el siguiente registro de versiones (ver Tabla B1).</w:t>
       </w:r>
     </w:p>
     <w:p>
@@ -14207,13 +13145,7 @@
               <w:rPr>
                 <w:sz w:val="20"/>
               </w:rPr>
-              <w:t xml:space="preserve">Junta </w:t>
-            </w:r>
-            <w:r>
-              <w:rPr>
-                <w:sz w:val="20"/>
-              </w:rPr>
-              <w:t>directiva</w:t>
+              <w:t>Junta directiva</w:t>
             </w:r>
           </w:p>
         </w:tc>
@@ -14322,7 +13254,7 @@
     </w:tbl>
     <w:p/>
     <w:sectPr>
-      <w:headerReference w:type="default" r:id="rId10"/>
+      <w:headerReference w:type="default" r:id="rId9"/>
       <w:pgSz w:w="12240" w:h="15840"/>
       <w:pgMar w:top="1440" w:right="1440" w:bottom="1440" w:left="1440" w:header="720" w:footer="720" w:gutter="0"/>
       <w:cols w:space="720"/>
@@ -14387,26 +13319,8 @@
   <w:p>
     <w:pPr>
       <w:pStyle w:val="Encabezado"/>
-      <w:jc w:val="right"/>
+      <w:jc w:val="center"/>
     </w:pPr>
-    <w:r>
-      <w:fldChar w:fldCharType="begin"/>
-    </w:r>
-    <w:r>
-      <w:instrText xml:space="preserve"> PAGE </w:instrText>
-    </w:r>
-    <w:r>
-      <w:fldChar w:fldCharType="separate"/>
-    </w:r>
-    <w:r>
-      <w:rPr>
-        <w:noProof/>
-      </w:rPr>
-      <w:t>1</w:t>
-    </w:r>
-    <w:r>
-      <w:fldChar w:fldCharType="end"/>
-    </w:r>
   </w:p>
 </w:hdr>
 </file>

</xml_diff>